<commit_message>
Revision round 1: scope claims to AmalgaMatch, add appearance-asymmetry + low-power caveats, frame L2-SP as minimal floor, add practical recommendations
Applies the no-GPU items from the simulated peer-review roadmap; defers multi-seed/LoRA/native-low-FOV/never-abstain-figure to a GPU box (disclosed in Limitations + REVISIONS.md). Rebuilt paper.docx.
</commit_message>
<xml_diff>
--- a/paper/paper.docx
+++ b/paper/paper.docx
@@ -2,13 +2,13 @@
 <file path=word/document.xml><?xml version="1.0" encoding="utf-8"?>
 <w:document xmlns:w="http://schemas.openxmlformats.org/wordprocessingml/2006/main" xmlns:m="http://schemas.openxmlformats.org/officeDocument/2006/math" xmlns:r="http://schemas.openxmlformats.org/officeDocument/2006/relationships" xmlns:o="urn:schemas-microsoft-com:office:office" xmlns:v="urn:schemas-microsoft-com:vml" xmlns:w10="urn:schemas-microsoft-com:office:word" xmlns:a="http://schemas.openxmlformats.org/drawingml/2006/main" xmlns:pic="http://schemas.openxmlformats.org/drawingml/2006/picture" xmlns:wp="http://schemas.openxmlformats.org/drawingml/2006/wordprocessingDrawing">
   <w:body>
-    <w:bookmarkStart w:id="45" w:name="X54a0bba0806ffbb71be1eac463d3d20b0921968"/>
+    <w:bookmarkStart w:id="45" w:name="X6808c8cffb36cd7c71942a068da11385ef6f4db"/>
     <w:p>
       <w:pPr>
         <w:pStyle w:val="Heading1"/>
       </w:pPr>
       <w:r>
-        <w:t xml:space="preserve">Cross-modal appearance, not field-of-view mismatch, is the binding constraint for foundation-model registration of correlative materials microscopy</w:t>
+        <w:t xml:space="preserve">Cross-modal appearance, not field-of-view mismatch, is the dominant constraint on foundation-model registration in the AmalgaMatch correlative-microscopy benchmark</w:t>
       </w:r>
     </w:p>
     <w:p>
@@ -110,7 +110,7 @@
         <w:t xml:space="preserve"> </w:t>
       </w:r>
       <w:r>
-        <w:t xml:space="preserve">= 0.018), entirely among high-FOV pairs. This isolates the binding constraint: on AmalgaMatch, cross-modal</w:t>
+        <w:t xml:space="preserve">= 0.018), entirely among high-FOV pairs. This points to the dominant constraint on this benchmark: cross-modal</w:t>
       </w:r>
       <w:r>
         <w:t xml:space="preserve"> </w:t>
@@ -123,10 +123,7 @@
         <w:t xml:space="preserve">appearance</w:t>
       </w:r>
       <w:r>
-        <w:t xml:space="preserve"> </w:t>
-      </w:r>
-      <w:r>
-        <w:t xml:space="preserve">— not scale — is what fails. A controlled FOV-ladder experiment, which crops real base-matchable pairs to sweep FOV with appearance fixed, confirms both halves: the same wrapper</w:t>
+        <w:t xml:space="preserve">, not scale, is what fails. A controlled FOV-ladder experiment, which crops real base-matchable pairs to sweep FOV with appearance fixed, isolates scale directly and shows the same wrapper tripling success at 10 % FOV (SR@10 0.07 → 0.23,</w:t>
       </w:r>
       <w:r>
         <w:t xml:space="preserve"> </w:t>
@@ -136,16 +133,13 @@
           <w:i/>
           <w:iCs/>
         </w:rPr>
-        <w:t xml:space="preserve">triples</w:t>
-      </w:r>
-      <w:r>
-        <w:t xml:space="preserve"> </w:t>
-      </w:r>
-      <w:r>
-        <w:t xml:space="preserve">success at 10 % FOV (SR@10 0.07 → 0.23,</w:t>
-      </w:r>
-      <w:r>
-        <w:t xml:space="preserve"> </w:t>
+        <w:t xml:space="preserve">p</w:t>
+      </w:r>
+      <w:r>
+        <w:t xml:space="preserve"> </w:t>
+      </w:r>
+      <w:r>
+        <w:t xml:space="preserve">= 0.0014): the scale mechanism is sound, and the real distribution simply never presents scale as the isolated failure mode. Decoder-only fine-tuning of MatchAnything-RoMa on 131 held-out-split training pairs cut median error on in-distribution TEM pairs 5.2× (321 → 62 px), but regressed overall SR@20 (0.393 → 0.250) by forgetting a modality absent from training; a one-line L2-SP weight anchor returns SR@20 to a level no longer distinguishable from zero-shot (</w:t>
       </w:r>
       <w:r>
         <w:rPr>
@@ -158,36 +152,7 @@
         <w:t xml:space="preserve"> </w:t>
       </w:r>
       <w:r>
-        <w:t xml:space="preserve">= 0.0014), so the scale mechanism is sound — the real distribution simply never isolates scale as the failure mode. Decoder-only fine-tuning of MatchAnything-RoMa on 131 held-out-split training pairs cut median error on in-distribution TEM pairs 5.2× (321 → 62 px), but</w:t>
-      </w:r>
-      <w:r>
-        <w:t xml:space="preserve"> </w:t>
-      </w:r>
-      <w:r>
-        <w:rPr>
-          <w:i/>
-          <w:iCs/>
-        </w:rPr>
-        <w:t xml:space="preserve">regressed</w:t>
-      </w:r>
-      <w:r>
-        <w:t xml:space="preserve"> </w:t>
-      </w:r>
-      <w:r>
-        <w:t xml:space="preserve">overall SR@20 (0.393 → 0.250) by catastrophically forgetting a modality absent from training; a one-line L2-SP weight anchor recovers the regression to within noise of zero-shot (</w:t>
-      </w:r>
-      <w:r>
-        <w:rPr>
-          <w:i/>
-          <w:iCs/>
-        </w:rPr>
-        <w:t xml:space="preserve">p</w:t>
-      </w:r>
-      <w:r>
-        <w:t xml:space="preserve"> </w:t>
-      </w:r>
-      <w:r>
-        <w:t xml:space="preserve">= 0.91) while sharpening median error. Deployable cross-modal microscopy registration therefore needs a forgetting-robust domain fine-tune over broad modality coverage, with the pyramid wrapper as a complementary — and provably effective — scale layer on top.</w:t>
+        <w:t xml:space="preserve">= 0.91, a null result limited by the 28-pair test rather than proven equivalence) while sharpening median error. Deployable cross-modal microscopy registration therefore needs a forgetting-robust domain fine-tune over broad modality coverage, with the verified pyramid wrapper as a complementary scale layer for genuinely multiscale tasks. Because the appearance conclusion is reached by elimination rather than by an appearance-swept experiment, we frame it as the dominant factor on AmalgaMatch rather than a property of cross-modal microscopy in general.</w:t>
       </w:r>
     </w:p>
     <w:p>
@@ -284,7 +249,7 @@
         <w:pStyle w:val="BodyText"/>
       </w:pPr>
       <w:r>
-        <w:t xml:space="preserve">Here we test these hypotheses end-to-end on all 187 AmalgaMatch pairs with controls, ablations, and a controlled decoupling experiment, and report a result that is as much diagnostic as methodological. The naive pyramid does not merely fail to help — it destroys the matchers it wraps, for a structural reason (dense matchers never abstain). A redesigned verified coarse-to-fine wrapper recovers a small, real gain but cannot reach the severe-FOV regime. The single largest off-the-shelf lever is the backbone, not the wrapper. And a controlled FOV ladder, which separates scale from appearance on real pairs, shows that the wrapper mechanism is in fact sound for scale — the real benchmark simply never presents scale as the isolated failure mode, because the low-FOV pairs are also the most appearance-divergent. We then attack appearance directly with materials-domain fine-tuning, observe catastrophic forgetting, and show that a one-line weight anchor removes it. The contributions are: (i) a mechanistic account of why pyramidal wrappers break non-abstaining dense matchers, and a verified coarse-to-fine wrapper that does not; (ii) a controlled FOV-ladder protocol that decouples scale from appearance and proves the wrapper’s scale mechanism; (iii) evidence that cross-modal appearance, not FOV, is the binding constraint on this benchmark; and (iv) a forgetting-robust decoder-only fine-tuning recipe for cross-modal microscopy matching.</w:t>
+        <w:t xml:space="preserve">Here we test these hypotheses end-to-end on all 187 AmalgaMatch pairs with controls, ablations, and a controlled decoupling experiment, and report a result that is as much diagnostic as methodological. The naive pyramid does not merely fail to help — it destroys the matchers it wraps, for a structural reason (dense matchers never abstain). A redesigned verified coarse-to-fine wrapper recovers a small, real gain but cannot reach the severe-FOV regime. The single largest off-the-shelf lever is the backbone, not the wrapper. And a controlled FOV ladder, which separates scale from appearance on real pairs, shows that the wrapper mechanism is in fact sound for scale — the real benchmark simply never presents scale as the isolated failure mode, because the low-FOV pairs are also the most appearance-divergent. We then attack appearance directly with materials-domain fine-tuning, observe catastrophic forgetting, and show that a one-line weight anchor largely removes it. The contributions are: (i) a mechanistic account of why pyramidal wrappers break non-abstaining dense matchers, and a verified coarse-to-fine wrapper that does not; (ii) a controlled FOV-ladder protocol that decouples scale from appearance and validates the wrapper’s scale mechanism; (iii) evidence that cross-modal appearance, not FOV, is the dominant constraint on this benchmark; and (iv) a forgetting-robust decoder-only fine-tuning recipe for cross-modal microscopy matching.</w:t>
       </w:r>
     </w:p>
     <w:bookmarkEnd w:id="10"/>
@@ -1197,7 +1162,7 @@
         <w:pStyle w:val="FirstParagraph"/>
       </w:pPr>
       <w:r>
-        <w:t xml:space="preserve">The sections above leave appearance as the binding constraint and name materials-domain fine-tuning as the credible path. We tested it directly. A scene-level 131/28/28 train/val/test split prevents leakage (within-scene pairs share images, so a pair-level split would leak); all headline numbers are the 28 test pairs only, with validation driving model selection and test touched once. Fine-tuning is decoder-only — the VGG+DINOv2 encoder is frozen in evaluation mode so its normalisation statistics cannot drift — training ~100M decoder parameters on densified sparse GT (sparse correspondences splined into a dense A→B warp, supervised inside the GT-support region) with FOV-crop and photometric augmentation. Selection by median validation ED chose an early checkpoint (validation median 17.6 vs. 21.7 px zero-shot).</w:t>
+        <w:t xml:space="preserve">The sections above leave appearance as the dominant constraint and name materials-domain fine-tuning as the credible path. We tested it directly. A scene-level 131/28/28 train/val/test split prevents leakage (within-scene pairs share images, so a pair-level split would leak); all headline numbers are the 28 test pairs only, with validation driving model selection and test touched once. Fine-tuning is decoder-only — the VGG+DINOv2 encoder is frozen in evaluation mode so its normalisation statistics cannot drift — training ~100M decoder parameters on densified sparse GT (sparse correspondences splined into a dense A→B warp, supervised inside the GT-support region) with FOV-crop and photometric augmentation. Selection by median validation ED chose an early checkpoint (validation median 17.6 vs. 21.7 px zero-shot).</w:t>
       </w:r>
     </w:p>
     <w:p>
@@ -1576,7 +1541,19 @@
         <w:t xml:space="preserve"> </w:t>
       </w:r>
       <w:r>
-        <w:t xml:space="preserve">= 0.91) — the regression is no longer statistically detectable — at a median ED 28.1 px better than zero-shot. The cheapest possible mitigation thus converts the net regression into a net-neutral-to-positive fine-tune, and the pyramid wrapper still stacks on top (direct SR@20 0.286 → pyramid 0.321). Catastrophic forgetting at this data budget is solved; lifting SR@20</w:t>
+        <w:t xml:space="preserve">= 0.91): the regression is no longer statistically detectable, though with only 28 test pairs this is a low-power null and should be read as</w:t>
+      </w:r>
+      <w:r>
+        <w:t xml:space="preserve"> </w:t>
+      </w:r>
+      <w:r>
+        <w:t xml:space="preserve">“not detectably worse”</w:t>
+      </w:r>
+      <w:r>
+        <w:t xml:space="preserve"> </w:t>
+      </w:r>
+      <w:r>
+        <w:t xml:space="preserve">rather than as proven equivalence (an equivalence test on a larger held-out set is planned). This minimal mitigation converts the net regression into a net-neutral-to-positive fine-tune, and the wrapper still stacks on top (direct SR@20 0.286 → pyramid 0.321). One important caveat bounds the claim: one of the two held-out off-distribution C103 scenes remains unrecoverable at every λ, so forgetting is mitigated but not eliminated. We therefore treat L2-SP as a deliberately zero-cost lower bound on forgetting mitigation rather than a complete solution, and expect stronger continual-learning methods — experience replay, elastic weight consolidation [14], or LoRA-style low-rank updates [13] — to improve on it; quantifying that is left to future work. Lifting SR@20</w:t>
       </w:r>
       <w:r>
         <w:t xml:space="preserve"> </w:t>
@@ -1592,7 +1569,7 @@
         <w:t xml:space="preserve"> </w:t>
       </w:r>
       <w:r>
-        <w:t xml:space="preserve">zero-shot still requires closing the unrecoverable-modality gap, which needs training coverage of that modality combination rather than a better optimiser.</w:t>
+        <w:t xml:space="preserve">zero-shot additionally requires closing the unrecoverable-modality gap, which needs training coverage of that modality combination rather than a better optimiser.</w:t>
       </w:r>
     </w:p>
     <w:p>
@@ -2040,7 +2017,7 @@
         <w:pStyle w:val="FirstParagraph"/>
       </w:pPr>
       <w:r>
-        <w:t xml:space="preserve">The structural conclusion is that, on AmalgaMatch, cross-modal appearance — not scale mismatch — is the binding constraint for foundation-model registration. Three independent lines of evidence converge on it. First, the only off-the-shelf intervention that produced a significant headline gain was a change of</w:t>
+        <w:t xml:space="preserve">The conclusion we draw, for this benchmark, is that cross-modal appearance rather than scale mismatch is the dominant constraint on foundation-model registration. Three lines of evidence point to it. First, the only off-the-shelf intervention that produced a significant headline gain was a change of</w:t>
       </w:r>
       <w:r>
         <w:t xml:space="preserve"> </w:t>
@@ -2056,7 +2033,7 @@
         <w:t xml:space="preserve"> </w:t>
       </w:r>
       <w:r>
-        <w:t xml:space="preserve">(cross-modal-trained MatchAnything-RoMa), and that gain lived entirely among high-FOV, nearly-matchable pairs. Second, a scale-only wrapper that demonstrably triples success when scale is isolated experimentally moves real severe-FOV pairs almost not at all, because in the real distribution low FOV and high appearance divergence are confounded. Third, attacking appearance directly with domain fine-tuning produced the single largest error reduction in the study (5.2× on in-distribution TEM). The pyramid solves a problem these pairs mostly do not have and cannot touch the one they do.</w:t>
+        <w:t xml:space="preserve">(cross-modal-trained MatchAnything-RoMa), and that gain lived entirely among high-FOV, nearly-matchable pairs. Second, a scale-only wrapper that triples success when scale is isolated experimentally moves real severe-FOV pairs almost not at all, because in the real distribution low FOV and high appearance divergence are confounded. Third, attacking appearance directly with domain fine-tuning produced the single largest error reduction we observed (5.2× on in-distribution TEM). The pyramid solves a problem these pairs mostly do not have and cannot touch the one they do.</w:t>
       </w:r>
     </w:p>
     <w:p>
@@ -2064,7 +2041,35 @@
         <w:pStyle w:val="BodyText"/>
       </w:pPr>
       <w:r>
-        <w:t xml:space="preserve">This sharpens, rather than contradicts, the picture from the AmalgaMatch authors’ own foundation-model evaluation [1]. They establish that a macroscale-trained cross-modal matcher generalises surprisingly well to microscopy and that severe FOV, low mutual information, and dislocation imaging remain hard. We add the causal decomposition: of those three, FOV is addressable by a training-free wrapper once it is the isolated variable, whereas the low-mutual-information and dislocation cases are appearance failures that only domain data repairs. The practical implication for correlative-microscopy pipelines is a clear ordering: choose a cross-modal backbone first, add domain fine-tuning with forgetting mitigation second, and apply a verified scale wrapper third for the genuinely multiscale tasks.</w:t>
+        <w:t xml:space="preserve">We are deliberately careful about the asymmetry in this evidence. Scale is decoupled by a direct, controlled experiment (the FOV ladder); appearance is implicated by elimination rather than by an equivalent</w:t>
+      </w:r>
+      <w:r>
+        <w:t xml:space="preserve"> </w:t>
+      </w:r>
+      <w:r>
+        <w:t xml:space="preserve">“scale fixed, appearance swept”</w:t>
+      </w:r>
+      <w:r>
+        <w:t xml:space="preserve"> </w:t>
+      </w:r>
+      <w:r>
+        <w:t xml:space="preserve">manipulation, and the FOV ladder itself runs only on base-matchable pairs — those already selected to have tractable appearance. The appearance conclusion is therefore weaker than the scale conclusion, and we present it as the dominant</w:t>
+      </w:r>
+      <w:r>
+        <w:t xml:space="preserve"> </w:t>
+      </w:r>
+      <w:r>
+        <w:rPr>
+          <w:i/>
+          <w:iCs/>
+        </w:rPr>
+        <w:t xml:space="preserve">uncontrolled</w:t>
+      </w:r>
+      <w:r>
+        <w:t xml:space="preserve"> </w:t>
+      </w:r>
+      <w:r>
+        <w:t xml:space="preserve">factor on AmalgaMatch rather than as a demonstrated law of cross-modal microscopy. A controlled appearance sweep (for example, holding geometry fixed while degrading mutual information) is the natural complement to the FOV ladder and is left to future work.</w:t>
       </w:r>
     </w:p>
     <w:p>
@@ -2072,7 +2077,38 @@
         <w:pStyle w:val="BodyText"/>
       </w:pPr>
       <w:r>
-        <w:t xml:space="preserve">Several limitations bound these claims. The mutual-information verifier cannot rank transforms within ~10 px of one another, which both caps the wrapper’s benefit on strong backbones and prevents the iterated-zoom machinery from paying off; a learned or GT-free residual verifier is the obvious next lever. The ~10.3 px GT affine residual floors all px-threshold metrics, so AmalgaMatch cannot certify sub-5 px registration and our SR@5 numbers should be read with that floor in mind. The four near-threshold pairs that the wrapper swaps on the strong backbone indicate that future near-threshold claims should report multi-seed variance, even though GPU non-determinism here sits below the bootstrap noise. Finally, the fine-tuning study rests on 131 training pairs over 12 subclasses; L2-SP closes the forgetting half of the data-budget problem, but the unrecoverable C103 scene — broken at every anchor strength — shows that breadth of modality coverage, not optimisation, is the remaining bottleneck. The concrete next experiment is to add training pairs in that modality combination and re-evaluate on the same held-out split and FOV ladder used here. We expect a forgetting-robust fine-tune over broad modality coverage, with the verified wrapper reserved for multiscale tasks, to be the deployable configuration for cross-modal microscopy registration.</w:t>
+        <w:t xml:space="preserve">This sharpens, rather than contradicts, the picture from the AmalgaMatch authors’ own foundation-model evaluation [1]. They establish that a macroscale-trained cross-modal matcher generalises surprisingly well to microscopy and that severe FOV, low mutual information, and dislocation imaging remain hard. We add the causal decomposition: of those three, FOV is addressable by a training-free wrapper once it is the isolated variable, whereas the low-mutual-information and dislocation cases are appearance failures that only domain data repairs.</w:t>
+      </w:r>
+    </w:p>
+    <w:p>
+      <w:pPr>
+        <w:pStyle w:val="BodyText"/>
+      </w:pPr>
+      <w:r>
+        <w:t xml:space="preserve">The practical implication for correlative-microscopy pipelines is a clear ordering. (i) Choose a cross-modal-trained backbone: MatchAnything-RoMa is the strongest off-the-shelf option and loads into a stock</w:t>
+      </w:r>
+      <w:r>
+        <w:t xml:space="preserve"> </w:t>
+      </w:r>
+      <w:r>
+        <w:rPr>
+          <w:rStyle w:val="VerbatimChar"/>
+        </w:rPr>
+        <w:t xml:space="preserve">roma_outdoor</w:t>
+      </w:r>
+      <w:r>
+        <w:t xml:space="preserve"> </w:t>
+      </w:r>
+      <w:r>
+        <w:t xml:space="preserve">pipeline unchanged. (ii) Fit transforms with automatic affine-vs-homography selection rather than a hard affine restriction (affine wins 69 % of pairs, homography the rest). (iii) Add a forgetting-robust decoder-only domain fine-tune when in-domain data exists — in our setup ~100M decoder parameters, AdamW for 1500 steps, ~90 min on a single RTX 5090, a 445 MB checkpoint — with an L2-SP anchor at λ = 0.01 so that untrained modality combinations are not lost. (iv) Apply the verified wrapper only for genuinely multiscale tasks, where it adds a real scale lift without regressing the rest. A practical caveat on coverage: the fine-tune’s benefit is confined to modality combinations represented in training (here TEM dislocation imaging and several EBSD subclasses); combinations absent from training (the C103 SEM-SE↔LOM-height case) should be run with the zero-shot backbone, or the fine-tune re-trained with that combination included, until coverage is broadened.</w:t>
+      </w:r>
+    </w:p>
+    <w:p>
+      <w:pPr>
+        <w:pStyle w:val="BodyText"/>
+      </w:pPr>
+      <w:r>
+        <w:t xml:space="preserve">Several limitations bound these claims. The mutual-information verifier cannot rank transforms within ~10 px of one another, which both caps the wrapper’s benefit on strong backbones and prevents the iterated-zoom machinery from paying off; a learned or GT-free residual verifier is the obvious next lever. The ~10.3 px GT affine residual floors all px-threshold metrics, so AmalgaMatch cannot certify sub-5 px registration and our SR@5 numbers should be read with that floor in mind. The FOV ladder, while it cleanly isolates scale, crops real targets rather than acquiring genuinely low-FOV images, so it does not reproduce the texture, detector-noise, and resolution differences of native low-FOV acquisition; its wrapper gains should be read as a controlled lower bound on the mechanism, not as a literal forecast for natively low-FOV pairs. The headline fine-tuning and L2-SP numbers rest on single training runs and a 28-pair test split, with the SR@20 regression driven by four pairs; the four near-threshold wrapper swaps point the same way. Multi-seed variance on the fine-tuning and L2-SP tables, a formal equivalence test on a larger held-out set, and at least one stronger continual-learning baseline (LoRA-style low-rank adaptation) are planned and not yet run, and we flag the single-run results accordingly. Finally, the fine-tuning study rests on 131 training pairs over 12 subclasses; L2-SP closes the forgetting half of the data-budget problem, but the unrecoverable C103 scene — broken at every anchor strength — shows that breadth of modality coverage, not optimisation, is the remaining bottleneck. The concrete next experiment is to add training pairs in that modality combination and re-evaluate on the same held-out split and FOV ladder used here. We expect a forgetting-robust fine-tune over broad modality coverage, with the verified wrapper reserved for multiscale tasks, to be the deployable configuration for cross-modal microscopy registration.</w:t>
       </w:r>
     </w:p>
     <w:bookmarkEnd w:id="20"/>

</xml_diff>

<commit_message>
Style pass: remove em-dash density and uniform antithesis rhythm across the manuscript
Prose em-dashes ~45 -> 0 (only Table 1 N/A markers remain); broke up 'not X but Y'
cadence and aphoristic paragraph-enders; trimmed intensifiers. No numbers, citations,
or tables changed. Rebuilt paper.docx.
</commit_message>
<xml_diff>
--- a/paper/paper.docx
+++ b/paper/paper.docx
@@ -62,7 +62,7 @@
         <w:pStyle w:val="FirstParagraph"/>
       </w:pPr>
       <w:r>
-        <w:t xml:space="preserve">Correlative materials microscopy pairs images of one specimen across modalities (SEM, EBSD, TEM, optical) that share little visual appearance and often differ in field of view (FOV) by more than an order of magnitude, defeating classical feature-based registration. We asked whether a scale-aware pyramidal patching wrapper around pretrained dense matchers (RoMa, the ELoFTR family, MatchAnything) could lift cross-modal registration on the AmalgaMatch benchmark (187 pairs, 19 material subsets), particularly at severe FOV mismatch. Across a full controls-and-ablations pass we find that a naive tiling pyramid</w:t>
+        <w:t xml:space="preserve">Correlative materials microscopy pairs images of one specimen across modalities (SEM, EBSD, TEM, optical) that share little visual appearance and often differ in field of view (FOV) by more than an order of magnitude, defeating classical feature-based registration. We asked whether a scale-aware pyramidal patching wrapper around pretrained dense matchers (RoMa, the ELoFTR family, MatchAnything) could lift cross-modal registration on the AmalgaMatch benchmark (187 pairs, 19 material subsets), particularly at severe FOV mismatch. A full controls-and-ablations pass gave three results. A naive tiling pyramid</w:t>
       </w:r>
       <w:r>
         <w:t xml:space="preserve"> </w:t>
@@ -72,13 +72,13 @@
           <w:i/>
           <w:iCs/>
         </w:rPr>
-        <w:t xml:space="preserve">catastrophically degrades</w:t>
-      </w:r>
-      <w:r>
-        <w:t xml:space="preserve"> </w:t>
-      </w:r>
-      <w:r>
-        <w:t xml:space="preserve">dense matchers, because they never abstain — every tile returns thousands of confident matches that flood robust estimation (median error 76 → 1794 px); a redesigned verified coarse-to-fine wrapper recovers a small but significant gain (success rate at 10 px, SR@10, 0.10 → 0.12,</w:t>
+        <w:t xml:space="preserve">degrades</w:t>
+      </w:r>
+      <w:r>
+        <w:t xml:space="preserve"> </w:t>
+      </w:r>
+      <w:r>
+        <w:t xml:space="preserve">dense matchers badly, because they never abstain: every tile returns thousands of confident matches that flood robust estimation, and median error rises from 76 to 1794 px. A redesigned verified coarse-to-fine wrapper recovers a small but significant gain (success rate at 10 px, SR@10, 0.10 → 0.12,</w:t>
       </w:r>
       <w:r>
         <w:t xml:space="preserve"> </w:t>
@@ -94,7 +94,7 @@
         <w:t xml:space="preserve"> </w:t>
       </w:r>
       <w:r>
-        <w:t xml:space="preserve">= 0.017) without losing any pair, yet leaves success at FOV ≤ 5 % at zero. The largest off-the-shelf lever was instead the backbone: cross-modal-trained MatchAnything-RoMa weights gave the only significant gain over the zero-shot bar (SR@10 +0.032,</w:t>
+        <w:t xml:space="preserve">= 0.017) without losing any pair, yet success at FOV ≤ 5 % stays at zero. The largest off-the-shelf lever was instead the backbone. Cross-modal-trained MatchAnything-RoMa weights gave the only significant gain over the zero-shot bar (SR@10 +0.032,</w:t>
       </w:r>
       <w:r>
         <w:t xml:space="preserve"> </w:t>
@@ -110,7 +110,7 @@
         <w:t xml:space="preserve"> </w:t>
       </w:r>
       <w:r>
-        <w:t xml:space="preserve">= 0.018), entirely among high-FOV pairs. This points to the dominant constraint on this benchmark: cross-modal</w:t>
+        <w:t xml:space="preserve">= 0.018), and that gain sat entirely among high-FOV pairs. The pattern points to the dominant constraint on this benchmark: cross-modal appearance, not scale, is what fails. A controlled FOV-ladder experiment crops real base-matchable pairs to sweep FOV with appearance held fixed, and with scale thus isolated the same wrapper triples success at 10 % FOV (SR@10 0.07 → 0.23,</w:t>
       </w:r>
       <w:r>
         <w:t xml:space="preserve"> </w:t>
@@ -120,13 +120,13 @@
           <w:i/>
           <w:iCs/>
         </w:rPr>
-        <w:t xml:space="preserve">appearance</w:t>
-      </w:r>
-      <w:r>
-        <w:t xml:space="preserve">, not scale, is what fails. A controlled FOV-ladder experiment, which crops real base-matchable pairs to sweep FOV with appearance fixed, isolates scale directly and shows the same wrapper tripling success at 10 % FOV (SR@10 0.07 → 0.23,</w:t>
-      </w:r>
-      <w:r>
-        <w:t xml:space="preserve"> </w:t>
+        <w:t xml:space="preserve">p</w:t>
+      </w:r>
+      <w:r>
+        <w:t xml:space="preserve"> </w:t>
+      </w:r>
+      <w:r>
+        <w:t xml:space="preserve">= 0.0014). The scale mechanism is therefore sound, and the real distribution simply never presents scale as the isolated failure mode. Decoder-only fine-tuning of MatchAnything-RoMa on 131 held-out-split training pairs then cut median error on in-distribution TEM pairs 5.2× (321 → 62 px), but it regressed overall SR@20 (0.393 → 0.250) by forgetting a modality absent from training. A one-line L2-SP weight anchor returns SR@20 to a level no longer distinguishable from zero-shot (</w:t>
       </w:r>
       <w:r>
         <w:rPr>
@@ -139,20 +139,7 @@
         <w:t xml:space="preserve"> </w:t>
       </w:r>
       <w:r>
-        <w:t xml:space="preserve">= 0.0014): the scale mechanism is sound, and the real distribution simply never presents scale as the isolated failure mode. Decoder-only fine-tuning of MatchAnything-RoMa on 131 held-out-split training pairs cut median error on in-distribution TEM pairs 5.2× (321 → 62 px), but regressed overall SR@20 (0.393 → 0.250) by forgetting a modality absent from training; a one-line L2-SP weight anchor returns SR@20 to a level no longer distinguishable from zero-shot (</w:t>
-      </w:r>
-      <w:r>
-        <w:rPr>
-          <w:i/>
-          <w:iCs/>
-        </w:rPr>
-        <w:t xml:space="preserve">p</w:t>
-      </w:r>
-      <w:r>
-        <w:t xml:space="preserve"> </w:t>
-      </w:r>
-      <w:r>
-        <w:t xml:space="preserve">= 0.91, a null result limited by the 28-pair test rather than proven equivalence) while sharpening median error. Deployable cross-modal microscopy registration therefore needs a forgetting-robust domain fine-tune over broad modality coverage, with the verified pyramid wrapper as a complementary scale layer for genuinely multiscale tasks. Because the appearance conclusion is reached by elimination rather than by an appearance-swept experiment, we frame it as the dominant factor on AmalgaMatch rather than a property of cross-modal microscopy in general.</w:t>
+        <w:t xml:space="preserve">= 0.91, a null limited by the 28-pair test rather than proven equivalence) while sharpening median error. Deployable cross-modal microscopy registration therefore needs a forgetting-robust domain fine-tune over broad modality coverage, with the verified pyramid wrapper as a complementary scale layer for genuinely multiscale tasks. Because the appearance conclusion is reached by elimination rather than by an appearance-swept experiment, we present it as the dominant factor on AmalgaMatch and not as a property of cross-modal microscopy in general.</w:t>
       </w:r>
     </w:p>
     <w:p>
@@ -177,7 +164,7 @@
         <w:pStyle w:val="FirstParagraph"/>
       </w:pPr>
       <w:r>
-        <w:t xml:space="preserve">Correlative microscopy spatially associates measurements of a single specimen acquired by different instruments — scanning electron microscopy (SEM), electron backscatter diffraction (EBSD), transmission electron microscopy (TEM), optical light microscopy (LOM), and their derived modalities such as image-quality and inverse-pole-figure maps — so that structure, chemistry, crystallography, and mechanics can be read out at the same physical location [1]. The scientific payoff is direct: linking a dislocation configuration in TEM to a grain orientation in EBSD, or slip partitioning in SEM-DIC to the underlying microstructure, requires that the two images be brought into a common coordinate frame to sub-grain precision. That step — registration — is the bottleneck. Unlike natural-image or remote-sensing registration, correlative microscopy couples two compounding difficulties: the modalities share little mutual information (a secondary-electron contrast image and a crystallographic orientation map are generated by entirely different physics), and the field of view (FOV) can differ by more than an order of magnitude, with the narrow-FOV image covering as little as 2 % of the wide-FOV frame. Classical intensity- and feature-based methods that assume shared appearance and comparable scale fail outright on this regime [2].</w:t>
+        <w:t xml:space="preserve">Correlative microscopy spatially associates measurements of a single specimen acquired by different instruments: scanning electron microscopy (SEM), electron backscatter diffraction (EBSD), transmission electron microscopy (TEM), optical light microscopy (LOM), and derived modalities such as image-quality and inverse-pole-figure maps. The aim is to read out structure, chemistry, crystallography, and mechanics at the same physical location [1]. The scientific payoff is direct: linking a dislocation configuration in TEM to a grain orientation in EBSD, or slip partitioning in SEM-DIC to the underlying microstructure, requires that the two images be brought into a common coordinate frame to sub-grain precision. Registration is that step, and it is the bottleneck. Unlike natural-image or remote-sensing registration, correlative microscopy couples two compounding difficulties. The modalities share little mutual information, because a secondary-electron contrast image and a crystallographic orientation map are generated by entirely different physics. And the field of view (FOV) can differ by more than an order of magnitude, with the narrow-FOV image covering as little as 2 % of the wide-FOV frame. Classical intensity- and feature-based methods assume shared appearance and comparable scale, so they fail outright on this regime [2].</w:t>
       </w:r>
     </w:p>
     <w:p>
@@ -185,7 +172,7 @@
         <w:pStyle w:val="BodyText"/>
       </w:pPr>
       <w:r>
-        <w:t xml:space="preserve">Learned dense feature matchers have transformed correspondence estimation for natural images. Detector-free transformers such as LoFTR [3] and its efficient successor [4] produce semi-dense matches in texture-poor scenes; RoMa [5] couples frozen DINOv2 features [6] with a specialised fine-feature branch and a match-classification decoder to yield pixel-dense warps with calibrated certainty; and MatchAnything [7] retrains such backbones on large-scale synthetic cross-modal signals, reporting strong generalisation across more than eight unseen cross-modality tasks with a single weight set. These detector-free dense matchers differ in a way that becomes central below: unlike sparse learned matchers built on keypoint detection and attention-based assignment [15,16], dense matchers emit a confident correspondence at essentially every pixel and never abstain. These models are trained almost entirely on macroscale imagery, raising the question of whether they transfer to materials microstructures and, critically, whether their failures at severe FOV mismatch can be repaired without retraining.</w:t>
+        <w:t xml:space="preserve">Learned dense feature matchers have transformed correspondence estimation for natural images. Detector-free transformers such as LoFTR [3] and its efficient successor [4] produce semi-dense matches in texture-poor scenes; RoMa [5] couples frozen DINOv2 features [6] with a specialised fine-feature branch and a match-classification decoder to yield pixel-dense warps with calibrated certainty; and MatchAnything [7] retrains such backbones on large-scale synthetic cross-modal signals, reporting strong generalisation across more than eight unseen cross-modality tasks with a single weight set. One property of these detector-free dense matchers becomes central below. Sparse learned matchers built on keypoint detection and attention-based assignment [15,16] can decline to match; dense matchers instead emit a confident correspondence at essentially every pixel and never abstain. All of these models are trained almost entirely on macroscale imagery, which raises the question of whether they transfer to materials microstructures, and of whether their failures at severe FOV mismatch can be repaired without retraining.</w:t>
       </w:r>
     </w:p>
     <w:p>
@@ -193,7 +180,7 @@
         <w:pStyle w:val="BodyText"/>
       </w:pPr>
       <w:r>
-        <w:t xml:space="preserve">A natural hypothesis is that the FOV gap is the dominant problem and can be closed by a scale-aware wrapper: crop the wide-FOV source into a pyramid of target-resolution tiles, match each tile against the narrow-FOV target, pool the correspondences, and fit a single global transform by robust estimation. This is appealing because it requires no training and treats the matcher as a black box. The project hypotheses were</w:t>
+        <w:t xml:space="preserve">A natural hypothesis is that the FOV gap is the dominant problem and that a scale-aware wrapper can close it: crop the wide-FOV source into a pyramid of target-resolution tiles, match each tile against the narrow-FOV target, pool the correspondences, and fit a single global transform by robust estimation. The appeal is that it requires no training and treats the matcher as a black box. The project hypotheses were</w:t>
       </w:r>
       <w:r>
         <w:t xml:space="preserve"> </w:t>
@@ -249,7 +236,7 @@
         <w:pStyle w:val="BodyText"/>
       </w:pPr>
       <w:r>
-        <w:t xml:space="preserve">Here we test these hypotheses end-to-end on all 187 AmalgaMatch pairs with controls, ablations, and a controlled decoupling experiment, and report a result that is as much diagnostic as methodological. The naive pyramid does not merely fail to help — it destroys the matchers it wraps, for a structural reason (dense matchers never abstain). A redesigned verified coarse-to-fine wrapper recovers a small, real gain but cannot reach the severe-FOV regime. The single largest off-the-shelf lever is the backbone, not the wrapper. And a controlled FOV ladder, which separates scale from appearance on real pairs, shows that the wrapper mechanism is in fact sound for scale — the real benchmark simply never presents scale as the isolated failure mode, because the low-FOV pairs are also the most appearance-divergent. We then attack appearance directly with materials-domain fine-tuning, observe catastrophic forgetting, and show that a one-line weight anchor largely removes it. The contributions are: (i) a mechanistic account of why pyramidal wrappers break non-abstaining dense matchers, and a verified coarse-to-fine wrapper that does not; (ii) a controlled FOV-ladder protocol that decouples scale from appearance and validates the wrapper’s scale mechanism; (iii) evidence that cross-modal appearance, not FOV, is the dominant constraint on this benchmark; and (iv) a forgetting-robust decoder-only fine-tuning recipe for cross-modal microscopy matching.</w:t>
+        <w:t xml:space="preserve">Here we test these hypotheses end-to-end on all 187 AmalgaMatch pairs, with controls, ablations, and a controlled decoupling experiment, and the result is as much diagnostic as methodological. The naive pyramid does not merely fail to help. It destroys the matchers it wraps, for a structural reason we trace to the fact that dense matchers never abstain. A redesigned verified coarse-to-fine wrapper recovers a small, real gain, but it cannot reach the severe-FOV regime. The single largest off-the-shelf lever turns out to be the backbone rather than the wrapper. A controlled FOV ladder then separates scale from appearance on real pairs and shows that the wrapper mechanism is in fact sound for scale; the real benchmark simply never presents scale as the isolated failure mode, because the low-FOV pairs are also the most appearance-divergent. Finally we attack appearance directly with materials-domain fine-tuning, observe catastrophic forgetting, and show that a one-line weight anchor largely removes it. The contributions are four. First, a mechanistic account of why pyramidal wrappers break non-abstaining dense matchers, together with a verified coarse-to-fine wrapper that does not. Second, a controlled FOV-ladder protocol that decouples scale from appearance and validates the wrapper’s scale mechanism. Third, evidence that cross-modal appearance, not FOV, is the dominant constraint on this benchmark. Fourth, a forgetting-robust decoder-only fine-tuning recipe for cross-modal microscopy matching.</w:t>
       </w:r>
     </w:p>
     <w:bookmarkEnd w:id="10"/>
@@ -297,7 +284,7 @@
         <w:pStyle w:val="BodyText"/>
       </w:pPr>
       <w:r>
-        <w:t xml:space="preserve">Table 1 reports the headline comparison. Classical baselines reproduce the benchmark’s own finding: SIFT [10] succeeds on roughly 3 of 187 pairs (Control A), and mutual-information intensity refinement [11] (Control B) moves median ED but flips no pair to success. Among zero-shot foundation matchers, RoMa is the strongest single backbone (median ED 76.3 px, SR@10 0.10, SR@20 0.23), dominating the MatchAnything-ELoFTR configuration everywhere (SR@10 0.10–0.13 vs. 0.01–0.02), including every low-FOV stratum — supporting H2. Figure 2 shows the full success-rate bars and Figure 3 the per-task-group breakdown.</w:t>
+        <w:t xml:space="preserve">Table 1 reports the headline comparison. Classical baselines reproduce the benchmark’s own finding: SIFT [10] succeeds on roughly 3 of 187 pairs (Control A), and mutual-information intensity refinement [11] (Control B) moves median ED but flips no pair to success. Among zero-shot foundation matchers, RoMa is the strongest single backbone (median ED 76.3 px, SR@10 0.10, SR@20 0.23), and it dominates the MatchAnything-ELoFTR configuration everywhere (SR@10 0.10–0.13 vs. 0.01–0.02), including every low-FOV stratum, which supports H2. Figure 2 shows the full success-rate bars and Figure 3 the per-task-group breakdown.</w:t>
       </w:r>
     </w:p>
     <w:p>
@@ -967,7 +954,7 @@
         <w:pStyle w:val="FirstParagraph"/>
       </w:pPr>
       <w:r>
-        <w:t xml:space="preserve">The straightforward implementation of the scale hypothesis — tile the source, match each tile, pool all correspondences, fit one transform (pyramid v1) — does not help; it destroys the backbone. RoMa’s median ED rose from 76 to 1794 px and 106 of 187 pairs became hard failures (Fig. 2). The mechanism is structural and is the central negative finding about the wrapper class. Dense matchers never abstain: every tile, whether or not it overlaps the target, returns on the order of 10⁴ confident matches. Pooling across a pyramid therefore floods the robust estimator with mostly-spurious correspondences, collapsing the inlier fraction from 0.114 (direct) to 0.005 and leaving MAGSAC++ no consensus to find. This is a property of the non-abstaining dense-matcher class, not a tuning artefact, and it predicts that any pool-then-fit pyramid will fail on these backbones regardless of tile size or overlap.</w:t>
+        <w:t xml:space="preserve">The straightforward implementation of the scale hypothesis (pyramid v1) tiles the source, matches each tile, pools all correspondences, and fits one transform. It does not help; it destroys the backbone. RoMa’s median ED rose from 76 to 1794 px, and 106 of 187 pairs became hard failures (Fig. 2). The mechanism is structural, and it is the central negative finding about the wrapper class. Dense matchers never abstain: every tile, whether or not it overlaps the target, returns on the order of 10⁴ confident matches. Pooling across a pyramid therefore floods the robust estimator with mostly-spurious correspondences, collapses the inlier fraction from 0.114 (direct) to 0.005, and leaves MAGSAC++ no consensus to find. This is a property of the non-abstaining dense-matcher class rather than a tuning artefact, and it predicts that any pool-then-fit pyramid will fail on these backbones regardless of tile size or overlap.</w:t>
       </w:r>
     </w:p>
     <w:bookmarkEnd w:id="12"/>
@@ -985,7 +972,7 @@
         <w:pStyle w:val="FirstParagraph"/>
       </w:pPr>
       <w:r>
-        <w:t xml:space="preserve">We redesigned the wrapper to never pool blindly (pyramid v2; Fig. 1a). It matches the full pair directly first, then invokes candidate stages — tile search over a scaled source grid, then zoom refinement on the best region — only when direct support is weak, and accepts a candidate transform only if a mutual-information-on-overlap verifier scores it above the incumbent. This makes the wrapper monotone by construction: it can replace a bad direct fit but cannot be dragged below it by tile noise. On RoMa, pyramid v2 lifts SR@10 from 0.10 to 0.12 (+0.021, 95 % CI [+0.005, +0.043],</w:t>
+        <w:t xml:space="preserve">We redesigned the wrapper so that it never pools blindly (pyramid v2; Fig. 1a). It matches the full pair directly first. It then invokes candidate stages, namely tile search over a scaled source grid followed by zoom refinement on the best region, but only when direct support is weak, and it accepts a candidate transform only if a mutual-information-on-overlap verifier scores it above the incumbent. This makes the wrapper monotone by construction: it can replace a bad direct fit, but tile noise cannot drag it below one. On RoMa, pyramid v2 lifts SR@10 from 0.10 to 0.12 (+0.021, 95 % CI [+0.005, +0.043],</w:t>
       </w:r>
       <w:r>
         <w:t xml:space="preserve"> </w:t>
@@ -1001,7 +988,7 @@
         <w:t xml:space="preserve"> </w:t>
       </w:r>
       <w:r>
-        <w:t xml:space="preserve">= 0.017) with zero pairs lost, and produces the only non-zero severe-stratum results in the entire study (0.00 → 0.03). Two ablations confirm the design is at its useful limit. Iterated zoom (chaining refinements) is not significantly better than a single zoom and is borderline worse, because each stage multiplies verifier error. Certainty gating at 0.5 — discarding low-certainty matches before fitting — is significantly worse than plain v2 (SR@20 −0.037, CI [−0.070, −0.011]), because it starves the estimator precisely on the hard, uniformly-low-certainty pairs. Plain v2 is therefore the final wrapper.</w:t>
+        <w:t xml:space="preserve">= 0.017) with zero pairs lost, and it produces the only non-zero severe-stratum results in the entire study (0.00 → 0.03). Two ablations confirm the design is at its useful limit. Iterated zoom, which chains refinements, is not significantly better than a single zoom and is borderline worse, because each stage multiplies verifier error. Certainty gating at 0.5 discards low-certainty matches before fitting, and it is significantly worse than plain v2 (SR@20 −0.037, CI [−0.070, −0.011]), because it starves the estimator on exactly the hard pairs where everything is low-certainty. Plain v2 is therefore the final wrapper.</w:t>
       </w:r>
     </w:p>
     <w:p>
@@ -1009,7 +996,7 @@
         <w:pStyle w:val="BodyText"/>
       </w:pPr>
       <w:r>
-        <w:t xml:space="preserve">On the stronger MatchAnything-RoMa backbone, however, the wrapper’s headline contribution vanishes (SR@10 flat) and the no-regression property breaks (two pairs gained, two lost, all straddling the 7–13 px threshold band). The mutual-information verifier is good enough to rescue a weak backbone’s coarse failures, but cannot discriminate between transforms that already agree to within ~10 px. This verifier ceiling is the wrapper’s intrinsic limit and reappears below.</w:t>
+        <w:t xml:space="preserve">On the stronger MatchAnything-RoMa backbone, however, the wrapper’s headline contribution vanishes (SR@10 flat) and the no-regression property breaks (two pairs gained, two lost, all straddling the 7–13 px threshold band). The mutual-information verifier is good enough to rescue a weak backbone’s coarse failures, but it cannot discriminate between transforms that already agree to within ~10 px. This verifier ceiling is the wrapper’s intrinsic limit, and it reappears below.</w:t>
       </w:r>
     </w:p>
     <w:bookmarkEnd w:id="13"/>
@@ -1058,7 +1045,7 @@
         <w:t xml:space="preserve"> </w:t>
       </w:r>
       <w:r>
-        <w:t xml:space="preserve">= 0.018). The gain sits entirely in the ≥ 0.5 FOV stratum (0.13 → 0.18): cross-modal training repairs appearance on pairs that were nearly matchable, with an all-or-nothing profile (slightly worse SR@5, higher median ED when it misses). Severe-FOV pairs — small, low-texture, modality-divergent — remain at zero for every configuration tested. That a change of weights, not of geometry, produced the project’s only headline gain is the first direct sign that appearance, not scale, is the operative constraint. This is consistent with the AmalgaMatch authors’ own evaluation, which independently reports that MatchAnything-RoMa outperforms MatchAnything-ELoFTR across most subsets [1]; our contribution is to quantify where that gain lives (high FOV) and to show what it cannot reach (severe FOV).</w:t>
+        <w:t xml:space="preserve">= 0.018). The gain sits entirely in the ≥ 0.5 FOV stratum (0.13 → 0.18): cross-modal training repairs appearance on pairs that were nearly matchable, with an all-or-nothing profile (slightly worse SR@5, higher median ED when it misses). Severe-FOV pairs, which are small, low-texture, and modality-divergent, remain at zero for every configuration tested. A change of weights rather than of geometry produced the project’s only headline gain, and that is the first direct sign that appearance, not scale, is the operative constraint. The finding is consistent with the AmalgaMatch authors’ own evaluation, which independently reports that MatchAnything-RoMa outperforms MatchAnything-ELoFTR across most subsets [1]; our contribution is to quantify where that gain lives (high FOV) and to show what it cannot reach (severe FOV).</w:t>
       </w:r>
     </w:p>
     <w:bookmarkEnd w:id="14"/>
@@ -1076,7 +1063,7 @@
         <w:pStyle w:val="FirstParagraph"/>
       </w:pPr>
       <w:r>
-        <w:t xml:space="preserve">The real dataset cannot, on its own, answer the question H1 was about — what is the failure FOV per backbone? — because the low-FOV pairs are simultaneously the most appearance-divergent, and only four pairs sit below area ratio 0.05. We therefore constructed a controlled FOV ladder (Fig. 1b). For every base-matchable pair (direct mean ED &lt; 20 px; 36–40 pairs per backbone) we cropped the target to absolute area ratios {0.5, 0.25, 0.1, 0.05, 0.02}, holding appearance, modality gap, and pixel sizes fixed while sweeping FOV. All GT is kept for evaluation, so out-of-crop points test the global transform’s extrapolation. With scale thus isolated (Fig. 5):</w:t>
+        <w:t xml:space="preserve">The real dataset cannot answer the question that H1 was about, namely the failure FOV per backbone, because the low-FOV pairs are simultaneously the most appearance-divergent and only four pairs sit below area ratio 0.05. We therefore constructed a controlled FOV ladder (Fig. 1b). For every base-matchable pair (direct mean ED &lt; 20 px; 36–40 pairs per backbone) we cropped the target to absolute area ratios {0.5, 0.25, 0.1, 0.05, 0.02}, holding appearance, modality gap, and pixel sizes fixed while sweeping FOV. All GT is kept for evaluation, so out-of-crop points test the global transform’s extrapolation. With scale thus isolated (Fig. 5):</w:t>
       </w:r>
     </w:p>
     <w:p>
@@ -1114,13 +1101,13 @@
           <w:b/>
           <w:bCs/>
         </w:rPr>
-        <w:t xml:space="preserve">With scale isolated, the wrapper delivers exactly what it was designed for.</w:t>
-      </w:r>
-      <w:r>
-        <w:t xml:space="preserve"> </w:t>
-      </w:r>
-      <w:r>
-        <w:t xml:space="preserve">At FOV 0.1, MatchAnything-RoMa with pyramid v2 holds SR@10 0.23 versus 0.07 direct — +0.150, 95 % CI [+0.050, +0.275],</w:t>
+        <w:t xml:space="preserve">With scale isolated, the wrapper does what it was designed to do.</w:t>
+      </w:r>
+      <w:r>
+        <w:t xml:space="preserve"> </w:t>
+      </w:r>
+      <w:r>
+        <w:t xml:space="preserve">At FOV 0.1, MatchAnything-RoMa with pyramid v2 holds SR@10 0.23 against 0.07 direct, a gain of +0.150 (95 % CI [+0.050, +0.275],</w:t>
       </w:r>
       <w:r>
         <w:t xml:space="preserve"> </w:t>
@@ -1136,7 +1123,7 @@
         <w:t xml:space="preserve"> </w:t>
       </w:r>
       <w:r>
-        <w:t xml:space="preserve">= 0.0014, a more-than-threefold relative gain in precisely the regime H1 targeted.</w:t>
+        <w:t xml:space="preserve">= 0.0014) and a more-than-threefold relative improvement in the regime H1 targeted.</w:t>
       </w:r>
     </w:p>
     <w:p>
@@ -1144,7 +1131,7 @@
         <w:pStyle w:val="FirstParagraph"/>
       </w:pPr>
       <w:r>
-        <w:t xml:space="preserve">This resolves the project’s central tension. The wrapper mechanism is sound for scale; the usable-FOV envelope extends from ~0.25 (direct) to ~0.1 (wrapped, strong backbone). H1-as-stated remains rejected on real pairs only because the real distribution never isolates scale as the failure mode — the severe-FOV pairs fail on appearance first, and no scale wrapper can touch that. Figure 4 shows the per-backbone FOV breakdown on the native (uncropped) pairs for comparison.</w:t>
+        <w:t xml:space="preserve">This resolves the project’s central tension. The wrapper mechanism is sound for scale, and the usable-FOV envelope extends from about 0.25 (direct) to about 0.1 (wrapped, strong backbone). H1 as stated remains rejected on real pairs, but only because the real distribution never isolates scale as the failure mode: the severe-FOV pairs fail on appearance first, and no scale wrapper can touch that. Figure 4 shows the per-backbone FOV breakdown on the native (uncropped) pairs for comparison.</w:t>
       </w:r>
     </w:p>
     <w:bookmarkEnd w:id="15"/>
@@ -1162,7 +1149,7 @@
         <w:pStyle w:val="FirstParagraph"/>
       </w:pPr>
       <w:r>
-        <w:t xml:space="preserve">The sections above leave appearance as the dominant constraint and name materials-domain fine-tuning as the credible path. We tested it directly. A scene-level 131/28/28 train/val/test split prevents leakage (within-scene pairs share images, so a pair-level split would leak); all headline numbers are the 28 test pairs only, with validation driving model selection and test touched once. Fine-tuning is decoder-only — the VGG+DINOv2 encoder is frozen in evaluation mode so its normalisation statistics cannot drift — training ~100M decoder parameters on densified sparse GT (sparse correspondences splined into a dense A→B warp, supervised inside the GT-support region) with FOV-crop and photometric augmentation. Selection by median validation ED chose an early checkpoint (validation median 17.6 vs. 21.7 px zero-shot).</w:t>
+        <w:t xml:space="preserve">The sections above leave appearance as the dominant constraint and name materials-domain fine-tuning as the credible path, so we tested it directly. A scene-level 131/28/28 train/val/test split prevents leakage, because within-scene pairs share images and a pair-level split would leak. All headline numbers come from the 28 test pairs only, with validation driving model selection and the test set touched once. Fine-tuning is decoder-only: the VGG+DINOv2 encoder is frozen in evaluation mode so that its normalisation statistics cannot drift, and ~100M decoder parameters are trained on densified sparse GT (sparse correspondences splined into a dense A→B warp, supervised inside the GT-support region) with FOV-crop and photometric augmentation. Selection by median validation ED chose an early checkpoint (validation median 17.6 vs. 21.7 px zero-shot).</w:t>
       </w:r>
     </w:p>
     <w:p>
@@ -1170,7 +1157,7 @@
         <w:pStyle w:val="BodyText"/>
       </w:pPr>
       <w:r>
-        <w:t xml:space="preserve">The aggregate test result (Table 2) hides two opposite effects that a per-subclass cut separates.</w:t>
+        <w:t xml:space="preserve">The aggregate test result (Table 2) hides two opposite effects that a per-subclass cut separates. In-distribution, fine-tuning works hard: the 16 TEM dislocation test pairs (50 TEM pairs in training) improved median ED from 320.8 to 61.8 px, a 5.2× reduction and the single largest metric movement we saw, although the improvement runs mostly from ~320 to ~60 px and so stays above the 20 px bar, where SR barely registers it. Off-distribution, the model forgets badly: the C103 SEM-SE↔LOM-height subclass has zero training pairs and exists only in val/test; zero-shot MatchAnything-RoMa solved all four test pairs (7–16 px), whereas the fine-tuned decoder broke three of them outright (109/375/953 px). Those four pairs account for the</w:t>
       </w:r>
       <w:r>
         <w:t xml:space="preserve"> </w:t>
@@ -1180,10 +1167,13 @@
           <w:i/>
           <w:iCs/>
         </w:rPr>
-        <w:t xml:space="preserve">In-distribution, fine-tuning works hard</w:t>
-      </w:r>
-      <w:r>
-        <w:t xml:space="preserve">: the 16 TEM dislocation test pairs (50 TEM pairs in training) improved median ED from 320.8 to 61.8 px — a 5.2× reduction and the single largest metric movement in the study — though mostly from ~320 to ~60 px, still above the 20 px bar, so SR barely registers it.</w:t>
+        <w:t xml:space="preserve">entire</w:t>
+      </w:r>
+      <w:r>
+        <w:t xml:space="preserve"> </w:t>
+      </w:r>
+      <w:r>
+        <w:t xml:space="preserve">SR@20 regression (0.393 → 0.250, CI [−0.286, −0.036]). With only two C103 pairs in validation, a median selection metric could not see the damage. A FOV-ladder analysis on the fine-tuned backbone (same 63-pair testbed) confirms that the direction is right but partly redundant with the wrapper. Fine-tuning helps the moderate-FOV regime, holding SR@10 0.37–0.39 at rung 0.25 against 0.28–0.30 for the zero-shot model, and the pyramid still adds a significant but roughly halved scale lift at the severe 0.1 rung (+0.078, CI [+0.020, +0.157],</w:t>
       </w:r>
       <w:r>
         <w:t xml:space="preserve"> </w:t>
@@ -1193,42 +1183,13 @@
           <w:i/>
           <w:iCs/>
         </w:rPr>
-        <w:t xml:space="preserve">Off-distribution, it forgets catastrophically</w:t>
-      </w:r>
-      <w:r>
-        <w:t xml:space="preserve">: the C103 SEM-SE↔LOM-height subclass has zero training pairs (it exists only in val/test); zero-shot MatchAnything-RoMa solved all four test pairs (7–16 px), whereas the fine-tuned decoder broke three outright (109/375/953 px). Those four pairs are the</w:t>
-      </w:r>
-      <w:r>
-        <w:t xml:space="preserve"> </w:t>
-      </w:r>
-      <w:r>
-        <w:rPr>
-          <w:i/>
-          <w:iCs/>
-        </w:rPr>
-        <w:t xml:space="preserve">entire</w:t>
-      </w:r>
-      <w:r>
-        <w:t xml:space="preserve"> </w:t>
-      </w:r>
-      <w:r>
-        <w:t xml:space="preserve">SR@20 regression (0.393 → 0.250, CI [−0.286, −0.036]). With only two C103 pairs in validation, a median selection metric could not see the damage. A FOV-ladder analysis on the fine-tuned backbone (same 63-pair testbed) confirms the direction is right but partly redundant with the wrapper: fine-tuning helps the moderate-FOV regime (at rung 0.25 it holds SR@10 0.37–0.39 vs. 0.28–0.30), and the pyramid still adds a significant but roughly halved scale lift at the severe 0.1 rung (+0.078, CI [+0.020, +0.157],</w:t>
-      </w:r>
-      <w:r>
-        <w:t xml:space="preserve"> </w:t>
-      </w:r>
-      <w:r>
-        <w:rPr>
-          <w:i/>
-          <w:iCs/>
-        </w:rPr>
         <w:t xml:space="preserve">p</w:t>
       </w:r>
       <w:r>
         <w:t xml:space="preserve"> </w:t>
       </w:r>
       <w:r>
-        <w:t xml:space="preserve">= 0.0154, vs. +0.150 on stock MatchAnything-RoMa) — fine-tuning and the wrapper address overlapping scale/appearance failures, so they do not fully stack.</w:t>
+        <w:t xml:space="preserve">= 0.0154, against +0.150 on stock MatchAnything-RoMa). Fine-tuning and the wrapper address overlapping scale and appearance failures, so they do not fully stack.</w:t>
       </w:r>
     </w:p>
     <w:p>
@@ -1488,7 +1449,7 @@
         <w:pStyle w:val="FirstParagraph"/>
       </w:pPr>
       <w:r>
-        <w:t xml:space="preserve">The forgetting is the only thing standing between this fine-tune and a net-positive intervention, so we tested the lightest-touch mitigation: L2-SP weight anchoring [12]. The identical decoder-only recipe gains a single penalty (λ/2)‖θ_dec − θ_dec⁰‖² pulling the decoder back toward its zero-shot initialisation — no replay corpus, no architecture change, no extra parameters. We swept λ ∈ {0, 0.01, 0.1, 1.0} (λ = 0 reproduces the plain fine-tune), selecting the step per run by minimum validation median ED and the λ by held-out</w:t>
+        <w:t xml:space="preserve">The forgetting is the only thing standing between this fine-tune and a net-positive intervention, so we tested the lightest-touch mitigation, L2-SP weight anchoring [12]. The identical decoder-only recipe gains a single penalty (λ/2)‖θ_dec − θ_dec⁰‖² that pulls the decoder back toward its zero-shot initialisation, with no replay corpus, no architecture change, and no extra parameters. We swept λ ∈ {0, 0.01, 0.1, 1.0}, where λ = 0 reproduces the plain fine-tune, selecting the step per run by minimum validation median ED and the λ by held-out</w:t>
       </w:r>
       <w:r>
         <w:t xml:space="preserve"> </w:t>
@@ -1501,7 +1462,7 @@
         <w:t xml:space="preserve">test</w:t>
       </w:r>
       <w:r>
-        <w:t xml:space="preserve">-split retention (validation cannot see the C103 damage).</w:t>
+        <w:t xml:space="preserve">-split retention, because validation cannot see the C103 damage.</w:t>
       </w:r>
     </w:p>
     <w:p>
@@ -1509,7 +1470,7 @@
         <w:pStyle w:val="BodyText"/>
       </w:pPr>
       <w:r>
-        <w:t xml:space="preserve">A light anchor wins. At λ = 0.01, the recoverable C103 scene — the modality the plain fine-tune broke — drops from 80/1220 px back to 16/24 px, near zero-shot’s ~12 px; one C103 scene stays broken at every λ, an unrecoverable modality combination rather than an anchor failure. Heavier anchoring (λ = 0.1, 1.0) buys no further retention and costs both in-distribution gain and training stability (the certainty head decalibrates into transient all-fail validation epochs whose onset moves earlier as λ grows). Table 3 reports the headline. Against the plain fine-tune, L2-SP λ = 0.01 improves median ED by 15.6 px (CI [−49.8, −2.4],</w:t>
+        <w:t xml:space="preserve">A light anchor wins. At λ = 0.01, the recoverable C103 scene, the modality the plain fine-tune broke, drops from 80/1220 px back to 16/24 px, close to zero-shot’s ~12 px; the other C103 scene stays broken at every λ, which marks an unrecoverable modality combination rather than an anchor failure. Heavier anchoring (λ = 0.1, 1.0) buys no further retention and costs both in-distribution gain and training stability, as the certainty head decalibrates into transient all-fail validation epochs whose onset moves earlier as λ grows. Table 3 reports the headline. Against the plain fine-tune, L2-SP λ = 0.01 improves median ED by 15.6 px (CI [−49.8, −2.4],</w:t>
       </w:r>
       <w:r>
         <w:t xml:space="preserve"> </w:t>
@@ -1525,7 +1486,7 @@
         <w:t xml:space="preserve"> </w:t>
       </w:r>
       <w:r>
-        <w:t xml:space="preserve">= 0.0046); against zero-shot, the SR@20 deficit shrinks to −0.071 (CI [−0.214, +0.071],</w:t>
+        <w:t xml:space="preserve">= 0.0046). Against zero-shot, the SR@20 deficit shrinks to −0.071 (CI [−0.214, +0.071],</w:t>
       </w:r>
       <w:r>
         <w:t xml:space="preserve"> </w:t>
@@ -1541,7 +1502,7 @@
         <w:t xml:space="preserve"> </w:t>
       </w:r>
       <w:r>
-        <w:t xml:space="preserve">= 0.91): the regression is no longer statistically detectable, though with only 28 test pairs this is a low-power null and should be read as</w:t>
+        <w:t xml:space="preserve">= 0.91), so the regression is no longer statistically detectable. With only 28 test pairs this is a low-power null, and it should be read as</w:t>
       </w:r>
       <w:r>
         <w:t xml:space="preserve"> </w:t>
@@ -1553,7 +1514,7 @@
         <w:t xml:space="preserve"> </w:t>
       </w:r>
       <w:r>
-        <w:t xml:space="preserve">rather than as proven equivalence (an equivalence test on a larger held-out set is planned). This minimal mitigation converts the net regression into a net-neutral-to-positive fine-tune, and the wrapper still stacks on top (direct SR@20 0.286 → pyramid 0.321). One important caveat bounds the claim: one of the two held-out off-distribution C103 scenes remains unrecoverable at every λ, so forgetting is mitigated but not eliminated. We therefore treat L2-SP as a deliberately zero-cost lower bound on forgetting mitigation rather than a complete solution, and expect stronger continual-learning methods — experience replay, elastic weight consolidation [14], or LoRA-style low-rank updates [13] — to improve on it; quantifying that is left to future work. Lifting SR@20</w:t>
+        <w:t xml:space="preserve">rather than as proven equivalence; an equivalence test on a larger held-out set is planned. This minimal mitigation converts the net regression into a net-neutral-to-positive fine-tune, and the wrapper still stacks on top (direct SR@20 0.286 against pyramid 0.321). One caveat bounds the claim: one of the two held-out off-distribution C103 scenes stays unrecoverable at every λ, so forgetting is mitigated but not eliminated. We therefore treat L2-SP as a deliberately zero-cost lower bound on forgetting mitigation rather than a complete solution, and we expect stronger continual-learning methods such as experience replay, elastic weight consolidation [14], or LoRA-style low-rank updates [13] to improve on it; quantifying that is left to future work. Lifting SR@20</w:t>
       </w:r>
       <w:r>
         <w:t xml:space="preserve"> </w:t>
@@ -1569,7 +1530,7 @@
         <w:t xml:space="preserve"> </w:t>
       </w:r>
       <w:r>
-        <w:t xml:space="preserve">zero-shot additionally requires closing the unrecoverable-modality gap, which needs training coverage of that modality combination rather than a better optimiser.</w:t>
+        <w:t xml:space="preserve">zero-shot additionally requires closing the unrecoverable-modality gap, which needs training coverage of that modality combination and not a better optimiser.</w:t>
       </w:r>
     </w:p>
     <w:p>
@@ -1905,7 +1866,7 @@
         <w:t xml:space="preserve"> </w:t>
       </w:r>
       <w:r>
-        <w:t xml:space="preserve">(pyramid ≥ 35 % gain at FOV ≤ 5 %):</w:t>
+        <w:t xml:space="preserve">(pyramid ≥ 35 % gain at FOV ≤ 5 %) is</w:t>
       </w:r>
       <w:r>
         <w:t xml:space="preserve"> </w:t>
@@ -1921,7 +1882,7 @@
         <w:t xml:space="preserve"> </w:t>
       </w:r>
       <w:r>
-        <w:t xml:space="preserve">on real pairs — severe-FOV success is zero for every configuration because those pairs fail on appearance, not scale — but the wrapper mechanism is independently</w:t>
+        <w:t xml:space="preserve">on real pairs, because severe-FOV success is zero for every configuration and those pairs fail on appearance rather than scale; the wrapper mechanism is nonetheless</w:t>
       </w:r>
       <w:r>
         <w:t xml:space="preserve"> </w:t>
@@ -1937,7 +1898,7 @@
         <w:t xml:space="preserve"> </w:t>
       </w:r>
       <w:r>
-        <w:t xml:space="preserve">by the controlled FOV ladder.</w:t>
+        <w:t xml:space="preserve">independently by the controlled FOV ladder.</w:t>
       </w:r>
       <w:r>
         <w:t xml:space="preserve"> </w:t>
@@ -1953,7 +1914,7 @@
         <w:t xml:space="preserve"> </w:t>
       </w:r>
       <w:r>
-        <w:t xml:space="preserve">(RoMa beats the ELoFTR family at low FOV):</w:t>
+        <w:t xml:space="preserve">(RoMa beats the ELoFTR family at low FOV) is</w:t>
       </w:r>
       <w:r>
         <w:t xml:space="preserve"> </w:t>
@@ -1982,7 +1943,7 @@
         <w:t xml:space="preserve"> </w:t>
       </w:r>
       <w:r>
-        <w:t xml:space="preserve">(affine sufficient vs. homography):</w:t>
+        <w:t xml:space="preserve">(affine sufficient vs. homography) is</w:t>
       </w:r>
       <w:r>
         <w:t xml:space="preserve"> </w:t>
@@ -1995,10 +1956,7 @@
         <w:t xml:space="preserve">mostly supported</w:t>
       </w:r>
       <w:r>
-        <w:t xml:space="preserve"> </w:t>
-      </w:r>
-      <w:r>
-        <w:t xml:space="preserve">— the BIC selector picks affine on 69 % of well-registered pairs, with homography winning the remaining 31 %, so automatic selection rather than a hard affine restriction is the correct protocol.</w:t>
+        <w:t xml:space="preserve">: the BIC selector picks affine on 69 % of well-registered pairs and homography on the remaining 31 %, so the correct protocol is automatic selection rather than a hard affine restriction.</w:t>
       </w:r>
     </w:p>
     <w:bookmarkEnd w:id="18"/>
@@ -2033,7 +1991,7 @@
         <w:t xml:space="preserve"> </w:t>
       </w:r>
       <w:r>
-        <w:t xml:space="preserve">(cross-modal-trained MatchAnything-RoMa), and that gain lived entirely among high-FOV, nearly-matchable pairs. Second, a scale-only wrapper that triples success when scale is isolated experimentally moves real severe-FOV pairs almost not at all, because in the real distribution low FOV and high appearance divergence are confounded. Third, attacking appearance directly with domain fine-tuning produced the single largest error reduction we observed (5.2× on in-distribution TEM). The pyramid solves a problem these pairs mostly do not have and cannot touch the one they do.</w:t>
+        <w:t xml:space="preserve">(cross-modal-trained MatchAnything-RoMa), and that gain lived entirely among high-FOV, nearly-matchable pairs. Second, a scale-only wrapper that triples success when scale is isolated experimentally moves real severe-FOV pairs almost not at all, because in the real distribution low FOV and high appearance divergence are confounded. Third, attacking appearance directly with domain fine-tuning produced the single largest error reduction we observed (5.2× on in-distribution TEM). The pyramid solves a problem these pairs mostly do not have, and it cannot touch the one they do.</w:t>
       </w:r>
     </w:p>
     <w:p>
@@ -2041,7 +1999,7 @@
         <w:pStyle w:val="BodyText"/>
       </w:pPr>
       <w:r>
-        <w:t xml:space="preserve">We are deliberately careful about the asymmetry in this evidence. Scale is decoupled by a direct, controlled experiment (the FOV ladder); appearance is implicated by elimination rather than by an equivalent</w:t>
+        <w:t xml:space="preserve">We are deliberately careful about the asymmetry in this evidence. Scale is decoupled by a direct, controlled experiment, the FOV ladder. Appearance is implicated by elimination rather than by an equivalent</w:t>
       </w:r>
       <w:r>
         <w:t xml:space="preserve"> </w:t>
@@ -2053,7 +2011,7 @@
         <w:t xml:space="preserve"> </w:t>
       </w:r>
       <w:r>
-        <w:t xml:space="preserve">manipulation, and the FOV ladder itself runs only on base-matchable pairs — those already selected to have tractable appearance. The appearance conclusion is therefore weaker than the scale conclusion, and we present it as the dominant</w:t>
+        <w:t xml:space="preserve">manipulation, and the FOV ladder itself runs only on base-matchable pairs, which are already selected to have tractable appearance. The appearance conclusion is therefore weaker than the scale conclusion, and we present it as the dominant</w:t>
       </w:r>
       <w:r>
         <w:t xml:space="preserve"> </w:t>
@@ -2069,7 +2027,7 @@
         <w:t xml:space="preserve"> </w:t>
       </w:r>
       <w:r>
-        <w:t xml:space="preserve">factor on AmalgaMatch rather than as a demonstrated law of cross-modal microscopy. A controlled appearance sweep (for example, holding geometry fixed while degrading mutual information) is the natural complement to the FOV ladder and is left to future work.</w:t>
+        <w:t xml:space="preserve">factor on AmalgaMatch rather than as a demonstrated law of cross-modal microscopy. A controlled appearance sweep, for example holding geometry fixed while degrading mutual information, is the natural complement to the FOV ladder and is left to future work.</w:t>
       </w:r>
     </w:p>
     <w:p>
@@ -2100,7 +2058,7 @@
         <w:t xml:space="preserve"> </w:t>
       </w:r>
       <w:r>
-        <w:t xml:space="preserve">pipeline unchanged. (ii) Fit transforms with automatic affine-vs-homography selection rather than a hard affine restriction (affine wins 69 % of pairs, homography the rest). (iii) Add a forgetting-robust decoder-only domain fine-tune when in-domain data exists — in our setup ~100M decoder parameters, AdamW for 1500 steps, ~90 min on a single RTX 5090, a 445 MB checkpoint — with an L2-SP anchor at λ = 0.01 so that untrained modality combinations are not lost. (iv) Apply the verified wrapper only for genuinely multiscale tasks, where it adds a real scale lift without regressing the rest. A practical caveat on coverage: the fine-tune’s benefit is confined to modality combinations represented in training (here TEM dislocation imaging and several EBSD subclasses); combinations absent from training (the C103 SEM-SE↔LOM-height case) should be run with the zero-shot backbone, or the fine-tune re-trained with that combination included, until coverage is broadened.</w:t>
+        <w:t xml:space="preserve">pipeline unchanged. (ii) Fit transforms with automatic affine-vs-homography selection rather than a hard affine restriction (affine wins 69 % of pairs, homography the rest). (iii) Add a forgetting-robust decoder-only domain fine-tune when in-domain data exists; in our setup this is ~100M decoder parameters, AdamW for 1500 steps, about 90 min on a single RTX 5090, and a 445 MB checkpoint, with an L2-SP anchor at λ = 0.01 so that untrained modality combinations are not lost. (iv) Apply the verified wrapper only for genuinely multiscale tasks, where it adds a real scale lift without regressing the rest. A practical caveat on coverage: the fine-tune’s benefit is confined to modality combinations represented in training (here TEM dislocation imaging and several EBSD subclasses), and combinations absent from training (the C103 SEM-SE↔LOM-height case) should be run with the zero-shot backbone, or the fine-tune re-trained with that combination included, until coverage is broadened.</w:t>
       </w:r>
     </w:p>
     <w:p>
@@ -2108,7 +2066,7 @@
         <w:pStyle w:val="BodyText"/>
       </w:pPr>
       <w:r>
-        <w:t xml:space="preserve">Several limitations bound these claims. The mutual-information verifier cannot rank transforms within ~10 px of one another, which both caps the wrapper’s benefit on strong backbones and prevents the iterated-zoom machinery from paying off; a learned or GT-free residual verifier is the obvious next lever. The ~10.3 px GT affine residual floors all px-threshold metrics, so AmalgaMatch cannot certify sub-5 px registration and our SR@5 numbers should be read with that floor in mind. The FOV ladder, while it cleanly isolates scale, crops real targets rather than acquiring genuinely low-FOV images, so it does not reproduce the texture, detector-noise, and resolution differences of native low-FOV acquisition; its wrapper gains should be read as a controlled lower bound on the mechanism, not as a literal forecast for natively low-FOV pairs. The headline fine-tuning and L2-SP numbers rest on single training runs and a 28-pair test split, with the SR@20 regression driven by four pairs; the four near-threshold wrapper swaps point the same way. Multi-seed variance on the fine-tuning and L2-SP tables, a formal equivalence test on a larger held-out set, and at least one stronger continual-learning baseline (LoRA-style low-rank adaptation) are planned and not yet run, and we flag the single-run results accordingly. Finally, the fine-tuning study rests on 131 training pairs over 12 subclasses; L2-SP closes the forgetting half of the data-budget problem, but the unrecoverable C103 scene — broken at every anchor strength — shows that breadth of modality coverage, not optimisation, is the remaining bottleneck. The concrete next experiment is to add training pairs in that modality combination and re-evaluate on the same held-out split and FOV ladder used here. We expect a forgetting-robust fine-tune over broad modality coverage, with the verified wrapper reserved for multiscale tasks, to be the deployable configuration for cross-modal microscopy registration.</w:t>
+        <w:t xml:space="preserve">Several limitations bound these claims. The mutual-information verifier cannot rank transforms within ~10 px of one another, which both caps the wrapper’s benefit on strong backbones and prevents the iterated-zoom machinery from paying off; a learned or GT-free residual verifier is the obvious next lever. The ~10.3 px GT affine residual floors all px-threshold metrics, so AmalgaMatch cannot certify sub-5 px registration and our SR@5 numbers should be read with that floor in mind. The FOV ladder cleanly isolates scale, but it crops real targets rather than acquiring genuinely low-FOV images, so it does not reproduce the texture, detector-noise, and resolution differences of native low-FOV acquisition; its wrapper gains should be read as a controlled lower bound on the mechanism, not as a literal forecast for natively low-FOV pairs. The headline fine-tuning and L2-SP numbers rest on single training runs and a 28-pair test split, with the SR@20 regression driven by four pairs, and the four near-threshold wrapper swaps point the same way. Multi-seed variance on the fine-tuning and L2-SP tables, a formal equivalence test on a larger held-out set, and at least one stronger continual-learning baseline (LoRA-style low-rank adaptation) are planned and not yet run, and we flag the single-run results accordingly. Finally, the fine-tuning study rests on 131 training pairs over 12 subclasses; L2-SP closes the forgetting half of the data-budget problem, but the unrecoverable C103 scene, broken at every anchor strength, shows that breadth of modality coverage rather than optimisation is the remaining bottleneck. The concrete next experiment is to add training pairs in that modality combination and re-evaluate on the same held-out split and FOV ladder used here. We expect a forgetting-robust fine-tune over broad modality coverage, with the verified wrapper reserved for multiscale tasks, to be the deployable configuration for cross-modal microscopy registration.</w:t>
       </w:r>
     </w:p>
     <w:bookmarkEnd w:id="20"/>
@@ -3069,7 +3027,7 @@
         <w:t xml:space="preserve"> </w:t>
       </w:r>
       <w:r>
-        <w:t xml:space="preserve">Method overview — (a) verified coarse-to-fine wrapper (pyramid v2); (b) FOV-ladder protocol.</w:t>
+        <w:t xml:space="preserve">Method overview. (a) Verified coarse-to-fine wrapper (pyramid v2); (b) FOV-ladder protocol.</w:t>
       </w:r>
     </w:p>
     <w:p>

</xml_diff>

<commit_message>
paper: fold 3-seed fine-tune/L2-SP variance into Tables 2-3; temper L2-SP claims
Multi-seed run (3 seeds x {plain, L2-SP}) on RTX 5090 shows plain ft and L2-SP are
statistically indistinguishable on the 28-pair test; single-run SR@10 (0.25) was an
optimistic draw vs 3-seed mean 0.095+/-0.021. Robust finding: one C103 modality
combination is unrecoverable at every seed/anchor (coverage gap, not optimizer).
Reframes L2-SP as a zero-cost floor; flips the multi-seed 'not yet run' caveat.
</commit_message>
<xml_diff>
--- a/paper/paper.docx
+++ b/paper/paper.docx
@@ -126,20 +126,7 @@
         <w:t xml:space="preserve"> </w:t>
       </w:r>
       <w:r>
-        <w:t xml:space="preserve">= 0.0014). The scale mechanism is therefore sound, and the real distribution simply never presents scale as the isolated failure mode. Decoder-only fine-tuning of MatchAnything-RoMa on 131 held-out-split training pairs then cut median error on in-distribution TEM pairs 5.2× (321 → 62 px), but it regressed overall SR@20 (0.393 → 0.250) by forgetting a modality absent from training. A one-line L2-SP weight anchor returns SR@20 to a level no longer distinguishable from zero-shot (</w:t>
-      </w:r>
-      <w:r>
-        <w:rPr>
-          <w:i/>
-          <w:iCs/>
-        </w:rPr>
-        <w:t xml:space="preserve">p</w:t>
-      </w:r>
-      <w:r>
-        <w:t xml:space="preserve"> </w:t>
-      </w:r>
-      <w:r>
-        <w:t xml:space="preserve">= 0.91, a null limited by the 28-pair test rather than proven equivalence) while sharpening median error. Deployable cross-modal microscopy registration therefore needs a forgetting-robust domain fine-tune over broad modality coverage, with the verified pyramid wrapper as a complementary scale layer for genuinely multiscale tasks. Because the appearance conclusion is reached by elimination rather than by an appearance-swept experiment, we present it as the dominant factor on AmalgaMatch and not as a property of cross-modal microscopy in general.</w:t>
+        <w:t xml:space="preserve">= 0.0014). The scale mechanism is therefore sound, and the real distribution simply never presents scale as the isolated failure mode. Decoder-only fine-tuning of MatchAnything-RoMa on 131 held-out-split training pairs then cut median error on in-distribution TEM pairs about 5× (~321 → 62 px), but across three training seeds it regressed overall SR@20 modestly (0.393 → 0.30 ± 0.04) by forgetting modality combinations absent from training. A one-line L2-SP weight anchor does not change this within seed variance, so we report it as a zero-cost floor rather than a fix; the one seed-robust forgetting effect is a single modality combination that no anchor recovers, which points to breadth of training coverage rather than the optimiser as the remaining bottleneck. Deployable cross-modal microscopy registration therefore needs a forgetting-robust domain fine-tune over broad modality coverage, with the verified pyramid wrapper as a complementary scale layer for genuinely multiscale tasks. Because the appearance conclusion is reached by elimination rather than by an appearance-swept experiment, we present it as the dominant factor on AmalgaMatch and not as a property of cross-modal microscopy in general.</w:t>
       </w:r>
     </w:p>
     <w:p>
@@ -236,7 +223,7 @@
         <w:pStyle w:val="BodyText"/>
       </w:pPr>
       <w:r>
-        <w:t xml:space="preserve">Here we test these hypotheses end-to-end on all 187 AmalgaMatch pairs, with controls, ablations, and a controlled decoupling experiment, and the result is as much diagnostic as methodological. The naive pyramid does not merely fail to help. It destroys the matchers it wraps, for a structural reason we trace to the fact that dense matchers never abstain. A redesigned verified coarse-to-fine wrapper recovers a small, real gain, but it cannot reach the severe-FOV regime. The single largest off-the-shelf lever turns out to be the backbone rather than the wrapper. A controlled FOV ladder then separates scale from appearance on real pairs and shows that the wrapper mechanism is in fact sound for scale; the real benchmark simply never presents scale as the isolated failure mode, because the low-FOV pairs are also the most appearance-divergent. Finally we attack appearance directly with materials-domain fine-tuning, observe catastrophic forgetting, and show that a one-line weight anchor largely removes it. The contributions are four. First, a mechanistic account of why pyramidal wrappers break non-abstaining dense matchers, together with a verified coarse-to-fine wrapper that does not. Second, a controlled FOV-ladder protocol that decouples scale from appearance and validates the wrapper’s scale mechanism. Third, evidence that cross-modal appearance, not FOV, is the dominant constraint on this benchmark. Fourth, a forgetting-robust decoder-only fine-tuning recipe for cross-modal microscopy matching.</w:t>
+        <w:t xml:space="preserve">Here we test these hypotheses end-to-end on all 187 AmalgaMatch pairs, with controls, ablations, and a controlled decoupling experiment, and the result is as much diagnostic as methodological. The naive pyramid does not merely fail to help. It destroys the matchers it wraps, for a structural reason we trace to the fact that dense matchers never abstain. A redesigned verified coarse-to-fine wrapper recovers a small, real gain, but it cannot reach the severe-FOV regime. The single largest off-the-shelf lever turns out to be the backbone rather than the wrapper. A controlled FOV ladder then separates scale from appearance on real pairs and shows that the wrapper mechanism is in fact sound for scale; the real benchmark simply never presents scale as the isolated failure mode, because the low-FOV pairs are also the most appearance-divergent. Finally we attack appearance directly with materials-domain fine-tuning, observe forgetting of untrained modality combinations, and use a three-seed study to separate what a one-line weight anchor can and cannot fix. The contributions are four. First, a mechanistic account of why pyramidal wrappers break non-abstaining dense matchers, together with a verified coarse-to-fine wrapper that does not. Second, a controlled FOV-ladder protocol that decouples scale from appearance and validates the wrapper’s scale mechanism. Third, evidence that cross-modal appearance, not FOV, is the dominant constraint on this benchmark. Fourth, a decoder-only fine-tuning recipe for cross-modal microscopy matching with a three-seed robustness analysis, which shows that breadth of modality coverage, not the choice of optimiser or weight anchor, is the binding constraint on forgetting.</w:t>
       </w:r>
     </w:p>
     <w:bookmarkEnd w:id="10"/>
@@ -1157,7 +1144,19 @@
         <w:pStyle w:val="BodyText"/>
       </w:pPr>
       <w:r>
-        <w:t xml:space="preserve">The aggregate test result (Table 2) hides two opposite effects that a per-subclass cut separates. In-distribution, fine-tuning works hard: the 16 TEM dislocation test pairs (50 TEM pairs in training) improved median ED from 320.8 to 61.8 px, a 5.2× reduction and the single largest metric movement we saw, although the improvement runs mostly from ~320 to ~60 px and so stays above the 20 px bar, where SR barely registers it. Off-distribution, the model forgets badly: the C103 SEM-SE↔LOM-height subclass has zero training pairs and exists only in val/test; zero-shot MatchAnything-RoMa solved all four test pairs (7–16 px), whereas the fine-tuned decoder broke three of them outright (109/375/953 px). Those four pairs account for the</w:t>
+        <w:t xml:space="preserve">The aggregate test result (Table 2) hides two opposite effects that a per-subclass cut separates. In-distribution, fine-tuning works hard: the 16 TEM dislocation test pairs (50 TEM pairs in training) improved median ED from 320.8 to 61.8 px, a 5.2× reduction and the single largest metric movement we saw, although the improvement runs mostly from ~320 to ~60 px and so stays above the 20 px bar, where SR barely registers it. Off-distribution, the model forgets: the C103 SEM-SE↔LOM-height subclass has zero training pairs and exists only in val/test, so it probes catastrophic forgetting directly. This subclass holds two scenes (two test pairs each). Across three training seeds the second scene is unrecoverable in every run, plain or anchored (residual 370–1400 px against a ~12 px zero-shot baseline), which marks a genuine modality-coverage gap rather than an optimisation failure. The first scene is more fragile than seed-stable: the plain fine-tune retains it across all three seeds (≤31 px), but it is exactly this scene that the originally reported single run (seed 0) broke (80/1220 px), so the headline</w:t>
+      </w:r>
+      <w:r>
+        <w:t xml:space="preserve"> </w:t>
+      </w:r>
+      <w:r>
+        <w:t xml:space="preserve">“catastrophic forgetting”</w:t>
+      </w:r>
+      <w:r>
+        <w:t xml:space="preserve"> </w:t>
+      </w:r>
+      <w:r>
+        <w:t xml:space="preserve">of the recoverable scene is itself a seed-dependent event. What is seed-robust is the unrecoverable second scene and the resulting modest SR@20 regression relative to zero-shot (0.393 → 0.30 ± 0.04 over three seeds); with only two C103 pairs in validation, a median selection metric cannot see this damage in any run. A FOV-ladder analysis on the fine-tuned backbone (same 63-pair testbed) confirms that the direction is right but partly redundant with the wrapper. Fine-tuning helps the moderate-FOV regime, holding SR@10 0.37–0.39 at rung 0.25 against 0.28–0.30 for the zero-shot model, and the pyramid still adds a significant but roughly halved scale lift at the severe 0.1 rung (+0.078, CI [+0.020, +0.157],</w:t>
       </w:r>
       <w:r>
         <w:t xml:space="preserve"> </w:t>
@@ -1167,22 +1166,6 @@
           <w:i/>
           <w:iCs/>
         </w:rPr>
-        <w:t xml:space="preserve">entire</w:t>
-      </w:r>
-      <w:r>
-        <w:t xml:space="preserve"> </w:t>
-      </w:r>
-      <w:r>
-        <w:t xml:space="preserve">SR@20 regression (0.393 → 0.250, CI [−0.286, −0.036]). With only two C103 pairs in validation, a median selection metric could not see the damage. A FOV-ladder analysis on the fine-tuned backbone (same 63-pair testbed) confirms that the direction is right but partly redundant with the wrapper. Fine-tuning helps the moderate-FOV regime, holding SR@10 0.37–0.39 at rung 0.25 against 0.28–0.30 for the zero-shot model, and the pyramid still adds a significant but roughly halved scale lift at the severe 0.1 rung (+0.078, CI [+0.020, +0.157],</w:t>
-      </w:r>
-      <w:r>
-        <w:t xml:space="preserve"> </w:t>
-      </w:r>
-      <w:r>
-        <w:rPr>
-          <w:i/>
-          <w:iCs/>
-        </w:rPr>
         <w:t xml:space="preserve">p</w:t>
       </w:r>
       <w:r>
@@ -1201,43 +1184,27 @@
           <w:b/>
           <w:bCs/>
         </w:rPr>
-        <w:t xml:space="preserve">Table 2. Decoder-only fine-tuning on the held-out 28-pair test split</w:t>
-      </w:r>
-      <w:r>
-        <w:t xml:space="preserve"> </w:t>
-      </w:r>
-      <w:r>
-        <w:t xml:space="preserve">(direct match, TPS-refined ED, paired bootstrap</w:t>
-      </w:r>
-      <w:r>
-        <w:t xml:space="preserve"> </w:t>
-      </w:r>
-      <w:r>
-        <w:rPr>
-          <w:i/>
-          <w:iCs/>
-        </w:rPr>
-        <w:t xml:space="preserve">B</w:t>
-      </w:r>
-      <w:r>
-        <w:t xml:space="preserve"> </w:t>
-      </w:r>
-      <w:r>
-        <w:t xml:space="preserve">= 10,000).</w:t>
+        <w:t xml:space="preserve">Table 2. Decoder-only fine-tuning on the held-out 28-pair test split: mean ± SD over three training seeds</w:t>
+      </w:r>
+      <w:r>
+        <w:t xml:space="preserve"> </w:t>
+      </w:r>
+      <w:r>
+        <w:t xml:space="preserve">(direct match, TPS-refined ED). Zero-shot is deterministic (single value); SR@5 ≈ 0 throughout (the ~10.3 px GT affine-residual floor) and is omitted.</w:t>
       </w:r>
     </w:p>
     <w:tbl>
       <w:tblPr>
         <w:tblStyle w:val="Table"/>
-        <w:tblW w:type="auto" w:w="0"/>
+        <w:tblW w:type="pct" w:w="5000"/>
+        <w:tblLayout w:type="fixed"/>
         <w:tblLook w:firstRow="1" w:lastRow="0" w:firstColumn="0" w:lastColumn="0" w:noHBand="0" w:noVBand="0" w:val="0020"/>
       </w:tblPr>
       <w:tblGrid>
         <w:gridCol w:w="1584"/>
-        <w:gridCol w:w="1584"/>
-        <w:gridCol w:w="1584"/>
-        <w:gridCol w:w="1584"/>
-        <w:gridCol w:w="1584"/>
+        <w:gridCol w:w="2112"/>
+        <w:gridCol w:w="2112"/>
+        <w:gridCol w:w="2112"/>
       </w:tblGrid>
       <w:tr>
         <w:trPr>
@@ -1250,19 +1217,7 @@
               <w:pStyle w:val="Compact"/>
             </w:pPr>
             <w:r>
-              <w:t xml:space="preserve">Method</w:t>
-            </w:r>
-          </w:p>
-        </w:tc>
-        <w:tc>
-          <w:tcPr/>
-          <w:p>
-            <w:pPr>
-              <w:pStyle w:val="Compact"/>
-              <w:jc w:val="right"/>
-            </w:pPr>
-            <w:r>
-              <w:t xml:space="preserve">SR@5</w:t>
+              <w:t xml:space="preserve">Method (direct match)</w:t>
             </w:r>
           </w:p>
         </w:tc>
@@ -1323,18 +1278,6 @@
               <w:jc w:val="right"/>
             </w:pPr>
             <w:r>
-              <w:t xml:space="preserve">0.000</w:t>
-            </w:r>
-          </w:p>
-        </w:tc>
-        <w:tc>
-          <w:tcPr/>
-          <w:p>
-            <w:pPr>
-              <w:pStyle w:val="Compact"/>
-              <w:jc w:val="right"/>
-            </w:pPr>
-            <w:r>
               <w:t xml:space="preserve">0.214</w:t>
             </w:r>
           </w:p>
@@ -1372,55 +1315,92 @@
               <w:pStyle w:val="Compact"/>
             </w:pPr>
             <w:r>
-              <w:t xml:space="preserve">MatchAnything-RoMa (fine-tuned)</w:t>
-            </w:r>
-          </w:p>
-        </w:tc>
-        <w:tc>
-          <w:tcPr/>
-          <w:p>
-            <w:pPr>
-              <w:pStyle w:val="Compact"/>
-              <w:jc w:val="right"/>
-            </w:pPr>
-            <w:r>
-              <w:t xml:space="preserve">0.000</w:t>
-            </w:r>
-          </w:p>
-        </w:tc>
-        <w:tc>
-          <w:tcPr/>
-          <w:p>
-            <w:pPr>
-              <w:pStyle w:val="Compact"/>
-              <w:jc w:val="right"/>
-            </w:pPr>
-            <w:r>
-              <w:t xml:space="preserve">0.250</w:t>
-            </w:r>
-          </w:p>
-        </w:tc>
-        <w:tc>
-          <w:tcPr/>
-          <w:p>
-            <w:pPr>
-              <w:pStyle w:val="Compact"/>
-              <w:jc w:val="right"/>
-            </w:pPr>
-            <w:r>
-              <w:t xml:space="preserve">0.250</w:t>
-            </w:r>
-          </w:p>
-        </w:tc>
-        <w:tc>
-          <w:tcPr/>
-          <w:p>
-            <w:pPr>
-              <w:pStyle w:val="Compact"/>
-              <w:jc w:val="right"/>
-            </w:pPr>
-            <w:r>
-              <w:t xml:space="preserve">51.6</w:t>
+              <w:t xml:space="preserve">MatchAnything-RoMa (plain fine-tune, λ = 0)</w:t>
+            </w:r>
+          </w:p>
+        </w:tc>
+        <w:tc>
+          <w:tcPr/>
+          <w:p>
+            <w:pPr>
+              <w:pStyle w:val="Compact"/>
+              <w:jc w:val="right"/>
+            </w:pPr>
+            <w:r>
+              <w:t xml:space="preserve">0.095 ± 0.021</w:t>
+            </w:r>
+          </w:p>
+        </w:tc>
+        <w:tc>
+          <w:tcPr/>
+          <w:p>
+            <w:pPr>
+              <w:pStyle w:val="Compact"/>
+              <w:jc w:val="right"/>
+            </w:pPr>
+            <w:r>
+              <w:t xml:space="preserve">0.298 ± 0.041</w:t>
+            </w:r>
+          </w:p>
+        </w:tc>
+        <w:tc>
+          <w:tcPr/>
+          <w:p>
+            <w:pPr>
+              <w:pStyle w:val="Compact"/>
+              <w:jc w:val="right"/>
+            </w:pPr>
+            <w:r>
+              <w:t xml:space="preserve">46.0 ± 3.9</w:t>
+            </w:r>
+          </w:p>
+        </w:tc>
+      </w:tr>
+      <w:tr>
+        <w:tc>
+          <w:tcPr/>
+          <w:p>
+            <w:pPr>
+              <w:pStyle w:val="Compact"/>
+            </w:pPr>
+            <w:r>
+              <w:t xml:space="preserve">MatchAnything-RoMa (L2-SP, λ = 0.01)</w:t>
+            </w:r>
+          </w:p>
+        </w:tc>
+        <w:tc>
+          <w:tcPr/>
+          <w:p>
+            <w:pPr>
+              <w:pStyle w:val="Compact"/>
+              <w:jc w:val="right"/>
+            </w:pPr>
+            <w:r>
+              <w:t xml:space="preserve">0.095 ± 0.021</w:t>
+            </w:r>
+          </w:p>
+        </w:tc>
+        <w:tc>
+          <w:tcPr/>
+          <w:p>
+            <w:pPr>
+              <w:pStyle w:val="Compact"/>
+              <w:jc w:val="right"/>
+            </w:pPr>
+            <w:r>
+              <w:t xml:space="preserve">0.274 ± 0.021</w:t>
+            </w:r>
+          </w:p>
+        </w:tc>
+        <w:tc>
+          <w:tcPr/>
+          <w:p>
+            <w:pPr>
+              <w:pStyle w:val="Compact"/>
+              <w:jc w:val="right"/>
+            </w:pPr>
+            <w:r>
+              <w:t xml:space="preserve">56.3 ± 6.2</w:t>
             </w:r>
           </w:p>
         </w:tc>
@@ -1431,17 +1411,17 @@
         <w:pStyle w:val="BodyText"/>
       </w:pPr>
       <w:r>
-        <w:t xml:space="preserve">SR@10 +0.036 (n.s.); SR@20 −0.143, CI [−0.286, −0.036] (significantly worse); median ED −31.8 px (n.s.). The aggregate regression is driven entirely by forgetting of the four untrained C103 pairs.</w:t>
+        <w:t xml:space="preserve">Across seeds the plain and L2-SP fine-tunes are statistically indistinguishable on every metric (overlapping ± SD), so the anchor is a zero-cost floor rather than a reliable improvement at this data budget. Both regress SR@20 modestly relative to zero-shot (0.393 → 0.30 / 0.27), within the resolution of a 28-pair test, while sharply improving in-distribution TEM median ED (~5× from ~321 px, seed-robust). The regression tracks forgetting of the untrained C103 SEM-SE↔LOM-height combination, of which one scene is unrecoverable at every seed and anchor.</w:t>
       </w:r>
     </w:p>
     <w:bookmarkEnd w:id="16"/>
-    <w:bookmarkStart w:id="17" w:name="Xa9aafa6498ddd135b071792b0a7de665f676b63"/>
+    <w:bookmarkStart w:id="17" w:name="Xa47a5224f2d818e2f7897b7fc3f301b72372759"/>
     <w:p>
       <w:pPr>
         <w:pStyle w:val="Heading3"/>
       </w:pPr>
       <w:r>
-        <w:t xml:space="preserve">A one-line weight anchor removes the forgetting</w:t>
+        <w:t xml:space="preserve">A one-line weight anchor, tested across seeds</w:t>
       </w:r>
     </w:p>
     <w:p>
@@ -1470,7 +1450,7 @@
         <w:pStyle w:val="BodyText"/>
       </w:pPr>
       <w:r>
-        <w:t xml:space="preserve">A light anchor wins. At λ = 0.01, the recoverable C103 scene, the modality the plain fine-tune broke, drops from 80/1220 px back to 16/24 px, close to zero-shot’s ~12 px; the other C103 scene stays broken at every λ, which marks an unrecoverable modality combination rather than an anchor failure. Heavier anchoring (λ = 0.1, 1.0) buys no further retention and costs both in-distribution gain and training stability, as the certainty head decalibrates into transient all-fail validation epochs whose onset moves earlier as λ grows. Table 3 reports the headline. Against the plain fine-tune, L2-SP λ = 0.01 improves median ED by 15.6 px (CI [−49.8, −2.4],</w:t>
+        <w:t xml:space="preserve">In a single seed-0 run the anchor looked like a clear win. At λ = 0.01 the recoverable C103 scene, the scene that run broke, dropped from 80/1220 px back to 16/24 px, close to zero-shot’s ~12 px, while the other C103 scene stayed broken at every λ; heavier anchoring (λ = 0.1, 1.0) bought no further retention and cost both in-distribution gain and training stability, as the certainty head decalibrated into transient all-fail validation epochs whose onset moved earlier as λ grew. On that run (Table 3), L2-SP λ = 0.01 improved median ED over the plain fine-tune by 15.6 px (CI [−49.8, −2.4],</w:t>
       </w:r>
       <w:r>
         <w:t xml:space="preserve"> </w:t>
@@ -1486,7 +1466,7 @@
         <w:t xml:space="preserve"> </w:t>
       </w:r>
       <w:r>
-        <w:t xml:space="preserve">= 0.0046). Against zero-shot, the SR@20 deficit shrinks to −0.071 (CI [−0.214, +0.071],</w:t>
+        <w:t xml:space="preserve">= 0.0046) and shrank the SR@20 deficit against zero-shot to −0.071 (CI [−0.214, +0.071],</w:t>
       </w:r>
       <w:r>
         <w:t xml:space="preserve"> </w:t>
@@ -1502,19 +1482,27 @@
         <w:t xml:space="preserve"> </w:t>
       </w:r>
       <w:r>
-        <w:t xml:space="preserve">= 0.91), so the regression is no longer statistically detectable. With only 28 test pairs this is a low-power null, and it should be read as</w:t>
-      </w:r>
-      <w:r>
-        <w:t xml:space="preserve"> </w:t>
-      </w:r>
-      <w:r>
-        <w:t xml:space="preserve">“not detectably worse”</w:t>
-      </w:r>
-      <w:r>
-        <w:t xml:space="preserve"> </w:t>
-      </w:r>
-      <w:r>
-        <w:t xml:space="preserve">rather than as proven equivalence; an equivalence test on a larger held-out set is planned. This minimal mitigation converts the net regression into a net-neutral-to-positive fine-tune, and the wrapper still stacks on top (direct SR@20 0.286 against pyramid 0.321). One caveat bounds the claim: one of the two held-out off-distribution C103 scenes stays unrecoverable at every λ, so forgetting is mitigated but not eliminated. We therefore treat L2-SP as a deliberately zero-cost lower bound on forgetting mitigation rather than a complete solution, and we expect stronger continual-learning methods such as experience replay, elastic weight consolidation [14], or LoRA-style low-rank updates [13] to improve on it; quantifying that is left to future work. Lifting SR@20</w:t>
+        <w:t xml:space="preserve">= 0.91).</w:t>
+      </w:r>
+    </w:p>
+    <w:p>
+      <w:pPr>
+        <w:pStyle w:val="BodyText"/>
+      </w:pPr>
+      <w:r>
+        <w:t xml:space="preserve">Three training seeds temper that reading. Re-running the plain (λ = 0) and anchored (λ = 0.01) fine-tunes at seeds 1–3 with the identical recipe and direct-match evaluation (Table 2) leaves the two configurations statistically indistinguishable on every test metric: SR@10 0.095 ± 0.021 for both, SR@20 0.298 ± 0.041 (plain) versus 0.274 ± 0.021 (L2-SP), median ED 46.0 ± 3.9 versus 56.3 ± 6.2 px. The single-run median-ED edge does not survive as a cross-seed effect, and on the recoverable C103 scene the anchor is if anything less stable than the plain fine-tune, retaining it in one of three seeds against three of three for λ = 0. The one effect that is robust across all six runs is the opposite of an anchor success: the second C103 scene is unrecoverable at every seed and every λ, which marks a modality-coverage gap rather than an optimisation choice. We therefore report L2-SP as a deliberately zero-cost floor that does not worsen the fine-tune rather than as a reliable forgetting fix, and we expect stronger continual-learning methods such as experience replay, elastic weight consolidation [14], or LoRA-style low-rank updates [13] to be needed for a seed-robust improvement; quantifying that is left to future work. With only 28 test pairs the SR@20 comparisons are low-power, so the regression should be read as</w:t>
+      </w:r>
+      <w:r>
+        <w:t xml:space="preserve"> </w:t>
+      </w:r>
+      <w:r>
+        <w:t xml:space="preserve">“modest and within seed noise”</w:t>
+      </w:r>
+      <w:r>
+        <w:t xml:space="preserve"> </w:t>
+      </w:r>
+      <w:r>
+        <w:t xml:space="preserve">rather than as proven equivalence, and a formal equivalence test on a larger held-out set is planned. The wrapper still stacks on the fine-tune (direct SR@20 0.286 against pyramid 0.321). Lifting SR@20</w:t>
       </w:r>
       <w:r>
         <w:t xml:space="preserve"> </w:t>
@@ -1542,13 +1530,13 @@
           <w:b/>
           <w:bCs/>
         </w:rPr>
-        <w:t xml:space="preserve">Table 3. L2-SP weight anchoring removes the forgetting regression</w:t>
-      </w:r>
-      <w:r>
-        <w:t xml:space="preserve"> </w:t>
-      </w:r>
-      <w:r>
-        <w:t xml:space="preserve">(28-pair test split, TPS-refined ED, paired bootstrap</w:t>
+        <w:t xml:space="preserve">Table 3. L2-SP weight anchoring with the verified wrapper, single training run</w:t>
+      </w:r>
+      <w:r>
+        <w:t xml:space="preserve"> </w:t>
+      </w:r>
+      <w:r>
+        <w:t xml:space="preserve">(seed 0; 28-pair test split, pyramid v2, TPS-refined ED, paired bootstrap</w:t>
       </w:r>
       <w:r>
         <w:t xml:space="preserve"> </w:t>
@@ -1564,7 +1552,7 @@
         <w:t xml:space="preserve"> </w:t>
       </w:r>
       <w:r>
-        <w:t xml:space="preserve">= 10,000).</w:t>
+        <w:t xml:space="preserve">= 10,000). The three-seed direct-protocol analysis (Table 2) shows the plain-vs-L2-SP gap is within seed variance, so the single-run anchor advantages below are one favourable draw rather than a seed-robust improvement.</w:t>
       </w:r>
     </w:p>
     <w:tbl>
@@ -2058,7 +2046,7 @@
         <w:t xml:space="preserve"> </w:t>
       </w:r>
       <w:r>
-        <w:t xml:space="preserve">pipeline unchanged. (ii) Fit transforms with automatic affine-vs-homography selection rather than a hard affine restriction (affine wins 69 % of pairs, homography the rest). (iii) Add a forgetting-robust decoder-only domain fine-tune when in-domain data exists; in our setup this is ~100M decoder parameters, AdamW for 1500 steps, about 90 min on a single RTX 5090, and a 445 MB checkpoint, with an L2-SP anchor at λ = 0.01 so that untrained modality combinations are not lost. (iv) Apply the verified wrapper only for genuinely multiscale tasks, where it adds a real scale lift without regressing the rest. A practical caveat on coverage: the fine-tune’s benefit is confined to modality combinations represented in training (here TEM dislocation imaging and several EBSD subclasses), and combinations absent from training (the C103 SEM-SE↔LOM-height case) should be run with the zero-shot backbone, or the fine-tune re-trained with that combination included, until coverage is broadened.</w:t>
+        <w:t xml:space="preserve">pipeline unchanged. (ii) Fit transforms with automatic affine-vs-homography selection rather than a hard affine restriction (affine wins 69 % of pairs, homography the rest). (iii) Add a decoder-only domain fine-tune when in-domain data exists, accepting that it helps in-distribution modalities and risks forgetting untrained ones; in our setup this is ~100M decoder parameters, AdamW for 1500 steps, about 90 min on a single RTX 5090, and a 445 MB checkpoint, optionally with an L2-SP anchor at λ = 0.01 as a zero-cost regulariser (it does not, on its own, prevent loss of untrained modality combinations; see below). (iv) Apply the verified wrapper only for genuinely multiscale tasks, where it adds a real scale lift without regressing the rest. A practical caveat on coverage: the fine-tune’s benefit is confined to modality combinations represented in training (here TEM dislocation imaging and several EBSD subclasses), and combinations absent from training (the C103 SEM-SE↔LOM-height case) should be run with the zero-shot backbone, or the fine-tune re-trained with that combination included, until coverage is broadened.</w:t>
       </w:r>
     </w:p>
     <w:p>
@@ -2066,7 +2054,7 @@
         <w:pStyle w:val="BodyText"/>
       </w:pPr>
       <w:r>
-        <w:t xml:space="preserve">Several limitations bound these claims. The mutual-information verifier cannot rank transforms within ~10 px of one another, which both caps the wrapper’s benefit on strong backbones and prevents the iterated-zoom machinery from paying off; a learned or GT-free residual verifier is the obvious next lever. The ~10.3 px GT affine residual floors all px-threshold metrics, so AmalgaMatch cannot certify sub-5 px registration and our SR@5 numbers should be read with that floor in mind. The FOV ladder cleanly isolates scale, but it crops real targets rather than acquiring genuinely low-FOV images, so it does not reproduce the texture, detector-noise, and resolution differences of native low-FOV acquisition; its wrapper gains should be read as a controlled lower bound on the mechanism, not as a literal forecast for natively low-FOV pairs. The headline fine-tuning and L2-SP numbers rest on single training runs and a 28-pair test split, with the SR@20 regression driven by four pairs, and the four near-threshold wrapper swaps point the same way. Multi-seed variance on the fine-tuning and L2-SP tables, a formal equivalence test on a larger held-out set, and at least one stronger continual-learning baseline (LoRA-style low-rank adaptation) are planned and not yet run, and we flag the single-run results accordingly. Finally, the fine-tuning study rests on 131 training pairs over 12 subclasses; L2-SP closes the forgetting half of the data-budget problem, but the unrecoverable C103 scene, broken at every anchor strength, shows that breadth of modality coverage rather than optimisation is the remaining bottleneck. The concrete next experiment is to add training pairs in that modality combination and re-evaluate on the same held-out split and FOV ladder used here. We expect a forgetting-robust fine-tune over broad modality coverage, with the verified wrapper reserved for multiscale tasks, to be the deployable configuration for cross-modal microscopy registration.</w:t>
+        <w:t xml:space="preserve">Several limitations bound these claims. The mutual-information verifier cannot rank transforms within ~10 px of one another, which both caps the wrapper’s benefit on strong backbones and prevents the iterated-zoom machinery from paying off; a learned or GT-free residual verifier is the obvious next lever. The ~10.3 px GT affine residual floors all px-threshold metrics, so AmalgaMatch cannot certify sub-5 px registration and our SR@5 numbers should be read with that floor in mind. The FOV ladder cleanly isolates scale, but it crops real targets rather than acquiring genuinely low-FOV images, so it does not reproduce the texture, detector-noise, and resolution differences of native low-FOV acquisition; its wrapper gains should be read as a controlled lower bound on the mechanism, not as a literal forecast for natively low-FOV pairs. The direct-match fine-tuning and L2-SP numbers are now reported as mean ± SD over three training seeds (Table 2); the pyramid-protocol numbers (Table 3) remain a single seed-0 run, because the multi-seed checkpoints were evaluated in direct mode and not retained, and we flag that table accordingly. The 28-pair test split is small, so SR comparisons are low-power and the seed-to-seed scatter is correspondingly large: the single-run SR@10 of 0.25 reported in earlier drafts sat well above the three-seed mean of 0.095 ± 0.021, which is why we now read the fine-tune as a large in-distribution gain accompanied by a modest, seed-noisy SR regression rather than a clean net improvement, and why we do not claim the L2-SP anchor as a reliable fix. A pyramid-protocol multi-seed replication, a formal equivalence test on a larger held-out set, and at least one stronger continual-learning baseline (LoRA-style low-rank adaptation) remain planned and not yet run. Finally, the fine-tuning study rests on 131 training pairs over 12 subclasses; the unrecoverable C103 scene, broken at every seed and anchor strength, shows that breadth of modality coverage rather than optimisation is the remaining bottleneck. The concrete next experiment is to add training pairs in that modality combination and re-evaluate on the same held-out split and FOV ladder used here. We expect a forgetting-robust fine-tune over broad modality coverage, with the verified wrapper reserved for multiscale tasks, to be the deployable configuration for cross-modal microscopy registration.</w:t>
       </w:r>
     </w:p>
     <w:bookmarkEnd w:id="20"/>
@@ -2243,7 +2231,7 @@
         <w:t xml:space="preserve"> </w:t>
       </w:r>
       <w:r>
-        <w:t xml:space="preserve">Fine-tuning is decoder-only: the VGG+DINOv2 encoder is held in evaluation mode (frozen, with normalisation statistics fixed) while ~100M decoder parameters are trained. Supervision densifies sparse GT correspondences into an A→B warp via thin-plate splines and supervises inside the GT-support region under a sparse-GT-robust loss, with FOV-crop and photometric augmentation. Optimisation uses AdamW at 2×10⁻⁵ for 1500 steps; the checkpoint is selected by minimum validation median ED. The forgetting-robust variant adds an L2-SP penalty [12] (λ/2)‖θ_dec − θ_dec⁰‖² anchoring the decoder to its zero-shot initialisation; λ ∈ {0, 0.01, 0.1, 1.0} is swept, with the step selected per run by validation median ED and λ by held-out test-split retention. We considered replay-based and low-rank [13] alternatives and elastic weight consolidation [14] as heavier mitigations; L2-SP was chosen as the zero-cost baseline and proved sufficient at this data budget.</w:t>
+        <w:t xml:space="preserve">Fine-tuning is decoder-only: the VGG+DINOv2 encoder is held in evaluation mode (frozen, with normalisation statistics fixed) while ~100M decoder parameters are trained. Supervision densifies sparse GT correspondences into an A→B warp via thin-plate splines and supervises inside the GT-support region under a sparse-GT-robust loss, with FOV-crop and photometric augmentation. Optimisation uses AdamW at 2×10⁻⁵ for 1500 steps; the checkpoint is selected by minimum validation median ED. The weight-anchored variant adds an L2-SP penalty [12] (λ/2)‖θ_dec − θ_dec⁰‖² anchoring the decoder to its zero-shot initialisation; λ ∈ {0, 0.01, 0.1, 1.0} is swept, with the step selected per run by validation median ED and λ by held-out test-split retention. The plain (λ = 0) and anchored (λ = 0.01) recipes are each run at three seeds for the variance analysis. We considered replay-based and low-rank [13] alternatives and elastic weight consolidation [14] as heavier mitigations; L2-SP was chosen as the zero-cost baseline.</w:t>
       </w:r>
     </w:p>
     <w:bookmarkEnd w:id="21"/>

</xml_diff>

<commit_message>
paper: apply re-review minor-revision residuals (per-seed Table 4, un-bold T3, harmonize 5x, contribution reorder, deployment-variance caveat)
</commit_message>
<xml_diff>
--- a/paper/paper.docx
+++ b/paper/paper.docx
@@ -223,7 +223,7 @@
         <w:pStyle w:val="BodyText"/>
       </w:pPr>
       <w:r>
-        <w:t xml:space="preserve">Here we test these hypotheses end-to-end on all 187 AmalgaMatch pairs, with controls, ablations, and a controlled decoupling experiment, and the result is as much diagnostic as methodological. The naive pyramid does not merely fail to help. It destroys the matchers it wraps, for a structural reason we trace to the fact that dense matchers never abstain. A redesigned verified coarse-to-fine wrapper recovers a small, real gain, but it cannot reach the severe-FOV regime. The single largest off-the-shelf lever turns out to be the backbone rather than the wrapper. A controlled FOV ladder then separates scale from appearance on real pairs and shows that the wrapper mechanism is in fact sound for scale; the real benchmark simply never presents scale as the isolated failure mode, because the low-FOV pairs are also the most appearance-divergent. Finally we attack appearance directly with materials-domain fine-tuning, observe forgetting of untrained modality combinations, and use a three-seed study to separate what a one-line weight anchor can and cannot fix. The contributions are four. First, a mechanistic account of why pyramidal wrappers break non-abstaining dense matchers, together with a verified coarse-to-fine wrapper that does not. Second, a controlled FOV-ladder protocol that decouples scale from appearance and validates the wrapper’s scale mechanism. Third, evidence that cross-modal appearance, not FOV, is the dominant constraint on this benchmark. Fourth, a decoder-only fine-tuning recipe for cross-modal microscopy matching with a three-seed robustness analysis, which shows that breadth of modality coverage, not the choice of optimiser or weight anchor, is the binding constraint on forgetting.</w:t>
+        <w:t xml:space="preserve">Here we test these hypotheses end-to-end on all 187 AmalgaMatch pairs, with controls, ablations, and a controlled decoupling experiment, and the result is as much diagnostic as methodological. The naive pyramid does not merely fail to help. It destroys the matchers it wraps, for a structural reason we trace to the fact that dense matchers never abstain. A redesigned verified coarse-to-fine wrapper recovers a small, real gain, but it cannot reach the severe-FOV regime. The single largest off-the-shelf lever turns out to be the backbone rather than the wrapper. A controlled FOV ladder then separates scale from appearance on real pairs and shows that the wrapper mechanism is in fact sound for scale; the real benchmark simply never presents scale as the isolated failure mode, because the low-FOV pairs are also the most appearance-divergent. Finally we attack appearance directly with materials-domain fine-tuning, observe forgetting of untrained modality combinations, and use a three-seed study to separate what a one-line weight anchor can and cannot fix. The contributions are four. First, a mechanistic account of why pyramidal wrappers break non-abstaining dense matchers, together with a verified coarse-to-fine wrapper that does not. Second, a controlled FOV-ladder protocol that decouples scale from appearance and validates the wrapper’s scale mechanism. Third, evidence that cross-modal appearance, not FOV, is the dominant constraint on this benchmark. Fourth, a three-seed robustness analysis of decoder-only fine-tuning that diagnoses breadth of modality coverage, not the choice of optimiser or weight anchor, as the binding constraint on forgetting, together with the fine-tuning recipe itself (a large, seed-robust in-distribution gain with a modest, seed-noisy held-out regression).</w:t>
       </w:r>
     </w:p>
     <w:bookmarkEnd w:id="10"/>
@@ -1490,7 +1490,7 @@
         <w:pStyle w:val="BodyText"/>
       </w:pPr>
       <w:r>
-        <w:t xml:space="preserve">Three training seeds temper that reading. Re-running the plain (λ = 0) and anchored (λ = 0.01) fine-tunes at seeds 1–3 with the identical recipe and direct-match evaluation (Table 2) leaves the two configurations statistically indistinguishable on every test metric: SR@10 0.095 ± 0.021 for both, SR@20 0.298 ± 0.041 (plain) versus 0.274 ± 0.021 (L2-SP), median ED 46.0 ± 3.9 versus 56.3 ± 6.2 px. The single-run median-ED edge does not survive as a cross-seed effect, and on the recoverable C103 scene the anchor is if anything less stable than the plain fine-tune, retaining it in one of three seeds against three of three for λ = 0. The one effect that is robust across all six runs is the opposite of an anchor success: the second C103 scene is unrecoverable at every seed and every λ, which marks a modality-coverage gap rather than an optimisation choice. We therefore report L2-SP as a deliberately zero-cost floor that does not worsen the fine-tune rather than as a reliable forgetting fix, and we expect stronger continual-learning methods such as experience replay, elastic weight consolidation [14], or LoRA-style low-rank updates [13] to be needed for a seed-robust improvement; quantifying that is left to future work. With only 28 test pairs the SR@20 comparisons are low-power, so the regression should be read as</w:t>
+        <w:t xml:space="preserve">Three training seeds temper that reading. Re-running the plain (λ = 0) and anchored (λ = 0.01) fine-tunes at seeds 1–3 with the identical recipe and direct-match evaluation (Table 2) leaves the two configurations statistically indistinguishable on every test metric: SR@10 0.095 ± 0.021 for both, SR@20 0.298 ± 0.041 (plain) versus 0.274 ± 0.021 (L2-SP), median ED 46.0 ± 3.9 versus 56.3 ± 6.2 px (per-seed values in Table 4). The single-run median-ED edge does not survive as a cross-seed effect, and on the recoverable C103 scene the anchor is if anything less stable than the plain fine-tune, retaining it in one of three seeds against three of three for λ = 0. The one effect that is robust across all six runs is the opposite of an anchor success: the second C103 scene is unrecoverable at every seed and every λ, which marks a modality-coverage gap rather than an optimisation choice. We therefore report L2-SP as a deliberately zero-cost floor that does not worsen the fine-tune rather than as a reliable forgetting fix, and we expect stronger continual-learning methods such as experience replay, elastic weight consolidation [14], or LoRA-style low-rank updates [13] to be needed for a seed-robust improvement; quantifying that is left to future work. With only 28 test pairs the SR@20 comparisons are low-power, so the regression should be read as</w:t>
       </w:r>
       <w:r>
         <w:t xml:space="preserve"> </w:t>
@@ -1558,16 +1558,15 @@
     <w:tbl>
       <w:tblPr>
         <w:tblStyle w:val="Table"/>
-        <w:tblW w:type="pct" w:w="5000"/>
-        <w:tblLayout w:type="fixed"/>
+        <w:tblW w:type="auto" w:w="0"/>
         <w:tblLook w:firstRow="1" w:lastRow="0" w:firstColumn="0" w:lastColumn="0" w:noHBand="0" w:noVBand="0" w:val="0020"/>
       </w:tblPr>
       <w:tblGrid>
-        <w:gridCol w:w="1250"/>
-        <w:gridCol w:w="1667"/>
-        <w:gridCol w:w="1667"/>
-        <w:gridCol w:w="1667"/>
-        <w:gridCol w:w="1667"/>
+        <w:gridCol w:w="1584"/>
+        <w:gridCol w:w="1584"/>
+        <w:gridCol w:w="1584"/>
+        <w:gridCol w:w="1584"/>
+        <w:gridCol w:w="1584"/>
       </w:tblGrid>
       <w:tr>
         <w:trPr>
@@ -1763,10 +1762,6 @@
               <w:pStyle w:val="Compact"/>
             </w:pPr>
             <w:r>
-              <w:rPr>
-                <w:b/>
-                <w:bCs/>
-              </w:rPr>
               <w:t xml:space="preserve">MatchAnything-RoMa (L2-SP λ = 0.01)</w:t>
             </w:r>
           </w:p>
@@ -1803,10 +1798,6 @@
               <w:jc w:val="right"/>
             </w:pPr>
             <w:r>
-              <w:rPr>
-                <w:b/>
-                <w:bCs/>
-              </w:rPr>
               <w:t xml:space="preserve">0.321</w:t>
             </w:r>
           </w:p>
@@ -1819,16 +1810,482 @@
               <w:jc w:val="right"/>
             </w:pPr>
             <w:r>
-              <w:rPr>
-                <w:b/>
-                <w:bCs/>
-              </w:rPr>
               <w:t xml:space="preserve">41.0</w:t>
             </w:r>
           </w:p>
         </w:tc>
       </w:tr>
     </w:tbl>
+    <w:p>
+      <w:pPr>
+        <w:pStyle w:val="BodyText"/>
+      </w:pPr>
+      <w:r>
+        <w:rPr>
+          <w:b/>
+          <w:bCs/>
+        </w:rPr>
+        <w:t xml:space="preserve">Table 4. Per-seed fine-tuning results</w:t>
+      </w:r>
+      <w:r>
+        <w:t xml:space="preserve"> </w:t>
+      </w:r>
+      <w:r>
+        <w:t xml:space="preserve">(direct match, 28-pair test split) underlying the mean ± SD in Table 2. With three seeds the SD is itself a coarse estimator, so we list the individual runs.</w:t>
+      </w:r>
+    </w:p>
+    <w:tbl>
+      <w:tblPr>
+        <w:tblStyle w:val="Table"/>
+        <w:tblW w:type="auto" w:w="0"/>
+        <w:tblLook w:firstRow="1" w:lastRow="0" w:firstColumn="0" w:lastColumn="0" w:noHBand="0" w:noVBand="0" w:val="0020"/>
+      </w:tblPr>
+      <w:tblGrid>
+        <w:gridCol w:w="1584"/>
+        <w:gridCol w:w="1584"/>
+        <w:gridCol w:w="1584"/>
+        <w:gridCol w:w="1584"/>
+        <w:gridCol w:w="1584"/>
+      </w:tblGrid>
+      <w:tr>
+        <w:trPr>
+          <w:tblHeader w:val="on"/>
+        </w:trPr>
+        <w:tc>
+          <w:tcPr/>
+          <w:p>
+            <w:pPr>
+              <w:pStyle w:val="Compact"/>
+            </w:pPr>
+            <w:r>
+              <w:t xml:space="preserve">Config</w:t>
+            </w:r>
+          </w:p>
+        </w:tc>
+        <w:tc>
+          <w:tcPr/>
+          <w:p>
+            <w:pPr>
+              <w:pStyle w:val="Compact"/>
+              <w:jc w:val="right"/>
+            </w:pPr>
+            <w:r>
+              <w:t xml:space="preserve">Seed</w:t>
+            </w:r>
+          </w:p>
+        </w:tc>
+        <w:tc>
+          <w:tcPr/>
+          <w:p>
+            <w:pPr>
+              <w:pStyle w:val="Compact"/>
+              <w:jc w:val="right"/>
+            </w:pPr>
+            <w:r>
+              <w:t xml:space="preserve">SR@10</w:t>
+            </w:r>
+          </w:p>
+        </w:tc>
+        <w:tc>
+          <w:tcPr/>
+          <w:p>
+            <w:pPr>
+              <w:pStyle w:val="Compact"/>
+              <w:jc w:val="right"/>
+            </w:pPr>
+            <w:r>
+              <w:t xml:space="preserve">SR@20</w:t>
+            </w:r>
+          </w:p>
+        </w:tc>
+        <w:tc>
+          <w:tcPr/>
+          <w:p>
+            <w:pPr>
+              <w:pStyle w:val="Compact"/>
+              <w:jc w:val="right"/>
+            </w:pPr>
+            <w:r>
+              <w:t xml:space="preserve">med ED (px)</w:t>
+            </w:r>
+          </w:p>
+        </w:tc>
+      </w:tr>
+      <w:tr>
+        <w:tc>
+          <w:tcPr/>
+          <w:p>
+            <w:pPr>
+              <w:pStyle w:val="Compact"/>
+            </w:pPr>
+            <w:r>
+              <w:t xml:space="preserve">plain fine-tune (λ = 0)</w:t>
+            </w:r>
+          </w:p>
+        </w:tc>
+        <w:tc>
+          <w:tcPr/>
+          <w:p>
+            <w:pPr>
+              <w:pStyle w:val="Compact"/>
+              <w:jc w:val="right"/>
+            </w:pPr>
+            <w:r>
+              <w:t xml:space="preserve">1</w:t>
+            </w:r>
+          </w:p>
+        </w:tc>
+        <w:tc>
+          <w:tcPr/>
+          <w:p>
+            <w:pPr>
+              <w:pStyle w:val="Compact"/>
+              <w:jc w:val="right"/>
+            </w:pPr>
+            <w:r>
+              <w:t xml:space="preserve">0.107</w:t>
+            </w:r>
+          </w:p>
+        </w:tc>
+        <w:tc>
+          <w:tcPr/>
+          <w:p>
+            <w:pPr>
+              <w:pStyle w:val="Compact"/>
+              <w:jc w:val="right"/>
+            </w:pPr>
+            <w:r>
+              <w:t xml:space="preserve">0.321</w:t>
+            </w:r>
+          </w:p>
+        </w:tc>
+        <w:tc>
+          <w:tcPr/>
+          <w:p>
+            <w:pPr>
+              <w:pStyle w:val="Compact"/>
+              <w:jc w:val="right"/>
+            </w:pPr>
+            <w:r>
+              <w:t xml:space="preserve">48.9</w:t>
+            </w:r>
+          </w:p>
+        </w:tc>
+      </w:tr>
+      <w:tr>
+        <w:tc>
+          <w:tcPr/>
+          <w:p>
+            <w:pPr>
+              <w:pStyle w:val="Compact"/>
+            </w:pPr>
+            <w:r>
+              <w:t xml:space="preserve">plain fine-tune (λ = 0)</w:t>
+            </w:r>
+          </w:p>
+        </w:tc>
+        <w:tc>
+          <w:tcPr/>
+          <w:p>
+            <w:pPr>
+              <w:pStyle w:val="Compact"/>
+              <w:jc w:val="right"/>
+            </w:pPr>
+            <w:r>
+              <w:t xml:space="preserve">2</w:t>
+            </w:r>
+          </w:p>
+        </w:tc>
+        <w:tc>
+          <w:tcPr/>
+          <w:p>
+            <w:pPr>
+              <w:pStyle w:val="Compact"/>
+              <w:jc w:val="right"/>
+            </w:pPr>
+            <w:r>
+              <w:t xml:space="preserve">0.071</w:t>
+            </w:r>
+          </w:p>
+        </w:tc>
+        <w:tc>
+          <w:tcPr/>
+          <w:p>
+            <w:pPr>
+              <w:pStyle w:val="Compact"/>
+              <w:jc w:val="right"/>
+            </w:pPr>
+            <w:r>
+              <w:t xml:space="preserve">0.321</w:t>
+            </w:r>
+          </w:p>
+        </w:tc>
+        <w:tc>
+          <w:tcPr/>
+          <w:p>
+            <w:pPr>
+              <w:pStyle w:val="Compact"/>
+              <w:jc w:val="right"/>
+            </w:pPr>
+            <w:r>
+              <w:t xml:space="preserve">41.6</w:t>
+            </w:r>
+          </w:p>
+        </w:tc>
+      </w:tr>
+      <w:tr>
+        <w:tc>
+          <w:tcPr/>
+          <w:p>
+            <w:pPr>
+              <w:pStyle w:val="Compact"/>
+            </w:pPr>
+            <w:r>
+              <w:t xml:space="preserve">plain fine-tune (λ = 0)</w:t>
+            </w:r>
+          </w:p>
+        </w:tc>
+        <w:tc>
+          <w:tcPr/>
+          <w:p>
+            <w:pPr>
+              <w:pStyle w:val="Compact"/>
+              <w:jc w:val="right"/>
+            </w:pPr>
+            <w:r>
+              <w:t xml:space="preserve">3</w:t>
+            </w:r>
+          </w:p>
+        </w:tc>
+        <w:tc>
+          <w:tcPr/>
+          <w:p>
+            <w:pPr>
+              <w:pStyle w:val="Compact"/>
+              <w:jc w:val="right"/>
+            </w:pPr>
+            <w:r>
+              <w:t xml:space="preserve">0.107</w:t>
+            </w:r>
+          </w:p>
+        </w:tc>
+        <w:tc>
+          <w:tcPr/>
+          <w:p>
+            <w:pPr>
+              <w:pStyle w:val="Compact"/>
+              <w:jc w:val="right"/>
+            </w:pPr>
+            <w:r>
+              <w:t xml:space="preserve">0.250</w:t>
+            </w:r>
+          </w:p>
+        </w:tc>
+        <w:tc>
+          <w:tcPr/>
+          <w:p>
+            <w:pPr>
+              <w:pStyle w:val="Compact"/>
+              <w:jc w:val="right"/>
+            </w:pPr>
+            <w:r>
+              <w:t xml:space="preserve">47.6</w:t>
+            </w:r>
+          </w:p>
+        </w:tc>
+      </w:tr>
+      <w:tr>
+        <w:tc>
+          <w:tcPr/>
+          <w:p>
+            <w:pPr>
+              <w:pStyle w:val="Compact"/>
+            </w:pPr>
+            <w:r>
+              <w:t xml:space="preserve">L2-SP (λ = 0.01)</w:t>
+            </w:r>
+          </w:p>
+        </w:tc>
+        <w:tc>
+          <w:tcPr/>
+          <w:p>
+            <w:pPr>
+              <w:pStyle w:val="Compact"/>
+              <w:jc w:val="right"/>
+            </w:pPr>
+            <w:r>
+              <w:t xml:space="preserve">1</w:t>
+            </w:r>
+          </w:p>
+        </w:tc>
+        <w:tc>
+          <w:tcPr/>
+          <w:p>
+            <w:pPr>
+              <w:pStyle w:val="Compact"/>
+              <w:jc w:val="right"/>
+            </w:pPr>
+            <w:r>
+              <w:t xml:space="preserve">0.107</w:t>
+            </w:r>
+          </w:p>
+        </w:tc>
+        <w:tc>
+          <w:tcPr/>
+          <w:p>
+            <w:pPr>
+              <w:pStyle w:val="Compact"/>
+              <w:jc w:val="right"/>
+            </w:pPr>
+            <w:r>
+              <w:t xml:space="preserve">0.286</w:t>
+            </w:r>
+          </w:p>
+        </w:tc>
+        <w:tc>
+          <w:tcPr/>
+          <w:p>
+            <w:pPr>
+              <w:pStyle w:val="Compact"/>
+              <w:jc w:val="right"/>
+            </w:pPr>
+            <w:r>
+              <w:t xml:space="preserve">52.5</w:t>
+            </w:r>
+          </w:p>
+        </w:tc>
+      </w:tr>
+      <w:tr>
+        <w:tc>
+          <w:tcPr/>
+          <w:p>
+            <w:pPr>
+              <w:pStyle w:val="Compact"/>
+            </w:pPr>
+            <w:r>
+              <w:t xml:space="preserve">L2-SP (λ = 0.01)</w:t>
+            </w:r>
+          </w:p>
+        </w:tc>
+        <w:tc>
+          <w:tcPr/>
+          <w:p>
+            <w:pPr>
+              <w:pStyle w:val="Compact"/>
+              <w:jc w:val="right"/>
+            </w:pPr>
+            <w:r>
+              <w:t xml:space="preserve">2</w:t>
+            </w:r>
+          </w:p>
+        </w:tc>
+        <w:tc>
+          <w:tcPr/>
+          <w:p>
+            <w:pPr>
+              <w:pStyle w:val="Compact"/>
+              <w:jc w:val="right"/>
+            </w:pPr>
+            <w:r>
+              <w:t xml:space="preserve">0.107</w:t>
+            </w:r>
+          </w:p>
+        </w:tc>
+        <w:tc>
+          <w:tcPr/>
+          <w:p>
+            <w:pPr>
+              <w:pStyle w:val="Compact"/>
+              <w:jc w:val="right"/>
+            </w:pPr>
+            <w:r>
+              <w:t xml:space="preserve">0.286</w:t>
+            </w:r>
+          </w:p>
+        </w:tc>
+        <w:tc>
+          <w:tcPr/>
+          <w:p>
+            <w:pPr>
+              <w:pStyle w:val="Compact"/>
+              <w:jc w:val="right"/>
+            </w:pPr>
+            <w:r>
+              <w:t xml:space="preserve">52.9</w:t>
+            </w:r>
+          </w:p>
+        </w:tc>
+      </w:tr>
+      <w:tr>
+        <w:tc>
+          <w:tcPr/>
+          <w:p>
+            <w:pPr>
+              <w:pStyle w:val="Compact"/>
+            </w:pPr>
+            <w:r>
+              <w:t xml:space="preserve">L2-SP (λ = 0.01)</w:t>
+            </w:r>
+          </w:p>
+        </w:tc>
+        <w:tc>
+          <w:tcPr/>
+          <w:p>
+            <w:pPr>
+              <w:pStyle w:val="Compact"/>
+              <w:jc w:val="right"/>
+            </w:pPr>
+            <w:r>
+              <w:t xml:space="preserve">3</w:t>
+            </w:r>
+          </w:p>
+        </w:tc>
+        <w:tc>
+          <w:tcPr/>
+          <w:p>
+            <w:pPr>
+              <w:pStyle w:val="Compact"/>
+              <w:jc w:val="right"/>
+            </w:pPr>
+            <w:r>
+              <w:t xml:space="preserve">0.071</w:t>
+            </w:r>
+          </w:p>
+        </w:tc>
+        <w:tc>
+          <w:tcPr/>
+          <w:p>
+            <w:pPr>
+              <w:pStyle w:val="Compact"/>
+              <w:jc w:val="right"/>
+            </w:pPr>
+            <w:r>
+              <w:t xml:space="preserve">0.250</w:t>
+            </w:r>
+          </w:p>
+        </w:tc>
+        <w:tc>
+          <w:tcPr/>
+          <w:p>
+            <w:pPr>
+              <w:pStyle w:val="Compact"/>
+              <w:jc w:val="right"/>
+            </w:pPr>
+            <w:r>
+              <w:t xml:space="preserve">63.5</w:t>
+            </w:r>
+          </w:p>
+        </w:tc>
+      </w:tr>
+    </w:tbl>
+    <w:p>
+      <w:pPr>
+        <w:pStyle w:val="BodyText"/>
+      </w:pPr>
+      <w:r>
+        <w:t xml:space="preserve">SR@10 spans 0.071–0.107 and SR@20 0.250–0.321 for both configurations, with the two distributions overlapping rather than separating. Median ED is the only metric on which the configurations differ in central tendency (plain 41.6–48.9 vs. L2-SP 52.5–63.5 px), but the ranges abut and the effect does not reach the per-seed separation needed to call L2-SP an improvement.</w:t>
+      </w:r>
+    </w:p>
     <w:bookmarkEnd w:id="17"/>
     <w:bookmarkStart w:id="18" w:name="hypothesis-verdicts"/>
     <w:p>
@@ -1979,7 +2436,7 @@
         <w:t xml:space="preserve"> </w:t>
       </w:r>
       <w:r>
-        <w:t xml:space="preserve">(cross-modal-trained MatchAnything-RoMa), and that gain lived entirely among high-FOV, nearly-matchable pairs. Second, a scale-only wrapper that triples success when scale is isolated experimentally moves real severe-FOV pairs almost not at all, because in the real distribution low FOV and high appearance divergence are confounded. Third, attacking appearance directly with domain fine-tuning produced the single largest error reduction we observed (5.2× on in-distribution TEM). The pyramid solves a problem these pairs mostly do not have, and it cannot touch the one they do.</w:t>
+        <w:t xml:space="preserve">(cross-modal-trained MatchAnything-RoMa), and that gain lived entirely among high-FOV, nearly-matchable pairs. Second, a scale-only wrapper that triples success when scale is isolated experimentally moves real severe-FOV pairs almost not at all, because in the real distribution low FOV and high appearance divergence are confounded. Third, attacking appearance directly with domain fine-tuning produced the single largest error reduction we observed (~5× on in-distribution TEM; 5.2× in the seed-0 run, and seed-robust in direction across the three seeds). The pyramid solves a problem these pairs mostly do not have, and it cannot touch the one they do.</w:t>
       </w:r>
     </w:p>
     <w:p>
@@ -2054,7 +2511,7 @@
         <w:pStyle w:val="BodyText"/>
       </w:pPr>
       <w:r>
-        <w:t xml:space="preserve">Several limitations bound these claims. The mutual-information verifier cannot rank transforms within ~10 px of one another, which both caps the wrapper’s benefit on strong backbones and prevents the iterated-zoom machinery from paying off; a learned or GT-free residual verifier is the obvious next lever. The ~10.3 px GT affine residual floors all px-threshold metrics, so AmalgaMatch cannot certify sub-5 px registration and our SR@5 numbers should be read with that floor in mind. The FOV ladder cleanly isolates scale, but it crops real targets rather than acquiring genuinely low-FOV images, so it does not reproduce the texture, detector-noise, and resolution differences of native low-FOV acquisition; its wrapper gains should be read as a controlled lower bound on the mechanism, not as a literal forecast for natively low-FOV pairs. The direct-match fine-tuning and L2-SP numbers are now reported as mean ± SD over three training seeds (Table 2); the pyramid-protocol numbers (Table 3) remain a single seed-0 run, because the multi-seed checkpoints were evaluated in direct mode and not retained, and we flag that table accordingly. The 28-pair test split is small, so SR comparisons are low-power and the seed-to-seed scatter is correspondingly large: the single-run SR@10 of 0.25 reported in earlier drafts sat well above the three-seed mean of 0.095 ± 0.021, which is why we now read the fine-tune as a large in-distribution gain accompanied by a modest, seed-noisy SR regression rather than a clean net improvement, and why we do not claim the L2-SP anchor as a reliable fix. A pyramid-protocol multi-seed replication, a formal equivalence test on a larger held-out set, and at least one stronger continual-learning baseline (LoRA-style low-rank adaptation) remain planned and not yet run. Finally, the fine-tuning study rests on 131 training pairs over 12 subclasses; the unrecoverable C103 scene, broken at every seed and anchor strength, shows that breadth of modality coverage rather than optimisation is the remaining bottleneck. The concrete next experiment is to add training pairs in that modality combination and re-evaluate on the same held-out split and FOV ladder used here. We expect a forgetting-robust fine-tune over broad modality coverage, with the verified wrapper reserved for multiscale tasks, to be the deployable configuration for cross-modal microscopy registration.</w:t>
+        <w:t xml:space="preserve">Several limitations bound these claims. The mutual-information verifier cannot rank transforms within ~10 px of one another, which both caps the wrapper’s benefit on strong backbones and prevents the iterated-zoom machinery from paying off; a learned or GT-free residual verifier is the obvious next lever. The ~10.3 px GT affine residual floors all px-threshold metrics, so AmalgaMatch cannot certify sub-5 px registration and our SR@5 numbers should be read with that floor in mind. The FOV ladder cleanly isolates scale, but it crops real targets rather than acquiring genuinely low-FOV images, so it does not reproduce the texture, detector-noise, and resolution differences of native low-FOV acquisition; its wrapper gains should be read as a controlled lower bound on the mechanism, not as a literal forecast for natively low-FOV pairs. The direct-match fine-tuning and L2-SP numbers are now reported as mean ± SD over three training seeds (Table 2); the pyramid-protocol numbers (Table 3) remain a single seed-0 run, because the multi-seed checkpoints were evaluated in direct mode and not retained, and we flag that table accordingly. In particular, the deployment configuration we recommend, the verified wrapper stacked on the fine-tune, is characterised only at seed 0, so until a pyramid-protocol multi-seed replication is run its variance should be assumed comparable to the direct-protocol spread in Table 2. The 28-pair test split is small, so SR comparisons are low-power and the seed-to-seed scatter is correspondingly large: the single-run SR@10 of 0.25 reported in earlier drafts sat well above the three-seed mean of 0.095 ± 0.021, which is why we now read the fine-tune as a large in-distribution gain accompanied by a modest, seed-noisy SR regression rather than a clean net improvement, and why we do not claim the L2-SP anchor as a reliable fix. A pyramid-protocol multi-seed replication, a formal equivalence test on a larger held-out set, and at least one stronger continual-learning baseline (LoRA-style low-rank adaptation) remain planned and not yet run. Finally, the fine-tuning study rests on 131 training pairs over 12 subclasses; the unrecoverable C103 scene, broken at every seed and anchor strength, shows that breadth of modality coverage rather than optimisation is the remaining bottleneck. The concrete next experiment is to add training pairs in that modality combination and re-evaluate on the same held-out split and FOV ladder used here. We expect a forgetting-robust fine-tune over broad modality coverage, with the verified wrapper reserved for multiscale tasks, to be the deployable configuration for cross-modal microscopy registration.</w:t>
       </w:r>
     </w:p>
     <w:bookmarkEnd w:id="20"/>

</xml_diff>

<commit_message>
paper: fold P1-1b pyramid multi-seed into Table 3; seed-0 L2-SP advantage does not replicate, wrapper does not stack on the fine-tune
</commit_message>
<xml_diff>
--- a/paper/paper.docx
+++ b/paper/paper.docx
@@ -1450,7 +1450,7 @@
         <w:pStyle w:val="BodyText"/>
       </w:pPr>
       <w:r>
-        <w:t xml:space="preserve">In a single seed-0 run the anchor looked like a clear win. At λ = 0.01 the recoverable C103 scene, the scene that run broke, dropped from 80/1220 px back to 16/24 px, close to zero-shot’s ~12 px, while the other C103 scene stayed broken at every λ; heavier anchoring (λ = 0.1, 1.0) bought no further retention and cost both in-distribution gain and training stability, as the certainty head decalibrated into transient all-fail validation epochs whose onset moved earlier as λ grew. On that run (Table 3), L2-SP λ = 0.01 improved median ED over the plain fine-tune by 15.6 px (CI [−49.8, −2.4],</w:t>
+        <w:t xml:space="preserve">In a single seed-0 run the anchor looked like a clear win. At λ = 0.01 the recoverable C103 scene, the scene that run broke, dropped from 80/1220 px back to 16/24 px, close to zero-shot’s ~12 px, while the other C103 scene stayed broken at every λ; heavier anchoring (λ = 0.1, 1.0) bought no further retention and cost both in-distribution gain and training stability, as the certainty head decalibrated into transient all-fail validation epochs whose onset moved earlier as λ grew. On that single run, L2-SP λ = 0.01 improved median ED over the plain fine-tune by 15.6 px (CI [−49.8, −2.4],</w:t>
       </w:r>
       <w:r>
         <w:t xml:space="preserve"> </w:t>
@@ -1482,7 +1482,7 @@
         <w:t xml:space="preserve"> </w:t>
       </w:r>
       <w:r>
-        <w:t xml:space="preserve">= 0.91).</w:t>
+        <w:t xml:space="preserve">= 0.91). Neither edge generalises: the three-seed direct analysis below and a matched three-seed replication under the pyramid deployment protocol (Table 3) both leave L2-SP and the plain fine-tune indistinguishable.</w:t>
       </w:r>
     </w:p>
     <w:p>
@@ -1502,7 +1502,7 @@
         <w:t xml:space="preserve"> </w:t>
       </w:r>
       <w:r>
-        <w:t xml:space="preserve">rather than as proven equivalence, and a formal equivalence test on a larger held-out set is planned. The wrapper still stacks on the fine-tune (direct SR@20 0.286 against pyramid 0.321). Lifting SR@20</w:t>
+        <w:t xml:space="preserve">rather than as proven equivalence, and a formal equivalence test on a larger held-out set is planned. Re-training seeds 1–3 and evaluating both protocols on the same checkpoints (Table 3) shows the verified wrapper neither helps nor hurts the fine-tuned backbone on the real test split, with pyramid and direct SR@20 coinciding at 0.262 (plain) and 0.274 (L2-SP); this is consistent with the FOV-ladder result that scale and appearance failures overlap in the real distribution, so here the wrapper and the fine-tune do not stack. Lifting SR@20</w:t>
       </w:r>
       <w:r>
         <w:t xml:space="preserve"> </w:t>
@@ -1530,13 +1530,13 @@
           <w:b/>
           <w:bCs/>
         </w:rPr>
-        <w:t xml:space="preserve">Table 3. L2-SP weight anchoring with the verified wrapper, single training run</w:t>
-      </w:r>
-      <w:r>
-        <w:t xml:space="preserve"> </w:t>
-      </w:r>
-      <w:r>
-        <w:t xml:space="preserve">(seed 0; 28-pair test split, pyramid v2, TPS-refined ED, paired bootstrap</w:t>
+        <w:t xml:space="preserve">Table 3. Verified wrapper on the fine-tuned backbone, three-seed replication</w:t>
+      </w:r>
+      <w:r>
+        <w:t xml:space="preserve"> </w:t>
+      </w:r>
+      <w:r>
+        <w:t xml:space="preserve">(seeds 1–3; 28-pair held-out test split; TPS-refined ED; zero-shot deterministic). These checkpoints were retrained for the pyramid evaluation because the original multi-seed checkpoints (Table 2) were not retained; decoder fine-tuning is not bit-reproducible at fixed seed on our stack (non-deterministic CUDA kernels, multi-worker data loading), so this independent draw lands at a higher direct SR@10 (0.250 vs the 0.095 ± 0.021 of Table 2) — run-to-run scatter exceeds seed-to-seed scatter at 28 pairs, itself part of the variance story. The controlled comparison is therefore</w:t>
       </w:r>
       <w:r>
         <w:t xml:space="preserve"> </w:t>
@@ -1546,13 +1546,460 @@
           <w:i/>
           <w:iCs/>
         </w:rPr>
-        <w:t xml:space="preserve">B</w:t>
-      </w:r>
-      <w:r>
-        <w:t xml:space="preserve"> </w:t>
-      </w:r>
-      <w:r>
-        <w:t xml:space="preserve">= 10,000). The three-seed direct-protocol analysis (Table 2) shows the plain-vs-L2-SP gap is within seed variance, so the single-run anchor advantages below are one favourable draw rather than a seed-robust improvement.</w:t>
+        <w:t xml:space="preserve">within</w:t>
+      </w:r>
+      <w:r>
+        <w:t xml:space="preserve"> </w:t>
+      </w:r>
+      <w:r>
+        <w:t xml:space="preserve">this table, where each direct/pyramid pair shares a checkpoint: the wrapper does not stack on the fine-tune (SR@20 unchanged at 0.262/0.274; median ED within ±2 px), and the seed-0 L2-SP pyramid advantage reported in earlier drafts (SR@20 0.321, median ED 41 px) does not replicate — across seeds 1–3 L2-SP and the plain fine-tune are indistinguishable (SR@20 0.274 ± 0.021 vs 0.262 ± 0.021). The anchor remains a zero-cost floor, not a reliable improvement, under the pyramid deployment protocol as well as the direct one.</w:t>
+      </w:r>
+    </w:p>
+    <w:tbl>
+      <w:tblPr>
+        <w:tblStyle w:val="Table"/>
+        <w:tblW w:type="pct" w:w="5000"/>
+        <w:tblLayout w:type="fixed"/>
+        <w:tblLook w:firstRow="1" w:lastRow="0" w:firstColumn="0" w:lastColumn="0" w:noHBand="0" w:noVBand="0" w:val="0020"/>
+      </w:tblPr>
+      <w:tblGrid>
+        <w:gridCol w:w="1320"/>
+        <w:gridCol w:w="1320"/>
+        <w:gridCol w:w="1760"/>
+        <w:gridCol w:w="1760"/>
+        <w:gridCol w:w="1760"/>
+      </w:tblGrid>
+      <w:tr>
+        <w:trPr>
+          <w:tblHeader w:val="on"/>
+        </w:trPr>
+        <w:tc>
+          <w:tcPr/>
+          <w:p>
+            <w:pPr>
+              <w:pStyle w:val="Compact"/>
+            </w:pPr>
+            <w:r>
+              <w:t xml:space="preserve">Method (3-seed mean ± SD)</w:t>
+            </w:r>
+          </w:p>
+        </w:tc>
+        <w:tc>
+          <w:tcPr/>
+          <w:p>
+            <w:pPr>
+              <w:pStyle w:val="Compact"/>
+            </w:pPr>
+            <w:r>
+              <w:t xml:space="preserve">Protocol</w:t>
+            </w:r>
+          </w:p>
+        </w:tc>
+        <w:tc>
+          <w:tcPr/>
+          <w:p>
+            <w:pPr>
+              <w:pStyle w:val="Compact"/>
+              <w:jc w:val="right"/>
+            </w:pPr>
+            <w:r>
+              <w:t xml:space="preserve">SR@10</w:t>
+            </w:r>
+          </w:p>
+        </w:tc>
+        <w:tc>
+          <w:tcPr/>
+          <w:p>
+            <w:pPr>
+              <w:pStyle w:val="Compact"/>
+              <w:jc w:val="right"/>
+            </w:pPr>
+            <w:r>
+              <w:t xml:space="preserve">SR@20</w:t>
+            </w:r>
+          </w:p>
+        </w:tc>
+        <w:tc>
+          <w:tcPr/>
+          <w:p>
+            <w:pPr>
+              <w:pStyle w:val="Compact"/>
+              <w:jc w:val="right"/>
+            </w:pPr>
+            <w:r>
+              <w:t xml:space="preserve">med ED (px)</w:t>
+            </w:r>
+          </w:p>
+        </w:tc>
+      </w:tr>
+      <w:tr>
+        <w:tc>
+          <w:tcPr/>
+          <w:p>
+            <w:pPr>
+              <w:pStyle w:val="Compact"/>
+            </w:pPr>
+            <w:r>
+              <w:t xml:space="preserve">MatchAnything-RoMa (zero-shot)</w:t>
+            </w:r>
+          </w:p>
+        </w:tc>
+        <w:tc>
+          <w:tcPr/>
+          <w:p>
+            <w:pPr>
+              <w:pStyle w:val="Compact"/>
+            </w:pPr>
+            <w:r>
+              <w:t xml:space="preserve">direct</w:t>
+            </w:r>
+          </w:p>
+        </w:tc>
+        <w:tc>
+          <w:tcPr/>
+          <w:p>
+            <w:pPr>
+              <w:pStyle w:val="Compact"/>
+              <w:jc w:val="right"/>
+            </w:pPr>
+            <w:r>
+              <w:t xml:space="preserve">0.214</w:t>
+            </w:r>
+          </w:p>
+        </w:tc>
+        <w:tc>
+          <w:tcPr/>
+          <w:p>
+            <w:pPr>
+              <w:pStyle w:val="Compact"/>
+              <w:jc w:val="right"/>
+            </w:pPr>
+            <w:r>
+              <w:t xml:space="preserve">0.393</w:t>
+            </w:r>
+          </w:p>
+        </w:tc>
+        <w:tc>
+          <w:tcPr/>
+          <w:p>
+            <w:pPr>
+              <w:pStyle w:val="Compact"/>
+              <w:jc w:val="right"/>
+            </w:pPr>
+            <w:r>
+              <w:t xml:space="preserve">83.5</w:t>
+            </w:r>
+          </w:p>
+        </w:tc>
+      </w:tr>
+      <w:tr>
+        <w:tc>
+          <w:tcPr/>
+          <w:p>
+            <w:pPr>
+              <w:pStyle w:val="Compact"/>
+            </w:pPr>
+          </w:p>
+        </w:tc>
+        <w:tc>
+          <w:tcPr/>
+          <w:p>
+            <w:pPr>
+              <w:pStyle w:val="Compact"/>
+            </w:pPr>
+            <w:r>
+              <w:t xml:space="preserve">pyramid v2</w:t>
+            </w:r>
+          </w:p>
+        </w:tc>
+        <w:tc>
+          <w:tcPr/>
+          <w:p>
+            <w:pPr>
+              <w:pStyle w:val="Compact"/>
+              <w:jc w:val="right"/>
+            </w:pPr>
+            <w:r>
+              <w:t xml:space="preserve">0.214</w:t>
+            </w:r>
+          </w:p>
+        </w:tc>
+        <w:tc>
+          <w:tcPr/>
+          <w:p>
+            <w:pPr>
+              <w:pStyle w:val="Compact"/>
+              <w:jc w:val="right"/>
+            </w:pPr>
+            <w:r>
+              <w:t xml:space="preserve">0.393</w:t>
+            </w:r>
+          </w:p>
+        </w:tc>
+        <w:tc>
+          <w:tcPr/>
+          <w:p>
+            <w:pPr>
+              <w:pStyle w:val="Compact"/>
+              <w:jc w:val="right"/>
+            </w:pPr>
+            <w:r>
+              <w:t xml:space="preserve">69.1</w:t>
+            </w:r>
+          </w:p>
+        </w:tc>
+      </w:tr>
+      <w:tr>
+        <w:tc>
+          <w:tcPr/>
+          <w:p>
+            <w:pPr>
+              <w:pStyle w:val="Compact"/>
+            </w:pPr>
+            <w:r>
+              <w:t xml:space="preserve">MA-RoMa plain fine-tune (λ = 0)</w:t>
+            </w:r>
+          </w:p>
+        </w:tc>
+        <w:tc>
+          <w:tcPr/>
+          <w:p>
+            <w:pPr>
+              <w:pStyle w:val="Compact"/>
+            </w:pPr>
+            <w:r>
+              <w:t xml:space="preserve">direct</w:t>
+            </w:r>
+          </w:p>
+        </w:tc>
+        <w:tc>
+          <w:tcPr/>
+          <w:p>
+            <w:pPr>
+              <w:pStyle w:val="Compact"/>
+              <w:jc w:val="right"/>
+            </w:pPr>
+            <w:r>
+              <w:t xml:space="preserve">0.250 ± 0.000</w:t>
+            </w:r>
+          </w:p>
+        </w:tc>
+        <w:tc>
+          <w:tcPr/>
+          <w:p>
+            <w:pPr>
+              <w:pStyle w:val="Compact"/>
+              <w:jc w:val="right"/>
+            </w:pPr>
+            <w:r>
+              <w:t xml:space="preserve">0.262 ± 0.021</w:t>
+            </w:r>
+          </w:p>
+        </w:tc>
+        <w:tc>
+          <w:tcPr/>
+          <w:p>
+            <w:pPr>
+              <w:pStyle w:val="Compact"/>
+              <w:jc w:val="right"/>
+            </w:pPr>
+            <w:r>
+              <w:t xml:space="preserve">52.4 ± 5.2</w:t>
+            </w:r>
+          </w:p>
+        </w:tc>
+      </w:tr>
+      <w:tr>
+        <w:tc>
+          <w:tcPr/>
+          <w:p>
+            <w:pPr>
+              <w:pStyle w:val="Compact"/>
+            </w:pPr>
+          </w:p>
+        </w:tc>
+        <w:tc>
+          <w:tcPr/>
+          <w:p>
+            <w:pPr>
+              <w:pStyle w:val="Compact"/>
+            </w:pPr>
+            <w:r>
+              <w:t xml:space="preserve">pyramid v2</w:t>
+            </w:r>
+          </w:p>
+        </w:tc>
+        <w:tc>
+          <w:tcPr/>
+          <w:p>
+            <w:pPr>
+              <w:pStyle w:val="Compact"/>
+              <w:jc w:val="right"/>
+            </w:pPr>
+            <w:r>
+              <w:t xml:space="preserve">0.226 ± 0.021</w:t>
+            </w:r>
+          </w:p>
+        </w:tc>
+        <w:tc>
+          <w:tcPr/>
+          <w:p>
+            <w:pPr>
+              <w:pStyle w:val="Compact"/>
+              <w:jc w:val="right"/>
+            </w:pPr>
+            <w:r>
+              <w:t xml:space="preserve">0.262 ± 0.021</w:t>
+            </w:r>
+          </w:p>
+        </w:tc>
+        <w:tc>
+          <w:tcPr/>
+          <w:p>
+            <w:pPr>
+              <w:pStyle w:val="Compact"/>
+              <w:jc w:val="right"/>
+            </w:pPr>
+            <w:r>
+              <w:t xml:space="preserve">49.6 ± 3.1</w:t>
+            </w:r>
+          </w:p>
+        </w:tc>
+      </w:tr>
+      <w:tr>
+        <w:tc>
+          <w:tcPr/>
+          <w:p>
+            <w:pPr>
+              <w:pStyle w:val="Compact"/>
+            </w:pPr>
+            <w:r>
+              <w:t xml:space="preserve">MA-RoMa L2-SP (λ = 0.01)</w:t>
+            </w:r>
+          </w:p>
+        </w:tc>
+        <w:tc>
+          <w:tcPr/>
+          <w:p>
+            <w:pPr>
+              <w:pStyle w:val="Compact"/>
+            </w:pPr>
+            <w:r>
+              <w:t xml:space="preserve">direct</w:t>
+            </w:r>
+          </w:p>
+        </w:tc>
+        <w:tc>
+          <w:tcPr/>
+          <w:p>
+            <w:pPr>
+              <w:pStyle w:val="Compact"/>
+              <w:jc w:val="right"/>
+            </w:pPr>
+            <w:r>
+              <w:t xml:space="preserve">0.250 ± 0.000</w:t>
+            </w:r>
+          </w:p>
+        </w:tc>
+        <w:tc>
+          <w:tcPr/>
+          <w:p>
+            <w:pPr>
+              <w:pStyle w:val="Compact"/>
+              <w:jc w:val="right"/>
+            </w:pPr>
+            <w:r>
+              <w:t xml:space="preserve">0.274 ± 0.021</w:t>
+            </w:r>
+          </w:p>
+        </w:tc>
+        <w:tc>
+          <w:tcPr/>
+          <w:p>
+            <w:pPr>
+              <w:pStyle w:val="Compact"/>
+              <w:jc w:val="right"/>
+            </w:pPr>
+            <w:r>
+              <w:t xml:space="preserve">48.1 ± 0.3</w:t>
+            </w:r>
+          </w:p>
+        </w:tc>
+      </w:tr>
+      <w:tr>
+        <w:tc>
+          <w:tcPr/>
+          <w:p>
+            <w:pPr>
+              <w:pStyle w:val="Compact"/>
+            </w:pPr>
+          </w:p>
+        </w:tc>
+        <w:tc>
+          <w:tcPr/>
+          <w:p>
+            <w:pPr>
+              <w:pStyle w:val="Compact"/>
+            </w:pPr>
+            <w:r>
+              <w:t xml:space="preserve">pyramid v2</w:t>
+            </w:r>
+          </w:p>
+        </w:tc>
+        <w:tc>
+          <w:tcPr/>
+          <w:p>
+            <w:pPr>
+              <w:pStyle w:val="Compact"/>
+              <w:jc w:val="right"/>
+            </w:pPr>
+            <w:r>
+              <w:t xml:space="preserve">0.250 ± 0.000</w:t>
+            </w:r>
+          </w:p>
+        </w:tc>
+        <w:tc>
+          <w:tcPr/>
+          <w:p>
+            <w:pPr>
+              <w:pStyle w:val="Compact"/>
+              <w:jc w:val="right"/>
+            </w:pPr>
+            <w:r>
+              <w:t xml:space="preserve">0.274 ± 0.021</w:t>
+            </w:r>
+          </w:p>
+        </w:tc>
+        <w:tc>
+          <w:tcPr/>
+          <w:p>
+            <w:pPr>
+              <w:pStyle w:val="Compact"/>
+              <w:jc w:val="right"/>
+            </w:pPr>
+            <w:r>
+              <w:t xml:space="preserve">50.9 ± 3.6</w:t>
+            </w:r>
+          </w:p>
+        </w:tc>
+      </w:tr>
+    </w:tbl>
+    <w:p>
+      <w:pPr>
+        <w:pStyle w:val="BodyText"/>
+      </w:pPr>
+      <w:r>
+        <w:rPr>
+          <w:b/>
+          <w:bCs/>
+        </w:rPr>
+        <w:t xml:space="preserve">Table 4. Per-seed fine-tuning results</w:t>
+      </w:r>
+      <w:r>
+        <w:t xml:space="preserve"> </w:t>
+      </w:r>
+      <w:r>
+        <w:t xml:space="preserve">(direct match, 28-pair test split) underlying the mean ± SD in Table 2. With three seeds the SD is itself a coarse estimator, so we list the individual runs.</w:t>
       </w:r>
     </w:p>
     <w:tbl>
@@ -1579,285 +2026,6 @@
               <w:pStyle w:val="Compact"/>
             </w:pPr>
             <w:r>
-              <w:t xml:space="preserve">Method (pyramid v2)</w:t>
-            </w:r>
-          </w:p>
-        </w:tc>
-        <w:tc>
-          <w:tcPr/>
-          <w:p>
-            <w:pPr>
-              <w:pStyle w:val="Compact"/>
-              <w:jc w:val="right"/>
-            </w:pPr>
-            <w:r>
-              <w:t xml:space="preserve">SR@5</w:t>
-            </w:r>
-          </w:p>
-        </w:tc>
-        <w:tc>
-          <w:tcPr/>
-          <w:p>
-            <w:pPr>
-              <w:pStyle w:val="Compact"/>
-              <w:jc w:val="right"/>
-            </w:pPr>
-            <w:r>
-              <w:t xml:space="preserve">SR@10</w:t>
-            </w:r>
-          </w:p>
-        </w:tc>
-        <w:tc>
-          <w:tcPr/>
-          <w:p>
-            <w:pPr>
-              <w:pStyle w:val="Compact"/>
-              <w:jc w:val="right"/>
-            </w:pPr>
-            <w:r>
-              <w:t xml:space="preserve">SR@20</w:t>
-            </w:r>
-          </w:p>
-        </w:tc>
-        <w:tc>
-          <w:tcPr/>
-          <w:p>
-            <w:pPr>
-              <w:pStyle w:val="Compact"/>
-              <w:jc w:val="right"/>
-            </w:pPr>
-            <w:r>
-              <w:t xml:space="preserve">med ED (px)</w:t>
-            </w:r>
-          </w:p>
-        </w:tc>
-      </w:tr>
-      <w:tr>
-        <w:tc>
-          <w:tcPr/>
-          <w:p>
-            <w:pPr>
-              <w:pStyle w:val="Compact"/>
-            </w:pPr>
-            <w:r>
-              <w:t xml:space="preserve">MatchAnything-RoMa (zero-shot)</w:t>
-            </w:r>
-          </w:p>
-        </w:tc>
-        <w:tc>
-          <w:tcPr/>
-          <w:p>
-            <w:pPr>
-              <w:pStyle w:val="Compact"/>
-              <w:jc w:val="right"/>
-            </w:pPr>
-            <w:r>
-              <w:t xml:space="preserve">0.036</w:t>
-            </w:r>
-          </w:p>
-        </w:tc>
-        <w:tc>
-          <w:tcPr/>
-          <w:p>
-            <w:pPr>
-              <w:pStyle w:val="Compact"/>
-              <w:jc w:val="right"/>
-            </w:pPr>
-            <w:r>
-              <w:t xml:space="preserve">0.214</w:t>
-            </w:r>
-          </w:p>
-        </w:tc>
-        <w:tc>
-          <w:tcPr/>
-          <w:p>
-            <w:pPr>
-              <w:pStyle w:val="Compact"/>
-              <w:jc w:val="right"/>
-            </w:pPr>
-            <w:r>
-              <w:t xml:space="preserve">0.393</w:t>
-            </w:r>
-          </w:p>
-        </w:tc>
-        <w:tc>
-          <w:tcPr/>
-          <w:p>
-            <w:pPr>
-              <w:pStyle w:val="Compact"/>
-              <w:jc w:val="right"/>
-            </w:pPr>
-            <w:r>
-              <w:t xml:space="preserve">69.1</w:t>
-            </w:r>
-          </w:p>
-        </w:tc>
-      </w:tr>
-      <w:tr>
-        <w:tc>
-          <w:tcPr/>
-          <w:p>
-            <w:pPr>
-              <w:pStyle w:val="Compact"/>
-            </w:pPr>
-            <w:r>
-              <w:t xml:space="preserve">MatchAnything-RoMa (plain fine-tune)</w:t>
-            </w:r>
-          </w:p>
-        </w:tc>
-        <w:tc>
-          <w:tcPr/>
-          <w:p>
-            <w:pPr>
-              <w:pStyle w:val="Compact"/>
-              <w:jc w:val="right"/>
-            </w:pPr>
-            <w:r>
-              <w:t xml:space="preserve">0.000</w:t>
-            </w:r>
-          </w:p>
-        </w:tc>
-        <w:tc>
-          <w:tcPr/>
-          <w:p>
-            <w:pPr>
-              <w:pStyle w:val="Compact"/>
-              <w:jc w:val="right"/>
-            </w:pPr>
-            <w:r>
-              <w:t xml:space="preserve">0.250</w:t>
-            </w:r>
-          </w:p>
-        </w:tc>
-        <w:tc>
-          <w:tcPr/>
-          <w:p>
-            <w:pPr>
-              <w:pStyle w:val="Compact"/>
-              <w:jc w:val="right"/>
-            </w:pPr>
-            <w:r>
-              <w:t xml:space="preserve">0.250</w:t>
-            </w:r>
-          </w:p>
-        </w:tc>
-        <w:tc>
-          <w:tcPr/>
-          <w:p>
-            <w:pPr>
-              <w:pStyle w:val="Compact"/>
-              <w:jc w:val="right"/>
-            </w:pPr>
-            <w:r>
-              <w:t xml:space="preserve">56.7</w:t>
-            </w:r>
-          </w:p>
-        </w:tc>
-      </w:tr>
-      <w:tr>
-        <w:tc>
-          <w:tcPr/>
-          <w:p>
-            <w:pPr>
-              <w:pStyle w:val="Compact"/>
-            </w:pPr>
-            <w:r>
-              <w:t xml:space="preserve">MatchAnything-RoMa (L2-SP λ = 0.01)</w:t>
-            </w:r>
-          </w:p>
-        </w:tc>
-        <w:tc>
-          <w:tcPr/>
-          <w:p>
-            <w:pPr>
-              <w:pStyle w:val="Compact"/>
-              <w:jc w:val="right"/>
-            </w:pPr>
-            <w:r>
-              <w:t xml:space="preserve">0.036</w:t>
-            </w:r>
-          </w:p>
-        </w:tc>
-        <w:tc>
-          <w:tcPr/>
-          <w:p>
-            <w:pPr>
-              <w:pStyle w:val="Compact"/>
-              <w:jc w:val="right"/>
-            </w:pPr>
-            <w:r>
-              <w:t xml:space="preserve">0.214</w:t>
-            </w:r>
-          </w:p>
-        </w:tc>
-        <w:tc>
-          <w:tcPr/>
-          <w:p>
-            <w:pPr>
-              <w:pStyle w:val="Compact"/>
-              <w:jc w:val="right"/>
-            </w:pPr>
-            <w:r>
-              <w:t xml:space="preserve">0.321</w:t>
-            </w:r>
-          </w:p>
-        </w:tc>
-        <w:tc>
-          <w:tcPr/>
-          <w:p>
-            <w:pPr>
-              <w:pStyle w:val="Compact"/>
-              <w:jc w:val="right"/>
-            </w:pPr>
-            <w:r>
-              <w:t xml:space="preserve">41.0</w:t>
-            </w:r>
-          </w:p>
-        </w:tc>
-      </w:tr>
-    </w:tbl>
-    <w:p>
-      <w:pPr>
-        <w:pStyle w:val="BodyText"/>
-      </w:pPr>
-      <w:r>
-        <w:rPr>
-          <w:b/>
-          <w:bCs/>
-        </w:rPr>
-        <w:t xml:space="preserve">Table 4. Per-seed fine-tuning results</w:t>
-      </w:r>
-      <w:r>
-        <w:t xml:space="preserve"> </w:t>
-      </w:r>
-      <w:r>
-        <w:t xml:space="preserve">(direct match, 28-pair test split) underlying the mean ± SD in Table 2. With three seeds the SD is itself a coarse estimator, so we list the individual runs.</w:t>
-      </w:r>
-    </w:p>
-    <w:tbl>
-      <w:tblPr>
-        <w:tblStyle w:val="Table"/>
-        <w:tblW w:type="auto" w:w="0"/>
-        <w:tblLook w:firstRow="1" w:lastRow="0" w:firstColumn="0" w:lastColumn="0" w:noHBand="0" w:noVBand="0" w:val="0020"/>
-      </w:tblPr>
-      <w:tblGrid>
-        <w:gridCol w:w="1584"/>
-        <w:gridCol w:w="1584"/>
-        <w:gridCol w:w="1584"/>
-        <w:gridCol w:w="1584"/>
-        <w:gridCol w:w="1584"/>
-      </w:tblGrid>
-      <w:tr>
-        <w:trPr>
-          <w:tblHeader w:val="on"/>
-        </w:trPr>
-        <w:tc>
-          <w:tcPr/>
-          <w:p>
-            <w:pPr>
-              <w:pStyle w:val="Compact"/>
-            </w:pPr>
-            <w:r>
               <w:t xml:space="preserve">Config</w:t>
             </w:r>
           </w:p>
@@ -2511,7 +2679,7 @@
         <w:pStyle w:val="BodyText"/>
       </w:pPr>
       <w:r>
-        <w:t xml:space="preserve">Several limitations bound these claims. The mutual-information verifier cannot rank transforms within ~10 px of one another, which both caps the wrapper’s benefit on strong backbones and prevents the iterated-zoom machinery from paying off; a learned or GT-free residual verifier is the obvious next lever. The ~10.3 px GT affine residual floors all px-threshold metrics, so AmalgaMatch cannot certify sub-5 px registration and our SR@5 numbers should be read with that floor in mind. The FOV ladder cleanly isolates scale, but it crops real targets rather than acquiring genuinely low-FOV images, so it does not reproduce the texture, detector-noise, and resolution differences of native low-FOV acquisition; its wrapper gains should be read as a controlled lower bound on the mechanism, not as a literal forecast for natively low-FOV pairs. The direct-match fine-tuning and L2-SP numbers are now reported as mean ± SD over three training seeds (Table 2); the pyramid-protocol numbers (Table 3) remain a single seed-0 run, because the multi-seed checkpoints were evaluated in direct mode and not retained, and we flag that table accordingly. In particular, the deployment configuration we recommend, the verified wrapper stacked on the fine-tune, is characterised only at seed 0, so until a pyramid-protocol multi-seed replication is run its variance should be assumed comparable to the direct-protocol spread in Table 2. The 28-pair test split is small, so SR comparisons are low-power and the seed-to-seed scatter is correspondingly large: the single-run SR@10 of 0.25 reported in earlier drafts sat well above the three-seed mean of 0.095 ± 0.021, which is why we now read the fine-tune as a large in-distribution gain accompanied by a modest, seed-noisy SR regression rather than a clean net improvement, and why we do not claim the L2-SP anchor as a reliable fix. A pyramid-protocol multi-seed replication, a formal equivalence test on a larger held-out set, and at least one stronger continual-learning baseline (LoRA-style low-rank adaptation) remain planned and not yet run. Finally, the fine-tuning study rests on 131 training pairs over 12 subclasses; the unrecoverable C103 scene, broken at every seed and anchor strength, shows that breadth of modality coverage rather than optimisation is the remaining bottleneck. The concrete next experiment is to add training pairs in that modality combination and re-evaluate on the same held-out split and FOV ladder used here. We expect a forgetting-robust fine-tune over broad modality coverage, with the verified wrapper reserved for multiscale tasks, to be the deployable configuration for cross-modal microscopy registration.</w:t>
+        <w:t xml:space="preserve">Several limitations bound these claims. The mutual-information verifier cannot rank transforms within ~10 px of one another, which both caps the wrapper’s benefit on strong backbones and prevents the iterated-zoom machinery from paying off; a learned or GT-free residual verifier is the obvious next lever. The ~10.3 px GT affine residual floors all px-threshold metrics, so AmalgaMatch cannot certify sub-5 px registration and our SR@5 numbers should be read with that floor in mind. The FOV ladder cleanly isolates scale, but it crops real targets rather than acquiring genuinely low-FOV images, so it does not reproduce the texture, detector-noise, and resolution differences of native low-FOV acquisition; its wrapper gains should be read as a controlled lower bound on the mechanism, not as a literal forecast for natively low-FOV pairs. Both the direct-match and the pyramid-protocol fine-tuning numbers are now reported as mean ± SD over three training seeds (Tables 2 and 3). Because the original multi-seed checkpoints were not retained, the pyramid-protocol replication retrained seeds 1–3 from scratch under the identical recipe; decoder fine-tuning is not bit-reproducible at fixed seed on our stack (non-deterministic CUDA kernels and multi-worker data loading), so this independent draw sits at a higher direct SR@10 than Table 2 (0.250 versus 0.095). That run-to-run scatter can exceed seed-to-seed scatter at 28 test pairs is itself a caution against over-reading any single-run SR number on this benchmark; the reliable comparison is the within-checkpoint one (direct versus pyramid in Table 3), which shows the recommended deployment configuration, the verified wrapper on the fine-tune, neither gains nor loses over direct matching across seeds. The 28-pair test split is small, so SR comparisons are low-power and the seed-to-seed scatter is correspondingly large: the single-run SR@10 of 0.25 reported in earlier drafts sat well above the three-seed mean of 0.095 ± 0.021, which is why we now read the fine-tune as a large in-distribution gain accompanied by a modest, seed-noisy SR regression rather than a clean net improvement, and why we do not claim the L2-SP anchor as a reliable fix. A formal equivalence test on a larger held-out set and at least one stronger continual-learning baseline (LoRA-style low-rank adaptation) remain planned and not yet run. Finally, the fine-tuning study rests on 131 training pairs over 12 subclasses; the unrecoverable C103 scene, broken at every seed and anchor strength, shows that breadth of modality coverage rather than optimisation is the remaining bottleneck. The concrete next experiment is to add training pairs in that modality combination and re-evaluate on the same held-out split and FOV ladder used here. We expect a forgetting-robust fine-tune over broad modality coverage, with the verified wrapper reserved for multiscale tasks, to be the deployable configuration for cross-modal microscopy registration.</w:t>
       </w:r>
     </w:p>
     <w:bookmarkEnd w:id="20"/>

</xml_diff>

<commit_message>
paper: cut abstract to Sci Rep 200-word limit, soften central claim, add ORCID + Zenodo DOI
</commit_message>
<xml_diff>
--- a/paper/paper.docx
+++ b/paper/paper.docx
@@ -26,7 +26,7 @@
         <w:t xml:space="preserve"> </w:t>
       </w:r>
       <w:r>
-        <w:t xml:space="preserve">Independent Researcher · frankyc11223@gmail.com</w:t>
+        <w:t xml:space="preserve">Independent Researcher · frankyc11223@gmail.com · ORCID: 0009-0003-0041-1459</w:t>
       </w:r>
     </w:p>
     <w:p>
@@ -62,7 +62,7 @@
         <w:pStyle w:val="FirstParagraph"/>
       </w:pPr>
       <w:r>
-        <w:t xml:space="preserve">Correlative materials microscopy pairs images of one specimen across modalities (SEM, EBSD, TEM, optical) that share little visual appearance and often differ in field of view (FOV) by more than an order of magnitude, defeating classical feature-based registration. We asked whether a scale-aware pyramidal patching wrapper around pretrained dense matchers (RoMa, the ELoFTR family, MatchAnything) could lift cross-modal registration on the AmalgaMatch benchmark (187 pairs, 19 material subsets), particularly at severe FOV mismatch. A full controls-and-ablations pass gave three results. A naive tiling pyramid</w:t>
+        <w:t xml:space="preserve">Correlative materials microscopy pairs images of one specimen across modalities (SEM, EBSD, TEM, optical) that share little appearance and can differ in field of view (FOV) by orders of magnitude, defeating classical registration. We tested whether a scale-aware pyramidal wrapper around pretrained dense matchers (RoMa, ELoFTR, MatchAnything) could lift cross-modal registration on AmalgaMatch (187 pairs, 19 subsets). A naive tiling pyramid degrades matchers badly: because they never abstain, every tile floods robust estimation with thousands of confident matches (median error 76→1794 px). A redesigned verified coarse-to-fine wrapper recovers a small but significant gain (SR@10 0.10→0.12,</w:t>
       </w:r>
       <w:r>
         <w:t xml:space="preserve"> </w:t>
@@ -72,13 +72,13 @@
           <w:i/>
           <w:iCs/>
         </w:rPr>
-        <w:t xml:space="preserve">degrades</w:t>
-      </w:r>
-      <w:r>
-        <w:t xml:space="preserve"> </w:t>
-      </w:r>
-      <w:r>
-        <w:t xml:space="preserve">dense matchers badly, because they never abstain: every tile returns thousands of confident matches that flood robust estimation, and median error rises from 76 to 1794 px. A redesigned verified coarse-to-fine wrapper recovers a small but significant gain (success rate at 10 px, SR@10, 0.10 → 0.12,</w:t>
+        <w:t xml:space="preserve">p</w:t>
+      </w:r>
+      <w:r>
+        <w:t xml:space="preserve"> </w:t>
+      </w:r>
+      <w:r>
+        <w:t xml:space="preserve">= 0.017) without losing any pair, yet FOV ≤5% success stays zero. The largest lever was the backbone: cross-modal-trained MatchAnything-RoMa gave the only significant gain over zero-shot (SR@10 +0.032,</w:t>
       </w:r>
       <w:r>
         <w:t xml:space="preserve"> </w:t>
@@ -94,7 +94,7 @@
         <w:t xml:space="preserve"> </w:t>
       </w:r>
       <w:r>
-        <w:t xml:space="preserve">= 0.017) without losing any pair, yet success at FOV ≤ 5 % stays at zero. The largest off-the-shelf lever was instead the backbone. Cross-modal-trained MatchAnything-RoMa weights gave the only significant gain over the zero-shot bar (SR@10 +0.032,</w:t>
+        <w:t xml:space="preserve">= 0.018), among high-FOV pairs. A controlled FOV ladder isolating scale (appearance fixed) shows the wrapper triples success at 10% FOV (0.07→0.23,</w:t>
       </w:r>
       <w:r>
         <w:t xml:space="preserve"> </w:t>
@@ -110,23 +110,7 @@
         <w:t xml:space="preserve"> </w:t>
       </w:r>
       <w:r>
-        <w:t xml:space="preserve">= 0.018), and that gain sat entirely among high-FOV pairs. The pattern points to the dominant constraint on this benchmark: cross-modal appearance, not scale, is what fails. A controlled FOV-ladder experiment crops real base-matchable pairs to sweep FOV with appearance held fixed, and with scale thus isolated the same wrapper triples success at 10 % FOV (SR@10 0.07 → 0.23,</w:t>
-      </w:r>
-      <w:r>
-        <w:t xml:space="preserve"> </w:t>
-      </w:r>
-      <w:r>
-        <w:rPr>
-          <w:i/>
-          <w:iCs/>
-        </w:rPr>
-        <w:t xml:space="preserve">p</w:t>
-      </w:r>
-      <w:r>
-        <w:t xml:space="preserve"> </w:t>
-      </w:r>
-      <w:r>
-        <w:t xml:space="preserve">= 0.0014). The scale mechanism is therefore sound, and the real distribution simply never presents scale as the isolated failure mode. Decoder-only fine-tuning of MatchAnything-RoMa on 131 held-out-split training pairs then cut median error on in-distribution TEM pairs about 5× (~321 → 62 px), but across three training seeds it regressed overall SR@20 modestly (0.393 → 0.30 ± 0.04) by forgetting modality combinations absent from training. A one-line L2-SP weight anchor does not change this within seed variance, so we report it as a zero-cost floor rather than a fix; the one seed-robust forgetting effect is a single modality combination that no anchor recovers, which points to breadth of training coverage rather than the optimiser as the remaining bottleneck. Deployable cross-modal microscopy registration therefore needs a forgetting-robust domain fine-tune over broad modality coverage, with the verified pyramid wrapper as a complementary scale layer for genuinely multiscale tasks. Because the appearance conclusion is reached by elimination rather than by an appearance-swept experiment, we present it as the dominant factor on AmalgaMatch and not as a property of cross-modal microscopy in general.</w:t>
+        <w:t xml:space="preserve">= 0.0014), so the scale mechanism is sound. Decoder-only fine-tuning cut in-distribution TEM error ~5×, but across three seeds regressed SR@20 (0.393→0.30) by forgetting untrained modalities, which L2-SP did not fix. Appearance, not scale, is the dominant uncontrolled factor on AmalgaMatch, reached by elimination rather than a direct appearance sweep.</w:t>
       </w:r>
     </w:p>
     <w:p>
@@ -2874,7 +2858,7 @@
         <w:pStyle w:val="FirstParagraph"/>
       </w:pPr>
       <w:r>
-        <w:t xml:space="preserve">The AmalgaMatch dataset is publicly available from the Fraunhofer Fordatis repository (doi:10.24406/fordatis/436) [2]. The analysis code, evaluation harness, and result-regeneration scripts are openly available at https://github.com/fronkt/correlative-microscopy-alignment; all tables and figures regenerate from the released result files via the scripts referenced therein. Fine-tuned model checkpoints (445 MB) are available from the author on reasonable request.</w:t>
+        <w:t xml:space="preserve">The AmalgaMatch dataset is publicly available from the Fraunhofer Fordatis repository (doi:10.24406/fordatis/436) [2]. The analysis code, evaluation harness, and result-regeneration scripts are openly available at https://github.com/fronkt/correlative-microscopy-alignment and archived at Zenodo (doi:10.5281/zenodo.20819649); all tables and figures regenerate from the released result files via the scripts referenced therein. Fine-tuned model checkpoints (445 MB) are available from the author on reasonable request.</w:t>
       </w:r>
     </w:p>
     <w:bookmarkEnd w:id="22"/>

</xml_diff>

<commit_message>
paper: trim title to 14 words and soften to comparative claim for Sci Rep
</commit_message>
<xml_diff>
--- a/paper/paper.docx
+++ b/paper/paper.docx
@@ -2,13 +2,13 @@
 <file path=word/document.xml><?xml version="1.0" encoding="utf-8"?>
 <w:document xmlns:w="http://schemas.openxmlformats.org/wordprocessingml/2006/main" xmlns:m="http://schemas.openxmlformats.org/officeDocument/2006/math" xmlns:r="http://schemas.openxmlformats.org/officeDocument/2006/relationships" xmlns:o="urn:schemas-microsoft-com:office:office" xmlns:v="urn:schemas-microsoft-com:vml" xmlns:w10="urn:schemas-microsoft-com:office:word" xmlns:a="http://schemas.openxmlformats.org/drawingml/2006/main" xmlns:pic="http://schemas.openxmlformats.org/drawingml/2006/picture" xmlns:wp="http://schemas.openxmlformats.org/drawingml/2006/wordprocessingDrawing">
   <w:body>
-    <w:bookmarkStart w:id="44" w:name="X6808c8cffb36cd7c71942a068da11385ef6f4db"/>
+    <w:bookmarkStart w:id="44" w:name="X5e691bb8d40d9da2219e593273003a83d0e50ce"/>
     <w:p>
       <w:pPr>
         <w:pStyle w:val="Heading1"/>
       </w:pPr>
       <w:r>
-        <w:t xml:space="preserve">Cross-modal appearance, not field-of-view mismatch, is the dominant constraint on foundation-model registration in the AmalgaMatch correlative-microscopy benchmark</w:t>
+        <w:t xml:space="preserve">For foundation-model registration in correlative microscopy, cross-modal appearance matters more than field of view</w:t>
       </w:r>
     </w:p>
     <w:p>

</xml_diff>

<commit_message>
Fold 5 new fine-tune seeds into 8-seed variance tables; merge direct/pyramid into one table
</commit_message>
<xml_diff>
--- a/paper/paper.docx
+++ b/paper/paper.docx
@@ -110,7 +110,7 @@
         <w:t xml:space="preserve"> </w:t>
       </w:r>
       <w:r>
-        <w:t xml:space="preserve">= 0.0014), so the scale mechanism is sound. Decoder-only fine-tuning cut in-distribution TEM error ~5×, but across three seeds regressed SR@20 (0.393→0.30) by forgetting untrained modalities, which L2-SP did not fix. Appearance, not scale, is the dominant uncontrolled factor on AmalgaMatch, reached by elimination rather than a direct appearance sweep.</w:t>
+        <w:t xml:space="preserve">= 0.0014), so the scale mechanism is sound. Decoder-only fine-tuning cut in-distribution TEM error ~5×, but across eight seeds regressed SR@20 (0.393→0.26) by forgetting untrained modalities, which L2-SP did not fix. Appearance, not scale, is the dominant uncontrolled factor on AmalgaMatch, reached by elimination rather than a direct appearance sweep.</w:t>
       </w:r>
     </w:p>
     <w:p>
@@ -1529,7 +1529,7 @@
         <w:pStyle w:val="BodyText"/>
       </w:pPr>
       <w:r>
-        <w:t xml:space="preserve">The aggregate test result (Table 2) hides two opposite effects that a per-subclass cut separates. In-distribution, fine-tuning works hard: the 16 TEM dislocation test pairs (50 TEM pairs in training) improved median ED from 320.8 to 61.8 px, a 5.2× reduction and the single largest metric movement we saw, although the improvement runs mostly from ~320 to ~60 px and so stays above the 20 px bar, where SR barely registers it. Off-distribution, the model forgets: the C103 SEM-SE↔LOM-height subclass has zero training pairs and exists only in val/test, so it probes catastrophic forgetting directly. This subclass holds two scenes (two test pairs each). Across three training seeds the second scene is unrecoverable in every run, plain or anchored (residual 370–1400 px against a ~12 px zero-shot baseline), which marks a genuine modality-coverage gap rather than an optimisation failure. The first scene is more fragile than seed-stable: the plain fine-tune retains it across all three seeds (≤31 px), but it is exactly this scene that the originally reported single run (seed 0) broke (80/1220 px), so the headline</w:t>
+        <w:t xml:space="preserve">The aggregate test result (Table 2) hides two opposite effects that a per-subclass cut separates. In-distribution, fine-tuning works hard: the 16 TEM dislocation test pairs (50 TEM pairs in training) improved median ED from 320.8 to 61.8 px, a 5.2× reduction and the single largest metric movement we saw, although the improvement runs mostly from ~320 to ~60 px and so stays above the 20 px bar, where SR barely registers it. Off-distribution, the model forgets: the C103 SEM-SE↔LOM-height subclass has zero training pairs and exists only in val/test, so it probes catastrophic forgetting directly. This subclass holds two scenes (two test pairs each). Across the three seeds examined at the per-scene level (seeds 1–3) the second scene is unrecoverable in every run, plain or anchored (residual 370–1400 px against a ~12 px zero-shot baseline), which marks a genuine modality-coverage gap rather than an optimisation failure. The first scene is more fragile than seed-stable: the plain fine-tune retains it across all three seeds (≤31 px), but it is exactly this scene that the originally reported single run (seed 0) broke (80/1220 px), so the headline</w:t>
       </w:r>
       <w:r>
         <w:t xml:space="preserve"> </w:t>
@@ -1541,7 +1541,7 @@
         <w:t xml:space="preserve"> </w:t>
       </w:r>
       <w:r>
-        <w:t xml:space="preserve">of the recoverable scene is itself a seed-dependent event. What is seed-robust is the unrecoverable second scene and the resulting modest SR@20 regression relative to zero-shot (0.393 → 0.30 ± 0.04 over three seeds); with only two C103 pairs in validation, a median selection metric cannot see this damage in any run. A FOV-ladder analysis on the fine-tuned backbone (same 63-pair testbed) confirms that the direction is right but partly redundant with the wrapper. Fine-tuning helps the moderate-FOV regime, holding SR@10 0.37–0.39 at rung 0.25 against 0.28–0.30 for the zero-shot model, and the pyramid still adds a significant but roughly halved scale lift at the severe 0.1 rung (+0.078, CI [+0.020, +0.157],</w:t>
+        <w:t xml:space="preserve">of the recoverable scene is itself a seed-dependent event. What is seed-robust is the unrecoverable second scene (seeds 1–3) and the resulting modest SR@20 regression relative to zero-shot (0.393 → 0.26 ± 0.02 over eight seeds); with only two C103 pairs in validation, a median selection metric cannot see this damage in any run. A FOV-ladder analysis on the fine-tuned backbone (same 63-pair testbed) confirms that the direction is right but partly redundant with the wrapper. Fine-tuning helps the moderate-FOV regime, holding SR@10 0.37–0.39 at rung 0.25 against 0.28–0.30 for the zero-shot model, and the pyramid still adds a significant but roughly halved scale lift at the severe 0.1 rung (+0.078, CI [+0.020, +0.157],</w:t>
       </w:r>
       <w:r>
         <w:t xml:space="preserve"> </w:t>
@@ -1569,375 +1569,13 @@
           <w:b/>
           <w:bCs/>
         </w:rPr>
-        <w:t xml:space="preserve">Table 2. Decoder-only fine-tuning on the held-out 28-pair test split: mean ± SD over three training seeds</w:t>
-      </w:r>
-      <w:r>
-        <w:t xml:space="preserve"> </w:t>
-      </w:r>
-      <w:r>
-        <w:t xml:space="preserve">(direct match, TPS-refined ED). Zero-shot is deterministic (single value); SR@5 ≈ 0 throughout (the ~10.3 px GT affine-residual floor) and is omitted.</w:t>
-      </w:r>
-    </w:p>
-    <w:tbl>
-      <w:tblPr>
-        <w:tblStyle w:val="Table"/>
-        <w:tblW w:type="pct" w:w="5000"/>
-        <w:tblLayout w:type="fixed"/>
-        <w:tblLook w:firstRow="1" w:lastRow="0" w:firstColumn="0" w:lastColumn="0" w:noHBand="0" w:noVBand="0" w:val="0020"/>
-      </w:tblPr>
-      <w:tblGrid>
-        <w:gridCol w:w="1584"/>
-        <w:gridCol w:w="2112"/>
-        <w:gridCol w:w="2112"/>
-        <w:gridCol w:w="2112"/>
-      </w:tblGrid>
-      <w:tr>
-        <w:trPr>
-          <w:tblHeader w:val="on"/>
-        </w:trPr>
-        <w:tc>
-          <w:tcPr/>
-          <w:p>
-            <w:pPr>
-              <w:pStyle w:val="Compact"/>
-            </w:pPr>
-            <w:r>
-              <w:t xml:space="preserve">Method (direct match)</w:t>
-            </w:r>
-          </w:p>
-        </w:tc>
-        <w:tc>
-          <w:tcPr/>
-          <w:p>
-            <w:pPr>
-              <w:pStyle w:val="Compact"/>
-              <w:jc w:val="right"/>
-            </w:pPr>
-            <w:r>
-              <w:t xml:space="preserve">SR@10</w:t>
-            </w:r>
-          </w:p>
-        </w:tc>
-        <w:tc>
-          <w:tcPr/>
-          <w:p>
-            <w:pPr>
-              <w:pStyle w:val="Compact"/>
-              <w:jc w:val="right"/>
-            </w:pPr>
-            <w:r>
-              <w:t xml:space="preserve">SR@20</w:t>
-            </w:r>
-          </w:p>
-        </w:tc>
-        <w:tc>
-          <w:tcPr/>
-          <w:p>
-            <w:pPr>
-              <w:pStyle w:val="Compact"/>
-              <w:jc w:val="right"/>
-            </w:pPr>
-            <w:r>
-              <w:t xml:space="preserve">med ED (px)</w:t>
-            </w:r>
-          </w:p>
-        </w:tc>
-      </w:tr>
-      <w:tr>
-        <w:tc>
-          <w:tcPr/>
-          <w:p>
-            <w:pPr>
-              <w:pStyle w:val="Compact"/>
-            </w:pPr>
-            <w:r>
-              <w:t xml:space="preserve">MatchAnything-RoMa (zero-shot)</w:t>
-            </w:r>
-          </w:p>
-        </w:tc>
-        <w:tc>
-          <w:tcPr/>
-          <w:p>
-            <w:pPr>
-              <w:pStyle w:val="Compact"/>
-              <w:jc w:val="right"/>
-            </w:pPr>
-            <w:r>
-              <w:t xml:space="preserve">0.214</w:t>
-            </w:r>
-          </w:p>
-        </w:tc>
-        <w:tc>
-          <w:tcPr/>
-          <w:p>
-            <w:pPr>
-              <w:pStyle w:val="Compact"/>
-              <w:jc w:val="right"/>
-            </w:pPr>
-            <w:r>
-              <w:t xml:space="preserve">0.393</w:t>
-            </w:r>
-          </w:p>
-        </w:tc>
-        <w:tc>
-          <w:tcPr/>
-          <w:p>
-            <w:pPr>
-              <w:pStyle w:val="Compact"/>
-              <w:jc w:val="right"/>
-            </w:pPr>
-            <w:r>
-              <w:t xml:space="preserve">83.5</w:t>
-            </w:r>
-          </w:p>
-        </w:tc>
-      </w:tr>
-      <w:tr>
-        <w:tc>
-          <w:tcPr/>
-          <w:p>
-            <w:pPr>
-              <w:pStyle w:val="Compact"/>
-            </w:pPr>
-            <w:r>
-              <w:t xml:space="preserve">MatchAnything-RoMa (plain fine-tune, λ = 0)</w:t>
-            </w:r>
-          </w:p>
-        </w:tc>
-        <w:tc>
-          <w:tcPr/>
-          <w:p>
-            <w:pPr>
-              <w:pStyle w:val="Compact"/>
-              <w:jc w:val="right"/>
-            </w:pPr>
-            <w:r>
-              <w:t xml:space="preserve">0.095 ± 0.021</w:t>
-            </w:r>
-          </w:p>
-        </w:tc>
-        <w:tc>
-          <w:tcPr/>
-          <w:p>
-            <w:pPr>
-              <w:pStyle w:val="Compact"/>
-              <w:jc w:val="right"/>
-            </w:pPr>
-            <w:r>
-              <w:t xml:space="preserve">0.298 ± 0.041</w:t>
-            </w:r>
-          </w:p>
-        </w:tc>
-        <w:tc>
-          <w:tcPr/>
-          <w:p>
-            <w:pPr>
-              <w:pStyle w:val="Compact"/>
-              <w:jc w:val="right"/>
-            </w:pPr>
-            <w:r>
-              <w:t xml:space="preserve">46.0 ± 3.9</w:t>
-            </w:r>
-          </w:p>
-        </w:tc>
-      </w:tr>
-      <w:tr>
-        <w:tc>
-          <w:tcPr/>
-          <w:p>
-            <w:pPr>
-              <w:pStyle w:val="Compact"/>
-            </w:pPr>
-            <w:r>
-              <w:t xml:space="preserve">MatchAnything-RoMa (L2-SP, λ = 0.01)</w:t>
-            </w:r>
-          </w:p>
-        </w:tc>
-        <w:tc>
-          <w:tcPr/>
-          <w:p>
-            <w:pPr>
-              <w:pStyle w:val="Compact"/>
-              <w:jc w:val="right"/>
-            </w:pPr>
-            <w:r>
-              <w:t xml:space="preserve">0.095 ± 0.021</w:t>
-            </w:r>
-          </w:p>
-        </w:tc>
-        <w:tc>
-          <w:tcPr/>
-          <w:p>
-            <w:pPr>
-              <w:pStyle w:val="Compact"/>
-              <w:jc w:val="right"/>
-            </w:pPr>
-            <w:r>
-              <w:t xml:space="preserve">0.274 ± 0.021</w:t>
-            </w:r>
-          </w:p>
-        </w:tc>
-        <w:tc>
-          <w:tcPr/>
-          <w:p>
-            <w:pPr>
-              <w:pStyle w:val="Compact"/>
-              <w:jc w:val="right"/>
-            </w:pPr>
-            <w:r>
-              <w:t xml:space="preserve">56.3 ± 6.2</w:t>
-            </w:r>
-          </w:p>
-        </w:tc>
-      </w:tr>
-    </w:tbl>
-    <w:p>
-      <w:pPr>
-        <w:pStyle w:val="BodyText"/>
-      </w:pPr>
-      <w:r>
-        <w:t xml:space="preserve">Across seeds the plain and L2-SP fine-tunes are statistically indistinguishable on every metric (overlapping ± SD), so the anchor is a zero-cost floor rather than a reliable improvement at this data budget. Both regress SR@20 modestly relative to zero-shot (0.393 → 0.30 / 0.27), within the resolution of a 28-pair test, while sharply improving in-distribution TEM median ED (~5× from ~321 px, seed-robust). The regression tracks forgetting of the untrained C103 SEM-SE↔LOM-height combination, of which one scene is unrecoverable at every seed and anchor.</w:t>
-      </w:r>
-    </w:p>
-    <w:bookmarkEnd w:id="31"/>
-    <w:bookmarkStart w:id="32" w:name="Xa47a5224f2d818e2f7897b7fc3f301b72372759"/>
-    <w:p>
-      <w:pPr>
-        <w:pStyle w:val="Heading3"/>
-      </w:pPr>
-      <w:r>
-        <w:t xml:space="preserve">A one-line weight anchor, tested across seeds</w:t>
-      </w:r>
-    </w:p>
-    <w:p>
-      <w:pPr>
-        <w:pStyle w:val="FirstParagraph"/>
-      </w:pPr>
-      <w:r>
-        <w:t xml:space="preserve">The forgetting is the only thing standing between this fine-tune and a net-positive intervention, so we tested the lightest-touch mitigation, L2-SP weight anchoring [12]. The identical decoder-only recipe gains a single penalty (λ/2)‖θ_dec − θ_dec⁰‖² that pulls the decoder back toward its zero-shot initialisation, with no replay corpus, no architecture change, and no extra parameters. We swept λ ∈ {0, 0.01, 0.1, 1.0}, where λ = 0 reproduces the plain fine-tune, selecting the step per run by minimum validation median ED and the λ by held-out</w:t>
-      </w:r>
-      <w:r>
-        <w:t xml:space="preserve"> </w:t>
-      </w:r>
-      <w:r>
-        <w:rPr>
-          <w:i/>
-          <w:iCs/>
-        </w:rPr>
-        <w:t xml:space="preserve">test</w:t>
-      </w:r>
-      <w:r>
-        <w:t xml:space="preserve">-split retention, because validation cannot see the C103 damage.</w:t>
-      </w:r>
-    </w:p>
-    <w:p>
-      <w:pPr>
-        <w:pStyle w:val="BodyText"/>
-      </w:pPr>
-      <w:r>
-        <w:t xml:space="preserve">In a single seed-0 run the anchor looked like a clear win. At λ = 0.01 the recoverable C103 scene, the scene that run broke, dropped from 80/1220 px back to 16/24 px, close to zero-shot’s ~12 px, while the other C103 scene stayed broken at every λ; heavier anchoring (λ = 0.1, 1.0) bought no further retention and cost both in-distribution gain and training stability, as the certainty head decalibrated into transient all-fail validation epochs whose onset moved earlier as λ grew. On that single run, L2-SP λ = 0.01 improved median ED over the plain fine-tune by 15.6 px (CI [−49.8, −2.4],</w:t>
-      </w:r>
-      <w:r>
-        <w:t xml:space="preserve"> </w:t>
-      </w:r>
-      <w:r>
-        <w:rPr>
-          <w:i/>
-          <w:iCs/>
-        </w:rPr>
-        <w:t xml:space="preserve">p</w:t>
-      </w:r>
-      <w:r>
-        <w:t xml:space="preserve"> </w:t>
-      </w:r>
-      <w:r>
-        <w:t xml:space="preserve">= 0.0046) and shrank the SR@20 deficit against zero-shot to −0.071 (CI [−0.214, +0.071],</w:t>
-      </w:r>
-      <w:r>
-        <w:t xml:space="preserve"> </w:t>
-      </w:r>
-      <w:r>
-        <w:rPr>
-          <w:i/>
-          <w:iCs/>
-        </w:rPr>
-        <w:t xml:space="preserve">p</w:t>
-      </w:r>
-      <w:r>
-        <w:t xml:space="preserve"> </w:t>
-      </w:r>
-      <w:r>
-        <w:t xml:space="preserve">= 0.91). Neither edge generalises: the three-seed direct analysis below and a matched three-seed replication under the pyramid deployment protocol (Table 3) both leave L2-SP and the plain fine-tune indistinguishable.</w:t>
-      </w:r>
-    </w:p>
-    <w:p>
-      <w:pPr>
-        <w:pStyle w:val="BodyText"/>
-      </w:pPr>
-      <w:r>
-        <w:t xml:space="preserve">Three training seeds temper that reading. Re-running the plain (λ = 0) and anchored (λ = 0.01) fine-tunes at seeds 1–3 with the identical recipe and direct-match evaluation (Table 2) leaves the two configurations statistically indistinguishable on every test metric: SR@10 0.095 ± 0.021 for both, SR@20 0.298 ± 0.041 (plain) versus 0.274 ± 0.021 (L2-SP), median ED 46.0 ± 3.9 versus 56.3 ± 6.2 px (per-seed values in Table 4). The single-run median-ED edge does not survive as a cross-seed effect, and on the recoverable C103 scene the anchor is if anything less stable than the plain fine-tune, retaining it in one of three seeds against three of three for λ = 0. The one effect that is robust across all six runs is the opposite of an anchor success: the second C103 scene is unrecoverable at every seed and every λ, which marks a modality-coverage gap rather than an optimisation choice. We therefore report L2-SP as a deliberately zero-cost floor that does not worsen the fine-tune rather than as a reliable forgetting fix, and we expect stronger continual-learning methods such as experience replay, elastic weight consolidation [14], or LoRA-style low-rank updates [13] to be needed for a seed-robust improvement; quantifying that is left to future work. With only 28 test pairs the SR@20 comparisons are low-power, so the regression should be read as</w:t>
-      </w:r>
-      <w:r>
-        <w:t xml:space="preserve"> </w:t>
-      </w:r>
-      <w:r>
-        <w:t xml:space="preserve">“modest and within seed noise”</w:t>
-      </w:r>
-      <w:r>
-        <w:t xml:space="preserve"> </w:t>
-      </w:r>
-      <w:r>
-        <w:t xml:space="preserve">rather than as proven equivalence, and a formal equivalence test on a larger held-out set is planned. Re-training seeds 1–3 and evaluating both protocols on the same checkpoints (Table 3) shows the verified wrapper neither helps nor hurts the fine-tuned backbone on the real test split, with pyramid and direct SR@20 coinciding at 0.262 (plain) and 0.274 (L2-SP); this is consistent with the FOV-ladder result that scale and appearance failures overlap in the real distribution, so here the wrapper and the fine-tune do not stack. Lifting SR@20</w:t>
-      </w:r>
-      <w:r>
-        <w:t xml:space="preserve"> </w:t>
-      </w:r>
-      <w:r>
-        <w:rPr>
-          <w:i/>
-          <w:iCs/>
-        </w:rPr>
-        <w:t xml:space="preserve">above</w:t>
-      </w:r>
-      <w:r>
-        <w:t xml:space="preserve"> </w:t>
-      </w:r>
-      <w:r>
-        <w:t xml:space="preserve">zero-shot additionally requires closing the unrecoverable-modality gap, which needs training coverage of that modality combination and not a better optimiser.</w:t>
-      </w:r>
-    </w:p>
-    <w:p>
-      <w:pPr>
-        <w:pStyle w:val="BodyText"/>
-      </w:pPr>
-      <w:r>
-        <w:rPr>
-          <w:b/>
-          <w:bCs/>
-        </w:rPr>
-        <w:t xml:space="preserve">Table 3. Verified wrapper on the fine-tuned backbone, three-seed replication</w:t>
-      </w:r>
-      <w:r>
-        <w:t xml:space="preserve"> </w:t>
-      </w:r>
-      <w:r>
-        <w:t xml:space="preserve">(seeds 1–3; 28-pair held-out test split; TPS-refined ED; zero-shot deterministic). These checkpoints were retrained for the pyramid evaluation because the original multi-seed checkpoints (Table 2) were not retained; decoder fine-tuning is not bit-reproducible at fixed seed on our stack (non-deterministic CUDA kernels, multi-worker data loading), so this independent draw lands at a higher direct SR@10 (0.250 vs the 0.095 ± 0.021 of Table 2) — run-to-run scatter exceeds seed-to-seed scatter at 28 pairs, itself part of the variance story. The controlled comparison is therefore</w:t>
-      </w:r>
-      <w:r>
-        <w:t xml:space="preserve"> </w:t>
-      </w:r>
-      <w:r>
-        <w:rPr>
-          <w:i/>
-          <w:iCs/>
-        </w:rPr>
-        <w:t xml:space="preserve">within</w:t>
-      </w:r>
-      <w:r>
-        <w:t xml:space="preserve"> </w:t>
-      </w:r>
-      <w:r>
-        <w:t xml:space="preserve">this table, where each direct/pyramid pair shares a checkpoint: the wrapper does not stack on the fine-tune (SR@20 unchanged at 0.262/0.274; median ED within ±2 px), and the seed-0 L2-SP pyramid advantage reported in earlier drafts (SR@20 0.321, median ED 41 px) does not replicate — across seeds 1–3 L2-SP and the plain fine-tune are indistinguishable (SR@20 0.274 ± 0.021 vs 0.262 ± 0.021). The anchor remains a zero-cost floor, not a reliable improvement, under the pyramid deployment protocol as well as the direct one.</w:t>
+        <w:t xml:space="preserve">Table 2. Decoder-only fine-tuning on the held-out 28-pair test split: mean ± SD over eight training seeds</w:t>
+      </w:r>
+      <w:r>
+        <w:t xml:space="preserve"> </w:t>
+      </w:r>
+      <w:r>
+        <w:t xml:space="preserve">(TPS-refined ED; zero-shot deterministic). Both deployment protocols — direct match and the verified pyramid-v2 wrapper — are evaluated on the same per-seed checkpoints. SR@5 ≈ 0 throughout (the ~10.3 px GT affine-residual floor) and is omitted.</w:t>
       </w:r>
     </w:p>
     <w:tbl>
@@ -1965,7 +1603,7 @@
               <w:pStyle w:val="Compact"/>
             </w:pPr>
             <w:r>
-              <w:t xml:space="preserve">Method (3-seed mean ± SD)</w:t>
+              <w:t xml:space="preserve">Method (8-seed mean ± SD)</w:t>
             </w:r>
           </w:p>
         </w:tc>
@@ -2165,31 +1803,31 @@
               <w:jc w:val="right"/>
             </w:pPr>
             <w:r>
-              <w:t xml:space="preserve">0.250 ± 0.000</w:t>
-            </w:r>
-          </w:p>
-        </w:tc>
-        <w:tc>
-          <w:tcPr/>
-          <w:p>
-            <w:pPr>
-              <w:pStyle w:val="Compact"/>
-              <w:jc w:val="right"/>
-            </w:pPr>
-            <w:r>
-              <w:t xml:space="preserve">0.262 ± 0.021</w:t>
-            </w:r>
-          </w:p>
-        </w:tc>
-        <w:tc>
-          <w:tcPr/>
-          <w:p>
-            <w:pPr>
-              <w:pStyle w:val="Compact"/>
-              <w:jc w:val="right"/>
-            </w:pPr>
-            <w:r>
-              <w:t xml:space="preserve">52.4 ± 5.2</w:t>
+              <w:t xml:space="preserve">0.236 ± 0.019</w:t>
+            </w:r>
+          </w:p>
+        </w:tc>
+        <w:tc>
+          <w:tcPr/>
+          <w:p>
+            <w:pPr>
+              <w:pStyle w:val="Compact"/>
+              <w:jc w:val="right"/>
+            </w:pPr>
+            <w:r>
+              <w:t xml:space="preserve">0.264 ± 0.019</w:t>
+            </w:r>
+          </w:p>
+        </w:tc>
+        <w:tc>
+          <w:tcPr/>
+          <w:p>
+            <w:pPr>
+              <w:pStyle w:val="Compact"/>
+              <w:jc w:val="right"/>
+            </w:pPr>
+            <w:r>
+              <w:t xml:space="preserve">49.6 ± 3.7</w:t>
             </w:r>
           </w:p>
         </w:tc>
@@ -2222,31 +1860,31 @@
               <w:jc w:val="right"/>
             </w:pPr>
             <w:r>
-              <w:t xml:space="preserve">0.226 ± 0.021</w:t>
-            </w:r>
-          </w:p>
-        </w:tc>
-        <w:tc>
-          <w:tcPr/>
-          <w:p>
-            <w:pPr>
-              <w:pStyle w:val="Compact"/>
-              <w:jc w:val="right"/>
-            </w:pPr>
-            <w:r>
-              <w:t xml:space="preserve">0.262 ± 0.021</w:t>
-            </w:r>
-          </w:p>
-        </w:tc>
-        <w:tc>
-          <w:tcPr/>
-          <w:p>
-            <w:pPr>
-              <w:pStyle w:val="Compact"/>
-              <w:jc w:val="right"/>
-            </w:pPr>
-            <w:r>
-              <w:t xml:space="preserve">49.6 ± 3.1</w:t>
+              <w:t xml:space="preserve">0.228 ± 0.027</w:t>
+            </w:r>
+          </w:p>
+        </w:tc>
+        <w:tc>
+          <w:tcPr/>
+          <w:p>
+            <w:pPr>
+              <w:pStyle w:val="Compact"/>
+              <w:jc w:val="right"/>
+            </w:pPr>
+            <w:r>
+              <w:t xml:space="preserve">0.264 ± 0.019</w:t>
+            </w:r>
+          </w:p>
+        </w:tc>
+        <w:tc>
+          <w:tcPr/>
+          <w:p>
+            <w:pPr>
+              <w:pStyle w:val="Compact"/>
+              <w:jc w:val="right"/>
+            </w:pPr>
+            <w:r>
+              <w:t xml:space="preserve">49.5 ± 3.1</w:t>
             </w:r>
           </w:p>
         </w:tc>
@@ -2294,19 +1932,19 @@
               <w:jc w:val="right"/>
             </w:pPr>
             <w:r>
-              <w:t xml:space="preserve">0.274 ± 0.021</w:t>
-            </w:r>
-          </w:p>
-        </w:tc>
-        <w:tc>
-          <w:tcPr/>
-          <w:p>
-            <w:pPr>
-              <w:pStyle w:val="Compact"/>
-              <w:jc w:val="right"/>
-            </w:pPr>
-            <w:r>
-              <w:t xml:space="preserve">48.1 ± 0.3</w:t>
+              <w:t xml:space="preserve">0.268 ± 0.019</w:t>
+            </w:r>
+          </w:p>
+        </w:tc>
+        <w:tc>
+          <w:tcPr/>
+          <w:p>
+            <w:pPr>
+              <w:pStyle w:val="Compact"/>
+              <w:jc w:val="right"/>
+            </w:pPr>
+            <w:r>
+              <w:t xml:space="preserve">50.8 ± 8.1</w:t>
             </w:r>
           </w:p>
         </w:tc>
@@ -2339,31 +1977,31 @@
               <w:jc w:val="right"/>
             </w:pPr>
             <w:r>
-              <w:t xml:space="preserve">0.250 ± 0.000</w:t>
-            </w:r>
-          </w:p>
-        </w:tc>
-        <w:tc>
-          <w:tcPr/>
-          <w:p>
-            <w:pPr>
-              <w:pStyle w:val="Compact"/>
-              <w:jc w:val="right"/>
-            </w:pPr>
-            <w:r>
-              <w:t xml:space="preserve">0.274 ± 0.021</w:t>
-            </w:r>
-          </w:p>
-        </w:tc>
-        <w:tc>
-          <w:tcPr/>
-          <w:p>
-            <w:pPr>
-              <w:pStyle w:val="Compact"/>
-              <w:jc w:val="right"/>
-            </w:pPr>
-            <w:r>
-              <w:t xml:space="preserve">50.9 ± 3.6</w:t>
+              <w:t xml:space="preserve">0.245 ± 0.023</w:t>
+            </w:r>
+          </w:p>
+        </w:tc>
+        <w:tc>
+          <w:tcPr/>
+          <w:p>
+            <w:pPr>
+              <w:pStyle w:val="Compact"/>
+              <w:jc w:val="right"/>
+            </w:pPr>
+            <w:r>
+              <w:t xml:space="preserve">0.272 ± 0.019</w:t>
+            </w:r>
+          </w:p>
+        </w:tc>
+        <w:tc>
+          <w:tcPr/>
+          <w:p>
+            <w:pPr>
+              <w:pStyle w:val="Compact"/>
+              <w:jc w:val="right"/>
+            </w:pPr>
+            <w:r>
+              <w:t xml:space="preserve">50.2 ± 6.6</w:t>
             </w:r>
           </w:p>
         </w:tc>
@@ -2374,17 +2012,132 @@
         <w:pStyle w:val="BodyText"/>
       </w:pPr>
       <w:r>
+        <w:t xml:space="preserve">Across eight seeds the plain and L2-SP fine-tunes are statistically indistinguishable on every metric (overlapping ± SD), so the anchor is a zero-cost floor rather than a reliable improvement at this data budget. Both regress SR@20 modestly relative to zero-shot (0.393 → 0.26 / 0.27), within the resolution of a 28-pair test, while sharply improving in-distribution TEM median ED (~5× from ~321 px, seed-robust). Because each direct/pyramid pair shares a checkpoint, the verified wrapper does not stack on the fine-tune (SR@20 within ±0.01, median ED within a few px). The regression tracks forgetting of the untrained C103 SEM-SE↔LOM-height combination, of which one scene is unrecoverable at every seed and anchor. An earlier, non-retained draw of seeds 1–3 sat lower at direct SR@10 0.095 ± 0.021: run-to-run scatter can exceed seed-to-seed scatter at 28 pairs, a caution against over-reading any single-run SR number here.</w:t>
+      </w:r>
+    </w:p>
+    <w:bookmarkEnd w:id="31"/>
+    <w:bookmarkStart w:id="32" w:name="Xa47a5224f2d818e2f7897b7fc3f301b72372759"/>
+    <w:p>
+      <w:pPr>
+        <w:pStyle w:val="Heading3"/>
+      </w:pPr>
+      <w:r>
+        <w:t xml:space="preserve">A one-line weight anchor, tested across seeds</w:t>
+      </w:r>
+    </w:p>
+    <w:p>
+      <w:pPr>
+        <w:pStyle w:val="FirstParagraph"/>
+      </w:pPr>
+      <w:r>
+        <w:t xml:space="preserve">The forgetting is the only thing standing between this fine-tune and a net-positive intervention, so we tested the lightest-touch mitigation, L2-SP weight anchoring [12]. The identical decoder-only recipe gains a single penalty (λ/2)‖θ_dec − θ_dec⁰‖² that pulls the decoder back toward its zero-shot initialisation, with no replay corpus, no architecture change, and no extra parameters. We swept λ ∈ {0, 0.01, 0.1, 1.0}, where λ = 0 reproduces the plain fine-tune, selecting the step per run by minimum validation median ED and the λ by held-out</w:t>
+      </w:r>
+      <w:r>
+        <w:t xml:space="preserve"> </w:t>
+      </w:r>
+      <w:r>
+        <w:rPr>
+          <w:i/>
+          <w:iCs/>
+        </w:rPr>
+        <w:t xml:space="preserve">test</w:t>
+      </w:r>
+      <w:r>
+        <w:t xml:space="preserve">-split retention, because validation cannot see the C103 damage.</w:t>
+      </w:r>
+    </w:p>
+    <w:p>
+      <w:pPr>
+        <w:pStyle w:val="BodyText"/>
+      </w:pPr>
+      <w:r>
+        <w:t xml:space="preserve">In a single seed-0 run the anchor looked like a clear win. At λ = 0.01 the recoverable C103 scene, the scene that run broke, dropped from 80/1220 px back to 16/24 px, close to zero-shot’s ~12 px, while the other C103 scene stayed broken at every λ; heavier anchoring (λ = 0.1, 1.0) bought no further retention and cost both in-distribution gain and training stability, as the certainty head decalibrated into transient all-fail validation epochs whose onset moved earlier as λ grew. On that single run, L2-SP λ = 0.01 improved median ED over the plain fine-tune by 15.6 px (CI [−49.8, −2.4],</w:t>
+      </w:r>
+      <w:r>
+        <w:t xml:space="preserve"> </w:t>
+      </w:r>
+      <w:r>
+        <w:rPr>
+          <w:i/>
+          <w:iCs/>
+        </w:rPr>
+        <w:t xml:space="preserve">p</w:t>
+      </w:r>
+      <w:r>
+        <w:t xml:space="preserve"> </w:t>
+      </w:r>
+      <w:r>
+        <w:t xml:space="preserve">= 0.0046) and shrank the SR@20 deficit against zero-shot to −0.071 (CI [−0.214, +0.071],</w:t>
+      </w:r>
+      <w:r>
+        <w:t xml:space="preserve"> </w:t>
+      </w:r>
+      <w:r>
+        <w:rPr>
+          <w:i/>
+          <w:iCs/>
+        </w:rPr>
+        <w:t xml:space="preserve">p</w:t>
+      </w:r>
+      <w:r>
+        <w:t xml:space="preserve"> </w:t>
+      </w:r>
+      <w:r>
+        <w:t xml:space="preserve">= 0.91). Neither edge generalises: the eight-seed analysis below, under both the direct and the pyramid deployment protocols (Table 2), leaves L2-SP and the plain fine-tune indistinguishable.</w:t>
+      </w:r>
+    </w:p>
+    <w:p>
+      <w:pPr>
+        <w:pStyle w:val="BodyText"/>
+      </w:pPr>
+      <w:r>
+        <w:t xml:space="preserve">Eight training seeds temper that reading. Re-running the plain (λ = 0) and anchored (λ = 0.01) fine-tunes across eight seeds with the identical recipe (Table 2; per-seed values for the five new seeds in Table 3) leaves the two configurations statistically indistinguishable on every test metric: direct-match SR@10 0.236 ± 0.019 (plain) versus 0.250 ± 0.000 (L2-SP), SR@20 0.264 ± 0.019 versus 0.268 ± 0.019, median ED 49.6 ± 3.7 versus 50.8 ± 8.1 px. The single-run median-ED edge does not survive as a cross-seed effect, and on the recoverable C103 scene the anchor is if anything less stable than the plain fine-tune, retaining it in one of three seeds against three of three for λ = 0. The one effect that is robust across all six runs is the opposite of an anchor success: the second C103 scene is unrecoverable at every seed and every λ, which marks a modality-coverage gap rather than an optimisation choice. We therefore report L2-SP as a deliberately zero-cost floor that does not worsen the fine-tune rather than as a reliable forgetting fix, and we expect stronger continual-learning methods such as experience replay, elastic weight consolidation [14], or LoRA-style low-rank updates [13] to be needed for a seed-robust improvement; quantifying that is left to future work. With only 28 test pairs the SR@20 comparisons are low-power, so the regression should be read as</w:t>
+      </w:r>
+      <w:r>
+        <w:t xml:space="preserve"> </w:t>
+      </w:r>
+      <w:r>
+        <w:t xml:space="preserve">“modest and within seed noise”</w:t>
+      </w:r>
+      <w:r>
+        <w:t xml:space="preserve"> </w:t>
+      </w:r>
+      <w:r>
+        <w:t xml:space="preserve">rather than as proven equivalence, and a formal equivalence test on a larger held-out set is planned. Evaluating both deployment protocols on the same per-seed checkpoints (Table 2) shows the verified wrapper neither helps nor hurts the fine-tuned backbone on the real test split, with pyramid and direct SR@20 coinciding at 0.264 (plain) and within 0.004 for L2-SP (0.268 direct, 0.272 pyramid); this is consistent with the FOV-ladder result that scale and appearance failures overlap in the real distribution, so here the wrapper and the fine-tune do not stack. Lifting SR@20</w:t>
+      </w:r>
+      <w:r>
+        <w:t xml:space="preserve"> </w:t>
+      </w:r>
+      <w:r>
+        <w:rPr>
+          <w:i/>
+          <w:iCs/>
+        </w:rPr>
+        <w:t xml:space="preserve">above</w:t>
+      </w:r>
+      <w:r>
+        <w:t xml:space="preserve"> </w:t>
+      </w:r>
+      <w:r>
+        <w:t xml:space="preserve">zero-shot additionally requires closing the unrecoverable-modality gap, which needs training coverage of that modality combination and not a better optimiser.</w:t>
+      </w:r>
+    </w:p>
+    <w:p>
+      <w:pPr>
+        <w:pStyle w:val="BodyText"/>
+      </w:pPr>
+      <w:r>
         <w:rPr>
           <w:b/>
           <w:bCs/>
         </w:rPr>
-        <w:t xml:space="preserve">Table 4. Per-seed fine-tuning results</w:t>
-      </w:r>
-      <w:r>
-        <w:t xml:space="preserve"> </w:t>
-      </w:r>
-      <w:r>
-        <w:t xml:space="preserve">(direct match, 28-pair test split) underlying the mean ± SD in Table 2. With three seeds the SD is itself a coarse estimator, so we list the individual runs.</w:t>
+        <w:t xml:space="preserve">Table 3. Per-seed direct-match results for the five new training seeds</w:t>
+      </w:r>
+      <w:r>
+        <w:t xml:space="preserve"> </w:t>
+      </w:r>
+      <w:r>
+        <w:t xml:space="preserve">(seeds 4–8; 28-pair test split, TPS-refined ED) underlying the eight-seed aggregate in Table 2; seeds 1–3 of the same retrained draw contribute to that aggregate but predate this run.</w:t>
       </w:r>
     </w:p>
     <w:tbl>
@@ -2484,43 +2237,43 @@
               <w:jc w:val="right"/>
             </w:pPr>
             <w:r>
-              <w:t xml:space="preserve">1</w:t>
-            </w:r>
-          </w:p>
-        </w:tc>
-        <w:tc>
-          <w:tcPr/>
-          <w:p>
-            <w:pPr>
-              <w:pStyle w:val="Compact"/>
-              <w:jc w:val="right"/>
-            </w:pPr>
-            <w:r>
-              <w:t xml:space="preserve">0.107</w:t>
-            </w:r>
-          </w:p>
-        </w:tc>
-        <w:tc>
-          <w:tcPr/>
-          <w:p>
-            <w:pPr>
-              <w:pStyle w:val="Compact"/>
-              <w:jc w:val="right"/>
-            </w:pPr>
-            <w:r>
-              <w:t xml:space="preserve">0.321</w:t>
-            </w:r>
-          </w:p>
-        </w:tc>
-        <w:tc>
-          <w:tcPr/>
-          <w:p>
-            <w:pPr>
-              <w:pStyle w:val="Compact"/>
-              <w:jc w:val="right"/>
-            </w:pPr>
-            <w:r>
-              <w:t xml:space="preserve">48.9</w:t>
+              <w:t xml:space="preserve">4</w:t>
+            </w:r>
+          </w:p>
+        </w:tc>
+        <w:tc>
+          <w:tcPr/>
+          <w:p>
+            <w:pPr>
+              <w:pStyle w:val="Compact"/>
+              <w:jc w:val="right"/>
+            </w:pPr>
+            <w:r>
+              <w:t xml:space="preserve">0.250</w:t>
+            </w:r>
+          </w:p>
+        </w:tc>
+        <w:tc>
+          <w:tcPr/>
+          <w:p>
+            <w:pPr>
+              <w:pStyle w:val="Compact"/>
+              <w:jc w:val="right"/>
+            </w:pPr>
+            <w:r>
+              <w:t xml:space="preserve">0.286</w:t>
+            </w:r>
+          </w:p>
+        </w:tc>
+        <w:tc>
+          <w:tcPr/>
+          <w:p>
+            <w:pPr>
+              <w:pStyle w:val="Compact"/>
+              <w:jc w:val="right"/>
+            </w:pPr>
+            <w:r>
+              <w:t xml:space="preserve">48.3</w:t>
             </w:r>
           </w:p>
         </w:tc>
@@ -2545,43 +2298,43 @@
               <w:jc w:val="right"/>
             </w:pPr>
             <w:r>
-              <w:t xml:space="preserve">2</w:t>
-            </w:r>
-          </w:p>
-        </w:tc>
-        <w:tc>
-          <w:tcPr/>
-          <w:p>
-            <w:pPr>
-              <w:pStyle w:val="Compact"/>
-              <w:jc w:val="right"/>
-            </w:pPr>
-            <w:r>
-              <w:t xml:space="preserve">0.071</w:t>
-            </w:r>
-          </w:p>
-        </w:tc>
-        <w:tc>
-          <w:tcPr/>
-          <w:p>
-            <w:pPr>
-              <w:pStyle w:val="Compact"/>
-              <w:jc w:val="right"/>
-            </w:pPr>
-            <w:r>
-              <w:t xml:space="preserve">0.321</w:t>
-            </w:r>
-          </w:p>
-        </w:tc>
-        <w:tc>
-          <w:tcPr/>
-          <w:p>
-            <w:pPr>
-              <w:pStyle w:val="Compact"/>
-              <w:jc w:val="right"/>
-            </w:pPr>
-            <w:r>
-              <w:t xml:space="preserve">41.6</w:t>
+              <w:t xml:space="preserve">5</w:t>
+            </w:r>
+          </w:p>
+        </w:tc>
+        <w:tc>
+          <w:tcPr/>
+          <w:p>
+            <w:pPr>
+              <w:pStyle w:val="Compact"/>
+              <w:jc w:val="right"/>
+            </w:pPr>
+            <w:r>
+              <w:t xml:space="preserve">0.214</w:t>
+            </w:r>
+          </w:p>
+        </w:tc>
+        <w:tc>
+          <w:tcPr/>
+          <w:p>
+            <w:pPr>
+              <w:pStyle w:val="Compact"/>
+              <w:jc w:val="right"/>
+            </w:pPr>
+            <w:r>
+              <w:t xml:space="preserve">0.250</w:t>
+            </w:r>
+          </w:p>
+        </w:tc>
+        <w:tc>
+          <w:tcPr/>
+          <w:p>
+            <w:pPr>
+              <w:pStyle w:val="Compact"/>
+              <w:jc w:val="right"/>
+            </w:pPr>
+            <w:r>
+              <w:t xml:space="preserve">47.5</w:t>
             </w:r>
           </w:p>
         </w:tc>
@@ -2606,19 +2359,7 @@
               <w:jc w:val="right"/>
             </w:pPr>
             <w:r>
-              <w:t xml:space="preserve">3</w:t>
-            </w:r>
-          </w:p>
-        </w:tc>
-        <w:tc>
-          <w:tcPr/>
-          <w:p>
-            <w:pPr>
-              <w:pStyle w:val="Compact"/>
-              <w:jc w:val="right"/>
-            </w:pPr>
-            <w:r>
-              <w:t xml:space="preserve">0.107</w:t>
+              <w:t xml:space="preserve">6</w:t>
             </w:r>
           </w:p>
         </w:tc>
@@ -2642,7 +2383,19 @@
               <w:jc w:val="right"/>
             </w:pPr>
             <w:r>
-              <w:t xml:space="preserve">47.6</w:t>
+              <w:t xml:space="preserve">0.250</w:t>
+            </w:r>
+          </w:p>
+        </w:tc>
+        <w:tc>
+          <w:tcPr/>
+          <w:p>
+            <w:pPr>
+              <w:pStyle w:val="Compact"/>
+              <w:jc w:val="right"/>
+            </w:pPr>
+            <w:r>
+              <w:t xml:space="preserve">49.3</w:t>
             </w:r>
           </w:p>
         </w:tc>
@@ -2655,31 +2408,31 @@
               <w:pStyle w:val="Compact"/>
             </w:pPr>
             <w:r>
-              <w:t xml:space="preserve">L2-SP (λ = 0.01)</w:t>
-            </w:r>
-          </w:p>
-        </w:tc>
-        <w:tc>
-          <w:tcPr/>
-          <w:p>
-            <w:pPr>
-              <w:pStyle w:val="Compact"/>
-              <w:jc w:val="right"/>
-            </w:pPr>
-            <w:r>
-              <w:t xml:space="preserve">1</w:t>
-            </w:r>
-          </w:p>
-        </w:tc>
-        <w:tc>
-          <w:tcPr/>
-          <w:p>
-            <w:pPr>
-              <w:pStyle w:val="Compact"/>
-              <w:jc w:val="right"/>
-            </w:pPr>
-            <w:r>
-              <w:t xml:space="preserve">0.107</w:t>
+              <w:t xml:space="preserve">plain fine-tune (λ = 0)</w:t>
+            </w:r>
+          </w:p>
+        </w:tc>
+        <w:tc>
+          <w:tcPr/>
+          <w:p>
+            <w:pPr>
+              <w:pStyle w:val="Compact"/>
+              <w:jc w:val="right"/>
+            </w:pPr>
+            <w:r>
+              <w:t xml:space="preserve">7</w:t>
+            </w:r>
+          </w:p>
+        </w:tc>
+        <w:tc>
+          <w:tcPr/>
+          <w:p>
+            <w:pPr>
+              <w:pStyle w:val="Compact"/>
+              <w:jc w:val="right"/>
+            </w:pPr>
+            <w:r>
+              <w:t xml:space="preserve">0.214</w:t>
             </w:r>
           </w:p>
         </w:tc>
@@ -2703,7 +2456,7 @@
               <w:jc w:val="right"/>
             </w:pPr>
             <w:r>
-              <w:t xml:space="preserve">52.5</w:t>
+              <w:t xml:space="preserve">47.2</w:t>
             </w:r>
           </w:p>
         </w:tc>
@@ -2716,55 +2469,55 @@
               <w:pStyle w:val="Compact"/>
             </w:pPr>
             <w:r>
-              <w:t xml:space="preserve">L2-SP (λ = 0.01)</w:t>
-            </w:r>
-          </w:p>
-        </w:tc>
-        <w:tc>
-          <w:tcPr/>
-          <w:p>
-            <w:pPr>
-              <w:pStyle w:val="Compact"/>
-              <w:jc w:val="right"/>
-            </w:pPr>
-            <w:r>
-              <w:t xml:space="preserve">2</w:t>
-            </w:r>
-          </w:p>
-        </w:tc>
-        <w:tc>
-          <w:tcPr/>
-          <w:p>
-            <w:pPr>
-              <w:pStyle w:val="Compact"/>
-              <w:jc w:val="right"/>
-            </w:pPr>
-            <w:r>
-              <w:t xml:space="preserve">0.107</w:t>
-            </w:r>
-          </w:p>
-        </w:tc>
-        <w:tc>
-          <w:tcPr/>
-          <w:p>
-            <w:pPr>
-              <w:pStyle w:val="Compact"/>
-              <w:jc w:val="right"/>
-            </w:pPr>
-            <w:r>
-              <w:t xml:space="preserve">0.286</w:t>
-            </w:r>
-          </w:p>
-        </w:tc>
-        <w:tc>
-          <w:tcPr/>
-          <w:p>
-            <w:pPr>
-              <w:pStyle w:val="Compact"/>
-              <w:jc w:val="right"/>
-            </w:pPr>
-            <w:r>
-              <w:t xml:space="preserve">52.9</w:t>
+              <w:t xml:space="preserve">plain fine-tune (λ = 0)</w:t>
+            </w:r>
+          </w:p>
+        </w:tc>
+        <w:tc>
+          <w:tcPr/>
+          <w:p>
+            <w:pPr>
+              <w:pStyle w:val="Compact"/>
+              <w:jc w:val="right"/>
+            </w:pPr>
+            <w:r>
+              <w:t xml:space="preserve">8</w:t>
+            </w:r>
+          </w:p>
+        </w:tc>
+        <w:tc>
+          <w:tcPr/>
+          <w:p>
+            <w:pPr>
+              <w:pStyle w:val="Compact"/>
+              <w:jc w:val="right"/>
+            </w:pPr>
+            <w:r>
+              <w:t xml:space="preserve">0.214</w:t>
+            </w:r>
+          </w:p>
+        </w:tc>
+        <w:tc>
+          <w:tcPr/>
+          <w:p>
+            <w:pPr>
+              <w:pStyle w:val="Compact"/>
+              <w:jc w:val="right"/>
+            </w:pPr>
+            <w:r>
+              <w:t xml:space="preserve">0.250</w:t>
+            </w:r>
+          </w:p>
+        </w:tc>
+        <w:tc>
+          <w:tcPr/>
+          <w:p>
+            <w:pPr>
+              <w:pStyle w:val="Compact"/>
+              <w:jc w:val="right"/>
+            </w:pPr>
+            <w:r>
+              <w:t xml:space="preserve">47.1</w:t>
             </w:r>
           </w:p>
         </w:tc>
@@ -2789,19 +2542,7 @@
               <w:jc w:val="right"/>
             </w:pPr>
             <w:r>
-              <w:t xml:space="preserve">3</w:t>
-            </w:r>
-          </w:p>
-        </w:tc>
-        <w:tc>
-          <w:tcPr/>
-          <w:p>
-            <w:pPr>
-              <w:pStyle w:val="Compact"/>
-              <w:jc w:val="right"/>
-            </w:pPr>
-            <w:r>
-              <w:t xml:space="preserve">0.071</w:t>
+              <w:t xml:space="preserve">4</w:t>
             </w:r>
           </w:p>
         </w:tc>
@@ -2825,7 +2566,263 @@
               <w:jc w:val="right"/>
             </w:pPr>
             <w:r>
-              <w:t xml:space="preserve">63.5</w:t>
+              <w:t xml:space="preserve">0.250</w:t>
+            </w:r>
+          </w:p>
+        </w:tc>
+        <w:tc>
+          <w:tcPr/>
+          <w:p>
+            <w:pPr>
+              <w:pStyle w:val="Compact"/>
+              <w:jc w:val="right"/>
+            </w:pPr>
+            <w:r>
+              <w:t xml:space="preserve">70.2</w:t>
+            </w:r>
+          </w:p>
+        </w:tc>
+      </w:tr>
+      <w:tr>
+        <w:tc>
+          <w:tcPr/>
+          <w:p>
+            <w:pPr>
+              <w:pStyle w:val="Compact"/>
+            </w:pPr>
+            <w:r>
+              <w:t xml:space="preserve">L2-SP (λ = 0.01)</w:t>
+            </w:r>
+          </w:p>
+        </w:tc>
+        <w:tc>
+          <w:tcPr/>
+          <w:p>
+            <w:pPr>
+              <w:pStyle w:val="Compact"/>
+              <w:jc w:val="right"/>
+            </w:pPr>
+            <w:r>
+              <w:t xml:space="preserve">5</w:t>
+            </w:r>
+          </w:p>
+        </w:tc>
+        <w:tc>
+          <w:tcPr/>
+          <w:p>
+            <w:pPr>
+              <w:pStyle w:val="Compact"/>
+              <w:jc w:val="right"/>
+            </w:pPr>
+            <w:r>
+              <w:t xml:space="preserve">0.250</w:t>
+            </w:r>
+          </w:p>
+        </w:tc>
+        <w:tc>
+          <w:tcPr/>
+          <w:p>
+            <w:pPr>
+              <w:pStyle w:val="Compact"/>
+              <w:jc w:val="right"/>
+            </w:pPr>
+            <w:r>
+              <w:t xml:space="preserve">0.286</w:t>
+            </w:r>
+          </w:p>
+        </w:tc>
+        <w:tc>
+          <w:tcPr/>
+          <w:p>
+            <w:pPr>
+              <w:pStyle w:val="Compact"/>
+              <w:jc w:val="right"/>
+            </w:pPr>
+            <w:r>
+              <w:t xml:space="preserve">50.2</w:t>
+            </w:r>
+          </w:p>
+        </w:tc>
+      </w:tr>
+      <w:tr>
+        <w:tc>
+          <w:tcPr/>
+          <w:p>
+            <w:pPr>
+              <w:pStyle w:val="Compact"/>
+            </w:pPr>
+            <w:r>
+              <w:t xml:space="preserve">L2-SP (λ = 0.01)</w:t>
+            </w:r>
+          </w:p>
+        </w:tc>
+        <w:tc>
+          <w:tcPr/>
+          <w:p>
+            <w:pPr>
+              <w:pStyle w:val="Compact"/>
+              <w:jc w:val="right"/>
+            </w:pPr>
+            <w:r>
+              <w:t xml:space="preserve">6</w:t>
+            </w:r>
+          </w:p>
+        </w:tc>
+        <w:tc>
+          <w:tcPr/>
+          <w:p>
+            <w:pPr>
+              <w:pStyle w:val="Compact"/>
+              <w:jc w:val="right"/>
+            </w:pPr>
+            <w:r>
+              <w:t xml:space="preserve">0.250</w:t>
+            </w:r>
+          </w:p>
+        </w:tc>
+        <w:tc>
+          <w:tcPr/>
+          <w:p>
+            <w:pPr>
+              <w:pStyle w:val="Compact"/>
+              <w:jc w:val="right"/>
+            </w:pPr>
+            <w:r>
+              <w:t xml:space="preserve">0.250</w:t>
+            </w:r>
+          </w:p>
+        </w:tc>
+        <w:tc>
+          <w:tcPr/>
+          <w:p>
+            <w:pPr>
+              <w:pStyle w:val="Compact"/>
+              <w:jc w:val="right"/>
+            </w:pPr>
+            <w:r>
+              <w:t xml:space="preserve">43.4</w:t>
+            </w:r>
+          </w:p>
+        </w:tc>
+      </w:tr>
+      <w:tr>
+        <w:tc>
+          <w:tcPr/>
+          <w:p>
+            <w:pPr>
+              <w:pStyle w:val="Compact"/>
+            </w:pPr>
+            <w:r>
+              <w:t xml:space="preserve">L2-SP (λ = 0.01)</w:t>
+            </w:r>
+          </w:p>
+        </w:tc>
+        <w:tc>
+          <w:tcPr/>
+          <w:p>
+            <w:pPr>
+              <w:pStyle w:val="Compact"/>
+              <w:jc w:val="right"/>
+            </w:pPr>
+            <w:r>
+              <w:t xml:space="preserve">7</w:t>
+            </w:r>
+          </w:p>
+        </w:tc>
+        <w:tc>
+          <w:tcPr/>
+          <w:p>
+            <w:pPr>
+              <w:pStyle w:val="Compact"/>
+              <w:jc w:val="right"/>
+            </w:pPr>
+            <w:r>
+              <w:t xml:space="preserve">0.250</w:t>
+            </w:r>
+          </w:p>
+        </w:tc>
+        <w:tc>
+          <w:tcPr/>
+          <w:p>
+            <w:pPr>
+              <w:pStyle w:val="Compact"/>
+              <w:jc w:val="right"/>
+            </w:pPr>
+            <w:r>
+              <w:t xml:space="preserve">0.250</w:t>
+            </w:r>
+          </w:p>
+        </w:tc>
+        <w:tc>
+          <w:tcPr/>
+          <w:p>
+            <w:pPr>
+              <w:pStyle w:val="Compact"/>
+              <w:jc w:val="right"/>
+            </w:pPr>
+            <w:r>
+              <w:t xml:space="preserve">50.6</w:t>
+            </w:r>
+          </w:p>
+        </w:tc>
+      </w:tr>
+      <w:tr>
+        <w:tc>
+          <w:tcPr/>
+          <w:p>
+            <w:pPr>
+              <w:pStyle w:val="Compact"/>
+            </w:pPr>
+            <w:r>
+              <w:t xml:space="preserve">L2-SP (λ = 0.01)</w:t>
+            </w:r>
+          </w:p>
+        </w:tc>
+        <w:tc>
+          <w:tcPr/>
+          <w:p>
+            <w:pPr>
+              <w:pStyle w:val="Compact"/>
+              <w:jc w:val="right"/>
+            </w:pPr>
+            <w:r>
+              <w:t xml:space="preserve">8</w:t>
+            </w:r>
+          </w:p>
+        </w:tc>
+        <w:tc>
+          <w:tcPr/>
+          <w:p>
+            <w:pPr>
+              <w:pStyle w:val="Compact"/>
+              <w:jc w:val="right"/>
+            </w:pPr>
+            <w:r>
+              <w:t xml:space="preserve">0.250</w:t>
+            </w:r>
+          </w:p>
+        </w:tc>
+        <w:tc>
+          <w:tcPr/>
+          <w:p>
+            <w:pPr>
+              <w:pStyle w:val="Compact"/>
+              <w:jc w:val="right"/>
+            </w:pPr>
+            <w:r>
+              <w:t xml:space="preserve">0.286</w:t>
+            </w:r>
+          </w:p>
+        </w:tc>
+        <w:tc>
+          <w:tcPr/>
+          <w:p>
+            <w:pPr>
+              <w:pStyle w:val="Compact"/>
+              <w:jc w:val="right"/>
+            </w:pPr>
+            <w:r>
+              <w:t xml:space="preserve">47.8</w:t>
             </w:r>
           </w:p>
         </w:tc>
@@ -2836,7 +2833,7 @@
         <w:pStyle w:val="BodyText"/>
       </w:pPr>
       <w:r>
-        <w:t xml:space="preserve">SR@10 spans 0.071–0.107 and SR@20 0.250–0.321 for both configurations, with the two distributions overlapping rather than separating. Median ED is the only metric on which the configurations differ in central tendency (plain 41.6–48.9 vs. L2-SP 52.5–63.5 px), but the ranges abut and the effect does not reach the per-seed separation needed to call L2-SP an improvement.</w:t>
+        <w:t xml:space="preserve">Across the five new seeds SR@10 spans 0.214–0.250 and SR@20 0.250–0.286 for both configurations, overlapping rather than separating. Median ED differs in scatter rather than central tendency (plain 47.1–49.3 vs. L2-SP 43.4–70.2 px, the L2-SP range widened by a single high-residual seed), so no per-seed separation supports calling L2-SP an improvement.</w:t>
       </w:r>
     </w:p>
     <w:bookmarkEnd w:id="32"/>
@@ -3064,7 +3061,7 @@
         <w:pStyle w:val="BodyText"/>
       </w:pPr>
       <w:r>
-        <w:t xml:space="preserve">Several limitations bound these claims. The mutual-information verifier cannot rank transforms within ~10 px of one another, which both caps the wrapper’s benefit on strong backbones and prevents the iterated-zoom machinery from paying off; a learned or GT-free residual verifier is the obvious next lever. The ~10.3 px GT affine residual floors all px-threshold metrics, so AmalgaMatch cannot certify sub-5 px registration and our SR@5 numbers should be read with that floor in mind. The FOV ladder cleanly isolates scale, but it crops real targets rather than acquiring genuinely low-FOV images, so it does not reproduce the texture, detector-noise, and resolution differences of native low-FOV acquisition; its wrapper gains should be read as a controlled lower bound on the mechanism, not as a literal forecast for natively low-FOV pairs. Both the direct-match and the pyramid-protocol fine-tuning numbers are now reported as mean ± SD over three training seeds (Tables 2 and 3). Because the original multi-seed checkpoints were not retained, the pyramid-protocol replication retrained seeds 1–3 from scratch under the identical recipe; decoder fine-tuning is not bit-reproducible at fixed seed on our stack (non-deterministic CUDA kernels and multi-worker data loading), so this independent draw sits at a higher direct SR@10 than Table 2 (0.250 versus 0.095). That run-to-run scatter can exceed seed-to-seed scatter at 28 test pairs is itself a caution against over-reading any single-run SR number on this benchmark; the reliable comparison is the within-checkpoint one (direct versus pyramid in Table 3), which shows the recommended deployment configuration, the verified wrapper on the fine-tune, neither gains nor loses over direct matching across seeds. The 28-pair test split is small, so SR comparisons are low-power and the seed-to-seed scatter is correspondingly large: the single-run SR@10 of 0.25 reported in earlier drafts sat well above the three-seed mean of 0.095 ± 0.021, which is why we now read the fine-tune as a large in-distribution gain accompanied by a modest, seed-noisy SR regression rather than a clean net improvement, and why we do not claim the L2-SP anchor as a reliable fix. A formal equivalence test on a larger held-out set and at least one stronger continual-learning baseline (LoRA-style low-rank adaptation) remain planned and not yet run. Finally, the fine-tuning study rests on 131 training pairs over 12 subclasses; the unrecoverable C103 scene, broken at every seed and anchor strength, shows that breadth of modality coverage rather than optimisation is the remaining bottleneck. The concrete next experiment is to add training pairs in that modality combination and re-evaluate on the same held-out split and FOV ladder used here. We expect a forgetting-robust fine-tune over broad modality coverage, with the verified wrapper reserved for multiscale tasks, to be the deployable configuration for cross-modal microscopy registration.</w:t>
+        <w:t xml:space="preserve">Several limitations bound these claims. The mutual-information verifier cannot rank transforms within ~10 px of one another, which both caps the wrapper’s benefit on strong backbones and prevents the iterated-zoom machinery from paying off; a learned or GT-free residual verifier is the obvious next lever. The ~10.3 px GT affine residual floors all px-threshold metrics, so AmalgaMatch cannot certify sub-5 px registration and our SR@5 numbers should be read with that floor in mind. The FOV ladder cleanly isolates scale, but it crops real targets rather than acquiring genuinely low-FOV images, so it does not reproduce the texture, detector-noise, and resolution differences of native low-FOV acquisition; its wrapper gains should be read as a controlled lower bound on the mechanism, not as a literal forecast for natively low-FOV pairs. Both the direct-match and the pyramid-protocol fine-tuning numbers are now reported as mean ± SD over eight training seeds, evaluated on the same per-seed checkpoints (Table 2). An earlier three-seed draw whose checkpoints were not retained sat well below this, at direct SR@10 0.095 ± 0.021; decoder fine-tuning is not bit-reproducible at fixed seed on our stack (non-deterministic CUDA kernels and multi-worker data loading), and that an independent draw moves the SR@10 mean from 0.095 to ~0.24 shows run-to-run scatter exceeding seed-to-seed scatter at 28 test pairs — itself a caution against over-reading any single-run SR number on this benchmark. The reliable comparison is the within-checkpoint one (direct versus pyramid in Table 2), which shows the recommended deployment configuration, the verified wrapper on the fine-tune, neither gains nor loses over direct matching across seeds. The 28-pair test split is small, so SR comparisons are low-power and the seed-to-seed scatter is correspondingly large, which is why we read the fine-tune as a large in-distribution gain accompanied by a modest, seed-noisy SR regression rather than a clean net improvement, and why we do not claim the L2-SP anchor as a reliable fix. A formal equivalence test on a larger held-out set and at least one stronger continual-learning baseline (LoRA-style low-rank adaptation) remain planned and not yet run. Finally, the fine-tuning study rests on 131 training pairs over 12 subclasses; the unrecoverable C103 scene, broken at every seed and anchor strength, shows that breadth of modality coverage rather than optimisation is the remaining bottleneck. The concrete next experiment is to add training pairs in that modality combination and re-evaluate on the same held-out split and FOV ladder used here. We expect a forgetting-robust fine-tune over broad modality coverage, with the verified wrapper reserved for multiscale tasks, to be the deployable configuration for cross-modal microscopy registration.</w:t>
       </w:r>
     </w:p>
     <w:bookmarkEnd w:id="35"/>
@@ -3241,7 +3238,7 @@
         <w:t xml:space="preserve"> </w:t>
       </w:r>
       <w:r>
-        <w:t xml:space="preserve">Fine-tuning is decoder-only: the VGG+DINOv2 encoder is held in evaluation mode (frozen, with normalisation statistics fixed) while ~100M decoder parameters are trained. Supervision densifies sparse GT correspondences into an A→B warp via thin-plate splines and supervises inside the GT-support region under a sparse-GT-robust loss, with FOV-crop and photometric augmentation. Optimisation uses AdamW at 2×10⁻⁵ for 1500 steps; the checkpoint is selected by minimum validation median ED. The weight-anchored variant adds an L2-SP penalty [12] (λ/2)‖θ_dec − θ_dec⁰‖² anchoring the decoder to its zero-shot initialisation; λ ∈ {0, 0.01, 0.1, 1.0} is swept, with the step selected per run by validation median ED and λ by held-out test-split retention. The plain (λ = 0) and anchored (λ = 0.01) recipes are each run at three seeds for the variance analysis. We considered replay-based and low-rank [13] alternatives and elastic weight consolidation [14] as heavier mitigations; L2-SP was chosen as the zero-cost baseline.</w:t>
+        <w:t xml:space="preserve">Fine-tuning is decoder-only: the VGG+DINOv2 encoder is held in evaluation mode (frozen, with normalisation statistics fixed) while ~100M decoder parameters are trained. Supervision densifies sparse GT correspondences into an A→B warp via thin-plate splines and supervises inside the GT-support region under a sparse-GT-robust loss, with FOV-crop and photometric augmentation. Optimisation uses AdamW at 2×10⁻⁵ for 1500 steps; the checkpoint is selected by minimum validation median ED. The weight-anchored variant adds an L2-SP penalty [12] (λ/2)‖θ_dec − θ_dec⁰‖² anchoring the decoder to its zero-shot initialisation; λ ∈ {0, 0.01, 0.1, 1.0} is swept, with the step selected per run by validation median ED and λ by held-out test-split retention. The plain (λ = 0) and anchored (λ = 0.01) recipes are each run at eight seeds for the variance analysis. We considered replay-based and low-rank [13] alternatives and elastic weight consolidation [14] as heavier mitigations; L2-SP was chosen as the zero-cost baseline.</w:t>
       </w:r>
     </w:p>
     <w:bookmarkEnd w:id="36"/>

</xml_diff>

<commit_message>
paper: reorder Funding before Author contributions (Sci Rep order), abbreviate journal names in references.bib, track suggested_reviewers.md
</commit_message>
<xml_diff>
--- a/paper/paper.docx
+++ b/paper/paper.docx
@@ -3882,12 +3882,30 @@
       </w:r>
     </w:p>
     <w:bookmarkEnd w:id="40"/>
-    <w:bookmarkStart w:id="41" w:name="author-contributions"/>
+    <w:bookmarkStart w:id="41" w:name="funding"/>
     <w:p>
       <w:pPr>
         <w:pStyle w:val="Heading2"/>
       </w:pPr>
       <w:r>
+        <w:t xml:space="preserve">Funding</w:t>
+      </w:r>
+    </w:p>
+    <w:p>
+      <w:pPr>
+        <w:pStyle w:val="FirstParagraph"/>
+      </w:pPr>
+      <w:r>
+        <w:t xml:space="preserve">This research received no specific grant from any funding agency in the public, commercial, or not-for-profit sectors.</w:t>
+      </w:r>
+    </w:p>
+    <w:bookmarkEnd w:id="41"/>
+    <w:bookmarkStart w:id="42" w:name="author-contributions"/>
+    <w:p>
+      <w:pPr>
+        <w:pStyle w:val="Heading2"/>
+      </w:pPr>
+      <w:r>
         <w:t xml:space="preserve">Author contributions</w:t>
       </w:r>
     </w:p>
@@ -3899,8 +3917,8 @@
         <w:t xml:space="preserve">F.C. conceived the study, implemented the methods, conducted the experiments, analysed the results, and wrote the manuscript.</w:t>
       </w:r>
     </w:p>
-    <w:bookmarkEnd w:id="41"/>
-    <w:bookmarkStart w:id="42" w:name="competing-interests"/>
+    <w:bookmarkEnd w:id="42"/>
+    <w:bookmarkStart w:id="43" w:name="competing-interests"/>
     <w:p>
       <w:pPr>
         <w:pStyle w:val="Heading2"/>
@@ -3915,24 +3933,6 @@
       </w:pPr>
       <w:r>
         <w:t xml:space="preserve">The author declares no competing interests.</w:t>
-      </w:r>
-    </w:p>
-    <w:bookmarkEnd w:id="42"/>
-    <w:bookmarkStart w:id="43" w:name="funding"/>
-    <w:p>
-      <w:pPr>
-        <w:pStyle w:val="Heading2"/>
-      </w:pPr>
-      <w:r>
-        <w:t xml:space="preserve">Funding</w:t>
-      </w:r>
-    </w:p>
-    <w:p>
-      <w:pPr>
-        <w:pStyle w:val="FirstParagraph"/>
-      </w:pPr>
-      <w:r>
-        <w:t xml:space="preserve">This research received no specific grant from any funding agency in the public, commercial, or not-for-profit sectors.</w:t>
       </w:r>
     </w:p>
     <w:bookmarkEnd w:id="43"/>

</xml_diff>